<commit_message>
Update DOC and set up Rendering.
</commit_message>
<xml_diff>
--- a/Doc.docx
+++ b/Doc.docx
@@ -47,6 +47,25 @@
       <w:pPr>
         <w:jc w:val="center"/>
         <w:rPr>
+          <w:b/>
+          <w:bCs/>
+          <w:lang w:val="en-US"/>
+        </w:rPr>
+      </w:pPr>
+      <w:r>
+        <w:rPr>
+          <w:b/>
+          <w:bCs/>
+          <w:lang w:val="en-US"/>
+        </w:rPr>
+        <w:t>Proiect realizat de:</w:t>
+      </w:r>
+    </w:p>
+    <w:p>
+      <w:pPr>
+        <w:pStyle w:val="NoSpacing"/>
+        <w:jc w:val="center"/>
+        <w:rPr>
           <w:rFonts w:cs="Times New Roman"/>
           <w:sz w:val="40"/>
           <w:szCs w:val="40"/>
@@ -73,7 +92,7 @@
           <w:iCs/>
           <w:lang w:val="en-US"/>
         </w:rPr>
-        <w:t>XII A 2025-2026</w:t>
+        <w:t>XII</w:t>
       </w:r>
       <w:r>
         <w:rPr>
@@ -81,7 +100,7 @@
           <w:iCs/>
           <w:lang w:val="en-US"/>
         </w:rPr>
-        <w:t xml:space="preserve"> -</w:t>
+        <w:t xml:space="preserve"> </w:t>
       </w:r>
       <w:r>
         <w:rPr>
@@ -89,24 +108,38 @@
           <w:iCs/>
           <w:lang w:val="en-US"/>
         </w:rPr>
-        <w:t xml:space="preserve"> Colegiul Na</w:t>
+        <w:t>A 2025-2026</w:t>
       </w:r>
       <w:r>
         <w:rPr>
           <w:i/>
           <w:iCs/>
-          <w:lang w:val="ro-RO"/>
-        </w:rPr>
-        <w:t>țional „Emil Racoviță” Iași</w:t>
-      </w:r>
-    </w:p>
-    <w:p>
-      <w:pPr>
-        <w:ind w:left="720"/>
-        <w:jc w:val="center"/>
+          <w:lang w:val="en-US"/>
+        </w:rPr>
+        <w:t xml:space="preserve"> -</w:t>
+      </w:r>
+      <w:r>
         <w:rPr>
           <w:i/>
           <w:iCs/>
+          <w:lang w:val="en-US"/>
+        </w:rPr>
+        <w:t xml:space="preserve"> Colegiul Na</w:t>
+      </w:r>
+      <w:r>
+        <w:rPr>
+          <w:i/>
+          <w:iCs/>
+          <w:lang w:val="ro-RO"/>
+        </w:rPr>
+        <w:t>țional „Emil Racoviță” Iași</w:t>
+      </w:r>
+    </w:p>
+    <w:p>
+      <w:pPr>
+        <w:pStyle w:val="NoSpacing"/>
+        <w:jc w:val="center"/>
+        <w:rPr>
           <w:lang w:val="ro-RO"/>
         </w:rPr>
       </w:pPr>
@@ -130,7 +163,7 @@
           <w:iCs/>
           <w:lang w:val="ro-RO"/>
         </w:rPr>
-        <w:t>XII A 2025-2026</w:t>
+        <w:t>XII</w:t>
       </w:r>
       <w:r>
         <w:rPr>
@@ -138,7 +171,7 @@
           <w:iCs/>
           <w:lang w:val="ro-RO"/>
         </w:rPr>
-        <w:t xml:space="preserve"> -</w:t>
+        <w:t xml:space="preserve"> </w:t>
       </w:r>
       <w:r>
         <w:rPr>
@@ -146,68 +179,97 @@
           <w:iCs/>
           <w:lang w:val="ro-RO"/>
         </w:rPr>
+        <w:t>A 2025-2026</w:t>
+      </w:r>
+      <w:r>
+        <w:rPr>
+          <w:i/>
+          <w:iCs/>
+          <w:lang w:val="ro-RO"/>
+        </w:rPr>
+        <w:t xml:space="preserve"> -</w:t>
+      </w:r>
+      <w:r>
+        <w:rPr>
+          <w:i/>
+          <w:iCs/>
+          <w:lang w:val="ro-RO"/>
+        </w:rPr>
         <w:t xml:space="preserve"> Colegiul Național „Emil Racoviță” Iași</w:t>
       </w:r>
     </w:p>
     <w:p>
       <w:pPr>
-        <w:ind w:firstLine="720"/>
+        <w:spacing w:before="240"/>
         <w:jc w:val="center"/>
-        <w:rPr>
-          <w:lang w:val="ro-RO"/>
-        </w:rPr>
-      </w:pPr>
-      <w:r>
         <w:rPr>
           <w:b/>
           <w:bCs/>
-          <w:lang w:val="en-US"/>
-        </w:rPr>
-        <w:t>Cerchez Emanuela</w:t>
-      </w:r>
-      <w:r>
-        <w:rPr>
-          <w:lang w:val="en-US"/>
-        </w:rPr>
-        <w:t>,</w:t>
-      </w:r>
-      <w:r>
-        <w:rPr>
-          <w:lang w:val="en-US"/>
-        </w:rPr>
-        <w:t xml:space="preserve"> </w:t>
-      </w:r>
-      <w:r>
-        <w:rPr>
           <w:i/>
           <w:iCs/>
-          <w:lang w:val="en-US"/>
-        </w:rPr>
-        <w:t>Profesor Informatic</w:t>
+          <w:lang w:val="ro-RO"/>
+        </w:rPr>
+      </w:pPr>
+      <w:r>
+        <w:rPr>
+          <w:b/>
+          <w:bCs/>
+          <w:lang w:val="ro-RO"/>
+        </w:rPr>
+        <w:t>Profesor coordonator:</w:t>
+      </w:r>
+    </w:p>
+    <w:p>
+      <w:pPr>
+        <w:pStyle w:val="NoSpacing"/>
+        <w:jc w:val="center"/>
+        <w:rPr>
+          <w:lang w:val="ro-RO"/>
+        </w:rPr>
+      </w:pPr>
+      <w:r>
+        <w:rPr>
+          <w:b/>
+          <w:bCs/>
+          <w:lang w:val="en-US"/>
+        </w:rPr>
+        <w:t>Cerchez Emanuela</w:t>
+      </w:r>
+      <w:r>
+        <w:rPr>
+          <w:lang w:val="en-US"/>
+        </w:rPr>
+        <w:t>,</w:t>
+      </w:r>
+      <w:r>
+        <w:rPr>
+          <w:lang w:val="en-US"/>
+        </w:rPr>
+        <w:t xml:space="preserve"> </w:t>
       </w:r>
       <w:r>
         <w:rPr>
           <w:i/>
           <w:iCs/>
-          <w:lang w:val="ro-RO"/>
-        </w:rPr>
-        <w:t xml:space="preserve">ă - </w:t>
+          <w:lang w:val="en-US"/>
+        </w:rPr>
+        <w:t>Profesor Informatic</w:t>
       </w:r>
       <w:r>
         <w:rPr>
           <w:i/>
           <w:iCs/>
-          <w:lang w:val="en-US"/>
-        </w:rPr>
-        <w:t xml:space="preserve">Colegiul </w:t>
+          <w:lang w:val="ro-RO"/>
+        </w:rPr>
+        <w:t xml:space="preserve">ă - </w:t>
       </w:r>
       <w:r>
         <w:rPr>
           <w:i/>
           <w:iCs/>
-          <w:lang w:val="ro-RO"/>
-        </w:rPr>
-        <w:t>Național „Emil</w:t>
+          <w:lang w:val="en-US"/>
+        </w:rPr>
+        <w:t xml:space="preserve">Colegiul </w:t>
       </w:r>
       <w:r>
         <w:rPr>
@@ -215,7 +277,7 @@
           <w:iCs/>
           <w:lang w:val="ro-RO"/>
         </w:rPr>
-        <w:t xml:space="preserve"> </w:t>
+        <w:t>Național „Emil</w:t>
       </w:r>
       <w:r>
         <w:rPr>
@@ -223,6 +285,14 @@
           <w:iCs/>
           <w:lang w:val="ro-RO"/>
         </w:rPr>
+        <w:t xml:space="preserve"> </w:t>
+      </w:r>
+      <w:r>
+        <w:rPr>
+          <w:i/>
+          <w:iCs/>
+          <w:lang w:val="ro-RO"/>
+        </w:rPr>
         <w:t>Racoviță” Iași</w:t>
       </w:r>
     </w:p>
@@ -235,13 +305,16 @@
     </w:p>
     <w:p>
       <w:pPr>
-        <w:rPr>
-          <w:lang w:val="en-US"/>
+        <w:jc w:val="center"/>
+        <w:rPr>
+          <w:b/>
+          <w:bCs/>
+          <w:sz w:val="32"/>
+          <w:szCs w:val="32"/>
+          <w:lang w:val="ro-RO"/>
         </w:rPr>
         <w:sectPr>
           <w:footerReference w:type="default" r:id="rId8"/>
-          <w:headerReference w:type="first" r:id="rId9"/>
-          <w:footerReference w:type="first" r:id="rId10"/>
           <w:pgSz w:w="11906" w:h="16838"/>
           <w:pgMar w:top="1440" w:right="1440" w:bottom="1440" w:left="1440" w:header="709" w:footer="708" w:gutter="0"/>
           <w:pgNumType w:start="3"/>
@@ -262,7 +335,10 @@
           <w:lang w:val="ro-RO"/>
         </w:rPr>
       </w:pPr>
-      <w:r>
+    </w:p>
+    <w:p>
+      <w:pPr>
+        <w:jc w:val="center"/>
         <w:rPr>
           <w:b/>
           <w:bCs/>
@@ -270,7 +346,15 @@
           <w:szCs w:val="32"/>
           <w:lang w:val="ro-RO"/>
         </w:rPr>
-        <w:lastRenderedPageBreak/>
+      </w:pPr>
+      <w:r>
+        <w:rPr>
+          <w:b/>
+          <w:bCs/>
+          <w:sz w:val="32"/>
+          <w:szCs w:val="32"/>
+          <w:lang w:val="ro-RO"/>
+        </w:rPr>
         <w:t>CUPRINS</w:t>
       </w:r>
     </w:p>
@@ -288,28 +372,35 @@
           <w:tab w:val="right" w:leader="dot" w:pos="9016"/>
         </w:tabs>
         <w:rPr>
+          <w:rFonts w:asciiTheme="minorHAnsi" w:eastAsiaTheme="minorEastAsia" w:hAnsiTheme="minorHAnsi"/>
+          <w:smallCaps w:val="0"/>
           <w:noProof/>
-        </w:rPr>
-      </w:pPr>
-      <w:r>
-        <w:rPr>
+          <w:color w:val="auto"/>
+          <w:lang w:eastAsia="en-001"/>
+        </w:rPr>
+      </w:pPr>
+      <w:r>
+        <w:rPr>
+          <w:smallCaps w:val="0"/>
           <w:lang w:val="ro-RO"/>
         </w:rPr>
         <w:fldChar w:fldCharType="begin"/>
       </w:r>
       <w:r>
         <w:rPr>
+          <w:smallCaps w:val="0"/>
           <w:lang w:val="ro-RO"/>
         </w:rPr>
         <w:instrText xml:space="preserve"> TOC \o "1-2" \h \z \u </w:instrText>
       </w:r>
       <w:r>
         <w:rPr>
+          <w:smallCaps w:val="0"/>
           <w:lang w:val="ro-RO"/>
         </w:rPr>
         <w:fldChar w:fldCharType="separate"/>
       </w:r>
-      <w:hyperlink w:anchor="_Toc226996258" w:history="1">
+      <w:hyperlink w:anchor="_Toc227084072" w:history="1">
         <w:r>
           <w:rPr>
             <w:rStyle w:val="Hyperlink"/>
@@ -337,7 +428,7 @@
             <w:noProof/>
             <w:webHidden/>
           </w:rPr>
-          <w:instrText xml:space="preserve"> PAGEREF _Toc226996258 \h </w:instrText>
+          <w:instrText xml:space="preserve"> PAGEREF _Toc227084072 \h </w:instrText>
         </w:r>
         <w:r>
           <w:rPr>
@@ -375,10 +466,14 @@
           <w:tab w:val="right" w:leader="dot" w:pos="9016"/>
         </w:tabs>
         <w:rPr>
+          <w:rFonts w:asciiTheme="minorHAnsi" w:eastAsiaTheme="minorEastAsia" w:hAnsiTheme="minorHAnsi"/>
+          <w:smallCaps w:val="0"/>
           <w:noProof/>
-        </w:rPr>
-      </w:pPr>
-      <w:hyperlink w:anchor="_Toc226996259" w:history="1">
+          <w:color w:val="auto"/>
+          <w:lang w:eastAsia="en-001"/>
+        </w:rPr>
+      </w:pPr>
+      <w:hyperlink w:anchor="_Toc227084073" w:history="1">
         <w:r>
           <w:rPr>
             <w:rStyle w:val="Hyperlink"/>
@@ -406,7 +501,7 @@
             <w:noProof/>
             <w:webHidden/>
           </w:rPr>
-          <w:instrText xml:space="preserve"> PAGEREF _Toc226996259 \h </w:instrText>
+          <w:instrText xml:space="preserve"> PAGEREF _Toc227084073 \h </w:instrText>
         </w:r>
         <w:r>
           <w:rPr>
@@ -439,11 +534,444 @@
     </w:p>
     <w:p>
       <w:pPr>
+        <w:pStyle w:val="TOC2"/>
+        <w:tabs>
+          <w:tab w:val="right" w:leader="dot" w:pos="9016"/>
+        </w:tabs>
+        <w:rPr>
+          <w:rFonts w:asciiTheme="minorHAnsi" w:eastAsiaTheme="minorEastAsia" w:hAnsiTheme="minorHAnsi"/>
+          <w:smallCaps w:val="0"/>
+          <w:noProof/>
+          <w:color w:val="auto"/>
+          <w:lang w:eastAsia="en-001"/>
+        </w:rPr>
+      </w:pPr>
+      <w:hyperlink w:anchor="_Toc227084074" w:history="1">
+        <w:r>
+          <w:rPr>
+            <w:rStyle w:val="Hyperlink"/>
+            <w:noProof/>
+            <w:lang w:val="ro-RO"/>
+          </w:rPr>
+          <w:t>I.2. Tematica proiectului</w:t>
+        </w:r>
+        <w:r>
+          <w:rPr>
+            <w:noProof/>
+            <w:webHidden/>
+          </w:rPr>
+          <w:tab/>
+        </w:r>
+        <w:r>
+          <w:rPr>
+            <w:noProof/>
+            <w:webHidden/>
+          </w:rPr>
+          <w:fldChar w:fldCharType="begin"/>
+        </w:r>
+        <w:r>
+          <w:rPr>
+            <w:noProof/>
+            <w:webHidden/>
+          </w:rPr>
+          <w:instrText xml:space="preserve"> PAGEREF _Toc227084074 \h </w:instrText>
+        </w:r>
+        <w:r>
+          <w:rPr>
+            <w:noProof/>
+            <w:webHidden/>
+          </w:rPr>
+        </w:r>
+        <w:r>
+          <w:rPr>
+            <w:noProof/>
+            <w:webHidden/>
+          </w:rPr>
+          <w:fldChar w:fldCharType="separate"/>
+        </w:r>
+        <w:r>
+          <w:rPr>
+            <w:noProof/>
+            <w:webHidden/>
+          </w:rPr>
+          <w:t>3</w:t>
+        </w:r>
+        <w:r>
+          <w:rPr>
+            <w:noProof/>
+            <w:webHidden/>
+          </w:rPr>
+          <w:fldChar w:fldCharType="end"/>
+        </w:r>
+      </w:hyperlink>
+    </w:p>
+    <w:p>
+      <w:pPr>
+        <w:pStyle w:val="TOC2"/>
+        <w:tabs>
+          <w:tab w:val="right" w:leader="dot" w:pos="9016"/>
+        </w:tabs>
+        <w:rPr>
+          <w:rFonts w:asciiTheme="minorHAnsi" w:eastAsiaTheme="minorEastAsia" w:hAnsiTheme="minorHAnsi"/>
+          <w:smallCaps w:val="0"/>
+          <w:noProof/>
+          <w:color w:val="auto"/>
+          <w:lang w:eastAsia="en-001"/>
+        </w:rPr>
+      </w:pPr>
+      <w:hyperlink w:anchor="_Toc227084075" w:history="1">
+        <w:r>
+          <w:rPr>
+            <w:rStyle w:val="Hyperlink"/>
+            <w:noProof/>
+            <w:lang w:val="ro-RO"/>
+          </w:rPr>
+          <w:t>I.3. Convenții și decizii luate</w:t>
+        </w:r>
+        <w:r>
+          <w:rPr>
+            <w:noProof/>
+            <w:webHidden/>
+          </w:rPr>
+          <w:tab/>
+        </w:r>
+        <w:r>
+          <w:rPr>
+            <w:noProof/>
+            <w:webHidden/>
+          </w:rPr>
+          <w:fldChar w:fldCharType="begin"/>
+        </w:r>
+        <w:r>
+          <w:rPr>
+            <w:noProof/>
+            <w:webHidden/>
+          </w:rPr>
+          <w:instrText xml:space="preserve"> PAGEREF _Toc227084075 \h </w:instrText>
+        </w:r>
+        <w:r>
+          <w:rPr>
+            <w:noProof/>
+            <w:webHidden/>
+          </w:rPr>
+        </w:r>
+        <w:r>
+          <w:rPr>
+            <w:noProof/>
+            <w:webHidden/>
+          </w:rPr>
+          <w:fldChar w:fldCharType="separate"/>
+        </w:r>
+        <w:r>
+          <w:rPr>
+            <w:noProof/>
+            <w:webHidden/>
+          </w:rPr>
+          <w:t>4</w:t>
+        </w:r>
+        <w:r>
+          <w:rPr>
+            <w:noProof/>
+            <w:webHidden/>
+          </w:rPr>
+          <w:fldChar w:fldCharType="end"/>
+        </w:r>
+      </w:hyperlink>
+    </w:p>
+    <w:p>
+      <w:pPr>
+        <w:pStyle w:val="TOC1"/>
+        <w:tabs>
+          <w:tab w:val="right" w:leader="dot" w:pos="9016"/>
+        </w:tabs>
+        <w:rPr>
+          <w:rFonts w:asciiTheme="minorHAnsi" w:eastAsiaTheme="minorEastAsia" w:hAnsiTheme="minorHAnsi"/>
+          <w:smallCaps w:val="0"/>
+          <w:noProof/>
+          <w:color w:val="auto"/>
+          <w:lang w:eastAsia="en-001"/>
+        </w:rPr>
+      </w:pPr>
+      <w:hyperlink w:anchor="_Toc227084076" w:history="1">
+        <w:r>
+          <w:rPr>
+            <w:rStyle w:val="Hyperlink"/>
+            <w:noProof/>
+          </w:rPr>
+          <w:t>II. Structura</w:t>
+        </w:r>
+        <w:r>
+          <w:rPr>
+            <w:noProof/>
+            <w:webHidden/>
+          </w:rPr>
+          <w:tab/>
+        </w:r>
+        <w:r>
+          <w:rPr>
+            <w:noProof/>
+            <w:webHidden/>
+          </w:rPr>
+          <w:fldChar w:fldCharType="begin"/>
+        </w:r>
+        <w:r>
+          <w:rPr>
+            <w:noProof/>
+            <w:webHidden/>
+          </w:rPr>
+          <w:instrText xml:space="preserve"> PAGEREF _Toc227084076 \h </w:instrText>
+        </w:r>
+        <w:r>
+          <w:rPr>
+            <w:noProof/>
+            <w:webHidden/>
+          </w:rPr>
+        </w:r>
+        <w:r>
+          <w:rPr>
+            <w:noProof/>
+            <w:webHidden/>
+          </w:rPr>
+          <w:fldChar w:fldCharType="separate"/>
+        </w:r>
+        <w:r>
+          <w:rPr>
+            <w:noProof/>
+            <w:webHidden/>
+          </w:rPr>
+          <w:t>6</w:t>
+        </w:r>
+        <w:r>
+          <w:rPr>
+            <w:noProof/>
+            <w:webHidden/>
+          </w:rPr>
+          <w:fldChar w:fldCharType="end"/>
+        </w:r>
+      </w:hyperlink>
+    </w:p>
+    <w:p>
+      <w:pPr>
+        <w:pStyle w:val="TOC2"/>
+        <w:tabs>
+          <w:tab w:val="right" w:leader="dot" w:pos="9016"/>
+        </w:tabs>
+        <w:rPr>
+          <w:rFonts w:asciiTheme="minorHAnsi" w:eastAsiaTheme="minorEastAsia" w:hAnsiTheme="minorHAnsi"/>
+          <w:smallCaps w:val="0"/>
+          <w:noProof/>
+          <w:color w:val="auto"/>
+          <w:lang w:eastAsia="en-001"/>
+        </w:rPr>
+      </w:pPr>
+      <w:hyperlink w:anchor="_Toc227084077" w:history="1">
+        <w:r>
+          <w:rPr>
+            <w:rStyle w:val="Hyperlink"/>
+            <w:noProof/>
+          </w:rPr>
+          <w:t>II.1. Nucleu</w:t>
+        </w:r>
+        <w:r>
+          <w:rPr>
+            <w:noProof/>
+            <w:webHidden/>
+          </w:rPr>
+          <w:tab/>
+        </w:r>
+        <w:r>
+          <w:rPr>
+            <w:noProof/>
+            <w:webHidden/>
+          </w:rPr>
+          <w:fldChar w:fldCharType="begin"/>
+        </w:r>
+        <w:r>
+          <w:rPr>
+            <w:noProof/>
+            <w:webHidden/>
+          </w:rPr>
+          <w:instrText xml:space="preserve"> PAGEREF _Toc227084077 \h </w:instrText>
+        </w:r>
+        <w:r>
+          <w:rPr>
+            <w:noProof/>
+            <w:webHidden/>
+          </w:rPr>
+        </w:r>
+        <w:r>
+          <w:rPr>
+            <w:noProof/>
+            <w:webHidden/>
+          </w:rPr>
+          <w:fldChar w:fldCharType="separate"/>
+        </w:r>
+        <w:r>
+          <w:rPr>
+            <w:noProof/>
+            <w:webHidden/>
+          </w:rPr>
+          <w:t>6</w:t>
+        </w:r>
+        <w:r>
+          <w:rPr>
+            <w:noProof/>
+            <w:webHidden/>
+          </w:rPr>
+          <w:fldChar w:fldCharType="end"/>
+        </w:r>
+      </w:hyperlink>
+    </w:p>
+    <w:p>
+      <w:pPr>
+        <w:pStyle w:val="TOC2"/>
+        <w:tabs>
+          <w:tab w:val="right" w:leader="dot" w:pos="9016"/>
+        </w:tabs>
+        <w:rPr>
+          <w:rFonts w:asciiTheme="minorHAnsi" w:eastAsiaTheme="minorEastAsia" w:hAnsiTheme="minorHAnsi"/>
+          <w:smallCaps w:val="0"/>
+          <w:noProof/>
+          <w:color w:val="auto"/>
+          <w:lang w:eastAsia="en-001"/>
+        </w:rPr>
+      </w:pPr>
+      <w:hyperlink w:anchor="_Toc227084078" w:history="1">
+        <w:r>
+          <w:rPr>
+            <w:rStyle w:val="Hyperlink"/>
+            <w:noProof/>
+          </w:rPr>
+          <w:t>II.2. Aplicație</w:t>
+        </w:r>
+        <w:r>
+          <w:rPr>
+            <w:noProof/>
+            <w:webHidden/>
+          </w:rPr>
+          <w:tab/>
+        </w:r>
+        <w:r>
+          <w:rPr>
+            <w:noProof/>
+            <w:webHidden/>
+          </w:rPr>
+          <w:fldChar w:fldCharType="begin"/>
+        </w:r>
+        <w:r>
+          <w:rPr>
+            <w:noProof/>
+            <w:webHidden/>
+          </w:rPr>
+          <w:instrText xml:space="preserve"> PAGEREF _Toc227084078 \h </w:instrText>
+        </w:r>
+        <w:r>
+          <w:rPr>
+            <w:noProof/>
+            <w:webHidden/>
+          </w:rPr>
+        </w:r>
+        <w:r>
+          <w:rPr>
+            <w:noProof/>
+            <w:webHidden/>
+          </w:rPr>
+          <w:fldChar w:fldCharType="separate"/>
+        </w:r>
+        <w:r>
+          <w:rPr>
+            <w:noProof/>
+            <w:webHidden/>
+          </w:rPr>
+          <w:t>7</w:t>
+        </w:r>
+        <w:r>
+          <w:rPr>
+            <w:noProof/>
+            <w:webHidden/>
+          </w:rPr>
+          <w:fldChar w:fldCharType="end"/>
+        </w:r>
+      </w:hyperlink>
+    </w:p>
+    <w:p>
+      <w:pPr>
+        <w:pStyle w:val="TOC1"/>
+        <w:tabs>
+          <w:tab w:val="right" w:leader="dot" w:pos="9016"/>
+        </w:tabs>
+        <w:rPr>
+          <w:rFonts w:asciiTheme="minorHAnsi" w:eastAsiaTheme="minorEastAsia" w:hAnsiTheme="minorHAnsi"/>
+          <w:smallCaps w:val="0"/>
+          <w:noProof/>
+          <w:color w:val="auto"/>
+          <w:lang w:eastAsia="en-001"/>
+        </w:rPr>
+      </w:pPr>
+      <w:hyperlink w:anchor="_Toc227084079" w:history="1">
+        <w:r>
+          <w:rPr>
+            <w:rStyle w:val="Hyperlink"/>
+            <w:noProof/>
+          </w:rPr>
+          <w:t>III. Detalii tehnice</w:t>
+        </w:r>
+        <w:r>
+          <w:rPr>
+            <w:noProof/>
+            <w:webHidden/>
+          </w:rPr>
+          <w:tab/>
+        </w:r>
+        <w:r>
+          <w:rPr>
+            <w:noProof/>
+            <w:webHidden/>
+          </w:rPr>
+          <w:fldChar w:fldCharType="begin"/>
+        </w:r>
+        <w:r>
+          <w:rPr>
+            <w:noProof/>
+            <w:webHidden/>
+          </w:rPr>
+          <w:instrText xml:space="preserve"> PAGEREF _Toc227084079 \h </w:instrText>
+        </w:r>
+        <w:r>
+          <w:rPr>
+            <w:noProof/>
+            <w:webHidden/>
+          </w:rPr>
+        </w:r>
+        <w:r>
+          <w:rPr>
+            <w:noProof/>
+            <w:webHidden/>
+          </w:rPr>
+          <w:fldChar w:fldCharType="separate"/>
+        </w:r>
+        <w:r>
+          <w:rPr>
+            <w:noProof/>
+            <w:webHidden/>
+          </w:rPr>
+          <w:t>7</w:t>
+        </w:r>
+        <w:r>
+          <w:rPr>
+            <w:noProof/>
+            <w:webHidden/>
+          </w:rPr>
+          <w:fldChar w:fldCharType="end"/>
+        </w:r>
+      </w:hyperlink>
+    </w:p>
+    <w:p>
+      <w:pPr>
         <w:rPr>
           <w:lang w:val="ro-RO"/>
         </w:rPr>
         <w:sectPr>
-          <w:headerReference w:type="first" r:id="rId11"/>
           <w:pgSz w:w="11906" w:h="16838"/>
           <w:pgMar w:top="1440" w:right="1440" w:bottom="1440" w:left="1440" w:header="709" w:footer="708" w:gutter="0"/>
           <w:pgNumType w:start="3"/>
@@ -454,6 +982,7 @@
       </w:pPr>
       <w:r>
         <w:rPr>
+          <w:smallCaps/>
           <w:lang w:val="ro-RO"/>
         </w:rPr>
         <w:fldChar w:fldCharType="end"/>
@@ -473,7 +1002,7 @@
           <w:lang w:val="ro-RO"/>
         </w:rPr>
       </w:pPr>
-      <w:bookmarkStart w:id="0" w:name="_Toc226996258"/>
+      <w:bookmarkStart w:id="0" w:name="_Toc227084072"/>
       <w:r>
         <w:rPr>
           <w:lang w:val="ro-RO"/>
@@ -495,7 +1024,7 @@
           <w:lang w:val="ro-RO"/>
         </w:rPr>
       </w:pPr>
-      <w:bookmarkStart w:id="1" w:name="_Toc226996259"/>
+      <w:bookmarkStart w:id="1" w:name="_Toc227084073"/>
       <w:r>
         <w:rPr>
           <w:lang w:val="ro-RO"/>
@@ -507,21 +1036,2375 @@
     <w:p>
       <w:pPr>
         <w:pStyle w:val="NoSpacing"/>
+        <w:rPr>
+          <w:lang w:val="ro-RO"/>
+        </w:rPr>
       </w:pPr>
       <w:r>
         <w:rPr>
           <w:lang w:val="ro-RO"/>
         </w:rPr>
         <w:tab/>
-      </w:r>
-    </w:p>
+        <w:t xml:space="preserve">În lumea informaticii din prezent se observă o creștere exponențială în abstractizarea </w:t>
+      </w:r>
+      <w:r>
+        <w:rPr>
+          <w:lang w:val="ro-RO"/>
+        </w:rPr>
+        <w:t xml:space="preserve">interacțiunii dintre programator și calculator. Cele mai multe produse soft sunt scrise peste biblioteci uriașe ce conferă o mare parte din funcționalitatea programului. </w:t>
+      </w:r>
+      <w:r>
+        <w:rPr>
+          <w:lang w:val="ro-RO"/>
+        </w:rPr>
+        <w:t xml:space="preserve">Mai mult de atât, evoluția uriașă în domeniul Inteligenței Artificiale permite automatizarea întregului proces de Software Development. </w:t>
+      </w:r>
+    </w:p>
+    <w:p>
+      <w:pPr>
+        <w:pStyle w:val="NoSpacing"/>
+        <w:rPr>
+          <w:lang w:val="ro-RO"/>
+        </w:rPr>
+      </w:pPr>
+      <w:r>
+        <w:rPr>
+          <w:lang w:val="ro-RO"/>
+        </w:rPr>
+        <w:tab/>
+      </w:r>
+      <w:r>
+        <w:rPr>
+          <w:lang w:val="ro-RO"/>
+        </w:rPr>
+        <w:t xml:space="preserve">În prim plan, această abstractizare nu este ceva negativ, permite reutilizarea funcționalității, crearea unor proiecte mai complexe, generalizarea anumitor soluții și ușurează munca programatorului. </w:t>
+      </w:r>
+      <w:r>
+        <w:rPr>
+          <w:lang w:val="ro-RO"/>
+        </w:rPr>
+        <w:t>Totuși, odată cu creșterea nivelului de abstractizare, observăm creșterea numărului de produse incomplete, ineficiente, din punct de vedere al memoriei, cât și al timpului de execuție, dar ș</w:t>
+      </w:r>
+      <w:r>
+        <w:rPr>
+          <w:lang w:val="ro-RO"/>
+        </w:rPr>
+        <w:t>i vulnerabilitățile sau bug-urile acestor produse.</w:t>
+      </w:r>
+    </w:p>
+    <w:p>
+      <w:pPr>
+        <w:pStyle w:val="NoSpacing"/>
+        <w:rPr>
+          <w:lang w:val="ro-RO"/>
+        </w:rPr>
+      </w:pPr>
+      <w:r>
+        <w:rPr>
+          <w:lang w:val="ro-RO"/>
+        </w:rPr>
+        <w:tab/>
+        <w:t xml:space="preserve">Cea </w:t>
+      </w:r>
+      <w:r>
+        <w:rPr>
+          <w:lang w:val="ro-RO"/>
+        </w:rPr>
+        <w:t>mai proeminentă consecință a acestei abstractizări este efectul Black Box</w:t>
+      </w:r>
+      <w:r>
+        <w:rPr>
+          <w:rStyle w:val="FootnoteReference"/>
+          <w:lang w:val="ro-RO"/>
+        </w:rPr>
+        <w:footnoteReference w:id="1"/>
+      </w:r>
+      <w:r>
+        <w:rPr>
+          <w:lang w:val="ro-RO"/>
+        </w:rPr>
+        <w:t>, un efect pe care noi îl considerăm negativ pentru un programator</w:t>
+      </w:r>
+      <w:r>
+        <w:rPr>
+          <w:lang w:val="ro-RO"/>
+        </w:rPr>
+        <w:t xml:space="preserve"> și dăunător pentru un elev sau începător în domeniul informaticii.</w:t>
+      </w:r>
+    </w:p>
+    <w:p>
+      <w:pPr>
+        <w:pStyle w:val="NoSpacing"/>
+        <w:rPr>
+          <w:lang w:val="ro-RO"/>
+        </w:rPr>
+      </w:pPr>
+      <w:r>
+        <w:rPr>
+          <w:lang w:val="ro-RO"/>
+        </w:rPr>
+        <w:tab/>
+        <w:t xml:space="preserve">În acest sens, propunem acest proiect drept unealtă educațională pentru oricine </w:t>
+      </w:r>
+      <w:r>
+        <w:rPr>
+          <w:lang w:val="ro-RO"/>
+        </w:rPr>
+        <w:t xml:space="preserve">dorește să abordeze logica </w:t>
+      </w:r>
+      <w:r>
+        <w:rPr>
+          <w:lang w:val="ro-RO"/>
+        </w:rPr>
+        <w:t>digitala la un nivel cât mai aproape de componentele fizice ale sistemului de calcul.</w:t>
+      </w:r>
+    </w:p>
+    <w:p>
+      <w:pPr>
+        <w:pStyle w:val="Heading2"/>
+        <w:rPr>
+          <w:lang w:val="ro-RO"/>
+        </w:rPr>
+      </w:pPr>
+      <w:bookmarkStart w:id="2" w:name="_Toc227084074"/>
+      <w:r>
+        <w:rPr>
+          <w:lang w:val="ro-RO"/>
+        </w:rPr>
+        <w:t>I.2. Tematica proiectului</w:t>
+      </w:r>
+      <w:bookmarkEnd w:id="2"/>
+    </w:p>
+    <w:p>
+      <w:pPr>
+        <w:pStyle w:val="NoSpacing"/>
+        <w:rPr>
+          <w:lang w:val="ro-RO"/>
+        </w:rPr>
+      </w:pPr>
+      <w:r>
+        <w:rPr>
+          <w:lang w:val="ro-RO"/>
+        </w:rPr>
+        <w:tab/>
+        <w:t xml:space="preserve">Acest proiect este un produs soft, menit să ruleze nativ pe un sistem de operare ce admite interfață grafică. În prezent proiectul a fost testat pe sistemul de operare Microsoft Windows 10/11 64bit, pe procesoare ce </w:t>
+      </w:r>
+      <w:r>
+        <w:rPr>
+          <w:lang w:val="ro-RO"/>
+        </w:rPr>
+        <w:t>folosesc</w:t>
+      </w:r>
+      <w:r>
+        <w:rPr>
+          <w:lang w:val="ro-RO"/>
+        </w:rPr>
+        <w:t xml:space="preserve"> arhitectura x86, dar poate fi extins </w:t>
+      </w:r>
+      <w:r>
+        <w:rPr>
+          <w:lang w:val="ro-RO"/>
+        </w:rPr>
+        <w:t>pentru si</w:t>
+      </w:r>
+      <w:r>
+        <w:rPr>
+          <w:lang w:val="ro-RO"/>
+        </w:rPr>
+        <w:t>s</w:t>
+      </w:r>
+      <w:r>
+        <w:rPr>
+          <w:lang w:val="ro-RO"/>
+        </w:rPr>
+        <w:t>temele din familia UNIX, cu puține ajustări.</w:t>
+      </w:r>
+    </w:p>
+    <w:p>
+      <w:pPr>
+        <w:pStyle w:val="NoSpacing"/>
+        <w:rPr>
+          <w:lang w:val="ro-RO"/>
+        </w:rPr>
+      </w:pPr>
+      <w:r>
+        <w:rPr>
+          <w:lang w:val="ro-RO"/>
+        </w:rPr>
+        <w:tab/>
+        <w:t xml:space="preserve">Proiectul aparține familiei de programe de tip simulator, ce prezintă utilizatorului o interfață prietenoasă pentru a elabora un circuit abstract, compus din porți logice, indicatori ale stării curentului pentru datele intrare/ieșire și conectori. </w:t>
+      </w:r>
+    </w:p>
+    <w:p>
+      <w:pPr>
+        <w:pStyle w:val="NoSpacing"/>
+        <w:rPr>
+          <w:lang w:val="ro-RO"/>
+        </w:rPr>
+      </w:pPr>
+      <w:r>
+        <w:rPr>
+          <w:lang w:val="ro-RO"/>
+        </w:rPr>
+        <w:tab/>
+        <w:t xml:space="preserve">Utilizatorul este echipat cu o singură poartă logică de tip ȘI-NU (NAND) și este încurajat să folosească diferite </w:t>
+      </w:r>
+      <w:r>
+        <w:rPr>
+          <w:lang w:val="ro-RO"/>
+        </w:rPr>
+        <w:t>combinații ale acestei porți pentru a modela celelalte operații binare și mai apoi circuite complexe pentru a simula funcționalitatea unui sistem de calcul complet.</w:t>
+      </w:r>
+    </w:p>
+    <w:p>
+      <w:pPr>
+        <w:rPr>
+          <w:lang w:val="ro-RO"/>
+        </w:rPr>
+      </w:pPr>
+      <w:r>
+        <w:rPr>
+          <w:lang w:val="ro-RO"/>
+        </w:rPr>
+        <w:br w:type="page"/>
+      </w:r>
+    </w:p>
+    <w:p>
+      <w:pPr>
+        <w:pStyle w:val="Heading2"/>
+        <w:rPr>
+          <w:lang w:val="ro-RO"/>
+        </w:rPr>
+      </w:pPr>
+      <w:bookmarkStart w:id="3" w:name="_Toc227084075"/>
+      <w:r>
+        <w:rPr>
+          <w:lang w:val="ro-RO"/>
+        </w:rPr>
+        <w:lastRenderedPageBreak/>
+        <w:t>I.</w:t>
+      </w:r>
+      <w:r>
+        <w:rPr>
+          <w:lang w:val="ro-RO"/>
+        </w:rPr>
+        <w:t>3</w:t>
+      </w:r>
+      <w:r>
+        <w:rPr>
+          <w:lang w:val="ro-RO"/>
+        </w:rPr>
+        <w:t xml:space="preserve">. Convenții </w:t>
+      </w:r>
+      <w:r>
+        <w:rPr>
+          <w:lang w:val="ro-RO"/>
+        </w:rPr>
+        <w:t>și decizii luate</w:t>
+      </w:r>
+      <w:bookmarkEnd w:id="3"/>
+    </w:p>
+    <w:p>
+      <w:pPr>
+        <w:pStyle w:val="Heading3"/>
+        <w:rPr>
+          <w:lang w:val="ro-RO"/>
+        </w:rPr>
+      </w:pPr>
+      <w:bookmarkStart w:id="4" w:name="_I.3.1._Dependențe"/>
+      <w:bookmarkEnd w:id="4"/>
+      <w:r>
+        <w:rPr>
+          <w:lang w:val="ro-RO"/>
+        </w:rPr>
+        <w:t>I.3.1. Dependențe</w:t>
+      </w:r>
+    </w:p>
+    <w:p>
+      <w:pPr>
+        <w:pStyle w:val="NoSpacing"/>
+        <w:rPr>
+          <w:lang w:val="ro-RO"/>
+        </w:rPr>
+      </w:pPr>
+      <w:r>
+        <w:rPr>
+          <w:lang w:val="ro-RO"/>
+        </w:rPr>
+        <w:tab/>
+        <w:t>În spiritul minimizării nivelului de abstractizare, am ales să realizăm acest proiect folosind limbajul de programare C, respectând standardul C99</w:t>
+      </w:r>
+      <w:r>
+        <w:rPr>
+          <w:rStyle w:val="FootnoteReference"/>
+          <w:lang w:val="ro-RO"/>
+        </w:rPr>
+        <w:footnoteReference w:id="2"/>
+      </w:r>
+      <w:r>
+        <w:rPr>
+          <w:lang w:val="ro-RO"/>
+        </w:rPr>
+        <w:t xml:space="preserve">. Pe lângă biblioteca standard, acest proiect se folosește de </w:t>
+      </w:r>
+      <w:r>
+        <w:rPr>
+          <w:lang w:val="ro-RO"/>
+        </w:rPr>
+        <w:t>3</w:t>
+      </w:r>
+      <w:r>
+        <w:rPr>
+          <w:lang w:val="ro-RO"/>
+        </w:rPr>
+        <w:t xml:space="preserve"> biblioteci externe de tip Open-Source</w:t>
+      </w:r>
+      <w:r>
+        <w:rPr>
+          <w:rStyle w:val="FootnoteReference"/>
+          <w:lang w:val="ro-RO"/>
+        </w:rPr>
+        <w:footnoteReference w:id="3"/>
+      </w:r>
+      <w:r>
+        <w:rPr>
+          <w:lang w:val="en-GB"/>
+        </w:rPr>
+        <w:t>:</w:t>
+      </w:r>
+      <w:r>
+        <w:rPr>
+          <w:lang w:val="en-US"/>
+        </w:rPr>
+        <w:t xml:space="preserve"> </w:t>
+      </w:r>
+      <w:r>
+        <w:rPr>
+          <w:i/>
+          <w:iCs/>
+          <w:lang w:val="en-US"/>
+        </w:rPr>
+        <w:t>GLFW</w:t>
+      </w:r>
+      <w:r>
+        <w:rPr>
+          <w:i/>
+          <w:iCs/>
+          <w:lang w:val="en-US"/>
+        </w:rPr>
+        <w:t>, GLAD</w:t>
+      </w:r>
+      <w:r>
+        <w:rPr>
+          <w:lang w:val="en-US"/>
+        </w:rPr>
+        <w:t xml:space="preserve"> </w:t>
+      </w:r>
+      <w:r>
+        <w:rPr>
+          <w:lang w:val="ro-RO"/>
+        </w:rPr>
+        <w:t xml:space="preserve">și </w:t>
+      </w:r>
+      <w:r>
+        <w:rPr>
+          <w:i/>
+          <w:iCs/>
+          <w:lang w:val="ro-RO"/>
+        </w:rPr>
+        <w:t>stb</w:t>
+      </w:r>
+      <w:r>
+        <w:rPr>
+          <w:i/>
+          <w:iCs/>
+          <w:lang w:val="ro-RO"/>
+        </w:rPr>
+        <w:t>_</w:t>
+      </w:r>
+      <w:r>
+        <w:rPr>
+          <w:i/>
+          <w:iCs/>
+          <w:lang w:val="ro-RO"/>
+        </w:rPr>
+        <w:t>image</w:t>
+      </w:r>
+      <w:r>
+        <w:rPr>
+          <w:lang w:val="ro-RO"/>
+        </w:rPr>
+        <w:t xml:space="preserve"> </w:t>
+      </w:r>
+      <w:r>
+        <w:rPr>
+          <w:lang w:val="ro-RO"/>
+        </w:rPr>
+        <w:t>și un API</w:t>
+      </w:r>
+      <w:r>
+        <w:rPr>
+          <w:rStyle w:val="FootnoteReference"/>
+          <w:lang w:val="ro-RO"/>
+        </w:rPr>
+        <w:footnoteReference w:id="4"/>
+      </w:r>
+      <w:r>
+        <w:rPr>
+          <w:lang w:val="ro-RO"/>
+        </w:rPr>
+        <w:t xml:space="preserve"> de grafică pentru a accesa placa video a sistemului</w:t>
+      </w:r>
+      <w:r>
+        <w:rPr>
+          <w:lang w:val="ro-RO"/>
+        </w:rPr>
+        <w:t xml:space="preserve">, </w:t>
+      </w:r>
+      <w:r>
+        <w:rPr>
+          <w:i/>
+          <w:iCs/>
+          <w:lang w:val="ro-RO"/>
+        </w:rPr>
+        <w:t>OpenGL</w:t>
+      </w:r>
+      <w:r>
+        <w:rPr>
+          <w:lang w:val="ro-RO"/>
+        </w:rPr>
+        <w:t>.</w:t>
+      </w:r>
+    </w:p>
+    <w:p>
+      <w:pPr>
+        <w:pStyle w:val="NoSpacing"/>
+        <w:rPr>
+          <w:lang w:val="ro-RO"/>
+        </w:rPr>
+      </w:pPr>
+      <w:r>
+        <w:rPr>
+          <w:lang w:val="ro-RO"/>
+        </w:rPr>
+        <w:tab/>
+      </w:r>
+      <w:r>
+        <w:rPr>
+          <w:i/>
+          <w:iCs/>
+          <w:lang w:val="ro-RO"/>
+        </w:rPr>
+        <w:t>GLFW</w:t>
+      </w:r>
+      <w:r>
+        <w:rPr>
+          <w:i/>
+          <w:iCs/>
+          <w:lang w:val="ro-RO"/>
+        </w:rPr>
+        <w:t xml:space="preserve"> </w:t>
+      </w:r>
+      <w:r>
+        <w:rPr>
+          <w:lang w:val="ro-RO"/>
+        </w:rPr>
+        <w:t xml:space="preserve">este o bibliotecă Open-Source scrisă în C, elaborată pentru mai multe sisteme de operare/medii desktop, ce oferă funcționalitate pentru deschiderea panourilor/contexte grafice și interacțiunea cu utilizatorul printr-un sistem de evenimente. Mai multe detalii despre această bibliotecă pot fi găsite la </w:t>
+      </w:r>
+      <w:hyperlink r:id="rId9" w:history="1">
+        <w:r>
+          <w:rPr>
+            <w:rStyle w:val="Hyperlink"/>
+            <w:lang w:val="ro-RO"/>
+          </w:rPr>
+          <w:t>https://www.glfw.</w:t>
+        </w:r>
+        <w:r>
+          <w:rPr>
+            <w:rStyle w:val="Hyperlink"/>
+            <w:lang w:val="ro-RO"/>
+          </w:rPr>
+          <w:t>o</w:t>
+        </w:r>
+        <w:r>
+          <w:rPr>
+            <w:rStyle w:val="Hyperlink"/>
+            <w:lang w:val="ro-RO"/>
+          </w:rPr>
+          <w:t>rg/</w:t>
+        </w:r>
+      </w:hyperlink>
+      <w:r>
+        <w:rPr>
+          <w:lang w:val="ro-RO"/>
+        </w:rPr>
+        <w:t>.</w:t>
+      </w:r>
+    </w:p>
+    <w:p>
+      <w:pPr>
+        <w:pStyle w:val="NoSpacing"/>
+        <w:rPr>
+          <w:lang w:val="ro-RO"/>
+        </w:rPr>
+      </w:pPr>
+      <w:r>
+        <w:rPr>
+          <w:lang w:val="ro-RO"/>
+        </w:rPr>
+        <w:tab/>
+      </w:r>
+      <w:r>
+        <w:rPr>
+          <w:i/>
+          <w:iCs/>
+          <w:lang w:val="ro-RO"/>
+        </w:rPr>
+        <w:t>stb_image</w:t>
+      </w:r>
+      <w:r>
+        <w:rPr>
+          <w:i/>
+          <w:iCs/>
+          <w:lang w:val="ro-RO"/>
+        </w:rPr>
+        <w:t xml:space="preserve"> </w:t>
+      </w:r>
+      <w:r>
+        <w:rPr>
+          <w:lang w:val="ro-RO"/>
+        </w:rPr>
+        <w:t>este o bibliotecă Open-Source scrisă în C, de către Sean Barrett</w:t>
+      </w:r>
+      <w:r>
+        <w:rPr>
+          <w:lang w:val="ro-RO"/>
+        </w:rPr>
+        <w:t xml:space="preserve">, ce oferă funcționalitate pentru citirea fișierelor de tip imagine. Mai multe detalii pot fi găsite la </w:t>
+      </w:r>
+      <w:hyperlink r:id="rId10" w:history="1">
+        <w:r>
+          <w:rPr>
+            <w:rStyle w:val="Hyperlink"/>
+            <w:lang w:val="ro-RO"/>
+          </w:rPr>
+          <w:t>https://github.com/nothi</w:t>
+        </w:r>
+        <w:r>
+          <w:rPr>
+            <w:rStyle w:val="Hyperlink"/>
+            <w:lang w:val="ro-RO"/>
+          </w:rPr>
+          <w:t>n</w:t>
+        </w:r>
+        <w:r>
+          <w:rPr>
+            <w:rStyle w:val="Hyperlink"/>
+            <w:lang w:val="ro-RO"/>
+          </w:rPr>
+          <w:t>gs/stb</w:t>
+        </w:r>
+      </w:hyperlink>
+      <w:r>
+        <w:rPr>
+          <w:lang w:val="ro-RO"/>
+        </w:rPr>
+        <w:t>.</w:t>
+      </w:r>
+    </w:p>
+    <w:p>
+      <w:pPr>
+        <w:pStyle w:val="NoSpacing"/>
+        <w:rPr>
+          <w:lang w:val="ro-RO"/>
+        </w:rPr>
+      </w:pPr>
+      <w:r>
+        <w:rPr>
+          <w:lang w:val="ro-RO"/>
+        </w:rPr>
+        <w:tab/>
+      </w:r>
+      <w:r>
+        <w:rPr>
+          <w:i/>
+          <w:iCs/>
+          <w:lang w:val="ro-RO"/>
+        </w:rPr>
+        <w:t>OpenGL</w:t>
+      </w:r>
+      <w:r>
+        <w:rPr>
+          <w:lang w:val="ro-RO"/>
+        </w:rPr>
+        <w:t xml:space="preserve"> este o specificație API, apărută în 1992, ce descrie un sistem abstract pentru programarea componentelor grafice în 2D sau 3D. Fiind o specificație/listă de specificații, </w:t>
+      </w:r>
+      <w:r>
+        <w:rPr>
+          <w:i/>
+          <w:iCs/>
+          <w:lang w:val="ro-RO"/>
+        </w:rPr>
+        <w:t>OpenGL</w:t>
+      </w:r>
+      <w:r>
+        <w:rPr>
+          <w:lang w:val="ro-RO"/>
+        </w:rPr>
+        <w:t xml:space="preserve"> NU este o bibliotecă, implementarea sistemului descris fiind responsabilitatea dezvoltatorului de plăci video. Programul propriu-zis ce implementează sistemul </w:t>
+      </w:r>
+      <w:r>
+        <w:rPr>
+          <w:i/>
+          <w:iCs/>
+          <w:lang w:val="ro-RO"/>
+        </w:rPr>
+        <w:t>OpenGL</w:t>
+      </w:r>
+      <w:r>
+        <w:rPr>
+          <w:lang w:val="ro-RO"/>
+        </w:rPr>
+        <w:t>, apare, așadar, în driverul</w:t>
+      </w:r>
+      <w:r>
+        <w:rPr>
+          <w:rStyle w:val="FootnoteReference"/>
+          <w:lang w:val="ro-RO"/>
+        </w:rPr>
+        <w:footnoteReference w:id="5"/>
+      </w:r>
+      <w:r>
+        <w:rPr>
+          <w:lang w:val="ro-RO"/>
+        </w:rPr>
+        <w:t xml:space="preserve"> </w:t>
+      </w:r>
+      <w:r>
+        <w:rPr>
+          <w:lang w:val="ro-RO"/>
+        </w:rPr>
+        <w:t xml:space="preserve">cu care este dezvoltată placa video. Pentru a avea acces la funcționalitatea dată de driver, vom folosi o bibliotecă Open-Source numită </w:t>
+      </w:r>
+      <w:r>
+        <w:rPr>
+          <w:i/>
+          <w:iCs/>
+          <w:lang w:val="ro-RO"/>
+        </w:rPr>
+        <w:t>GLAD</w:t>
+      </w:r>
+      <w:r>
+        <w:rPr>
+          <w:lang w:val="ro-RO"/>
+        </w:rPr>
+        <w:t>, ce caută în lista de simboluri a d</w:t>
+      </w:r>
+      <w:r>
+        <w:rPr>
+          <w:lang w:val="ro-RO"/>
+        </w:rPr>
+        <w:t>ri</w:t>
+      </w:r>
+      <w:r>
+        <w:rPr>
+          <w:lang w:val="ro-RO"/>
+        </w:rPr>
+        <w:t xml:space="preserve">verului și atașează instrucțiunile la numele de funcții descrise în specificația </w:t>
+      </w:r>
+      <w:r>
+        <w:rPr>
+          <w:i/>
+          <w:iCs/>
+          <w:lang w:val="ro-RO"/>
+        </w:rPr>
+        <w:t>OpenGL</w:t>
+      </w:r>
+      <w:r>
+        <w:rPr>
+          <w:lang w:val="ro-RO"/>
+        </w:rPr>
+        <w:t>, mai multe detalii pot fi găsite la</w:t>
+      </w:r>
+      <w:r>
+        <w:rPr>
+          <w:lang w:val="ro-RO"/>
+        </w:rPr>
+        <w:t xml:space="preserve"> </w:t>
+      </w:r>
+      <w:hyperlink r:id="rId11" w:history="1">
+        <w:r>
+          <w:rPr>
+            <w:rStyle w:val="Hyperlink"/>
+            <w:lang w:val="ro-RO"/>
+          </w:rPr>
+          <w:t>https://</w:t>
+        </w:r>
+        <w:r>
+          <w:rPr>
+            <w:rStyle w:val="Hyperlink"/>
+            <w:lang w:val="ro-RO"/>
+          </w:rPr>
+          <w:t>g</w:t>
+        </w:r>
+        <w:r>
+          <w:rPr>
+            <w:rStyle w:val="Hyperlink"/>
+            <w:lang w:val="ro-RO"/>
+          </w:rPr>
+          <w:t>ithub.com/Dav1dde/glad</w:t>
+        </w:r>
+      </w:hyperlink>
+      <w:r>
+        <w:rPr>
+          <w:lang w:val="ro-RO"/>
+        </w:rPr>
+        <w:t>.</w:t>
+      </w:r>
+    </w:p>
+    <w:p>
+      <w:pPr>
+        <w:rPr>
+          <w:lang w:val="ro-RO"/>
+        </w:rPr>
+      </w:pPr>
+    </w:p>
+    <w:p>
+      <w:pPr>
+        <w:pStyle w:val="Heading3"/>
+        <w:rPr>
+          <w:lang w:val="ro-RO"/>
+        </w:rPr>
+      </w:pPr>
+      <w:r>
+        <w:rPr>
+          <w:lang w:val="ro-RO"/>
+        </w:rPr>
+        <w:t>I.3.2. Convenții de scriere</w:t>
+      </w:r>
+    </w:p>
+    <w:p>
+      <w:pPr>
+        <w:pStyle w:val="NoSpacing"/>
+        <w:rPr>
+          <w:lang w:val="en-GB"/>
+        </w:rPr>
+      </w:pPr>
+      <w:r>
+        <w:rPr>
+          <w:lang w:val="en-GB"/>
+        </w:rPr>
+        <w:tab/>
+        <w:t>În această lucrare se vor regăsi secvențe de cod</w:t>
+      </w:r>
+      <w:r>
+        <w:rPr>
+          <w:lang w:val="en-GB"/>
+        </w:rPr>
+        <w:t xml:space="preserve"> din proiect</w:t>
+      </w:r>
+      <w:r>
+        <w:rPr>
+          <w:lang w:val="en-GB"/>
+        </w:rPr>
+        <w:t>;</w:t>
+      </w:r>
+      <w:r>
+        <w:rPr>
+          <w:lang w:val="en-GB"/>
+        </w:rPr>
+        <w:t xml:space="preserve"> pentru a stabilii un model ușor de urmărit definim următoarele convenții de scriere a codului.</w:t>
+      </w:r>
+    </w:p>
+    <w:p>
+      <w:pPr>
+        <w:pStyle w:val="NoSpacing"/>
+        <w:rPr>
+          <w:lang w:val="en-GB"/>
+        </w:rPr>
+      </w:pPr>
+      <w:r>
+        <w:rPr>
+          <w:lang w:val="en-GB"/>
+        </w:rPr>
+        <w:tab/>
+        <w:t xml:space="preserve">Tipurile de date utilizate sunt definite de biblioteca standard </w:t>
+      </w:r>
+      <w:r>
+        <w:rPr>
+          <w:rFonts w:ascii="Consolas" w:hAnsi="Consolas"/>
+          <w:lang w:val="en-GB"/>
+        </w:rPr>
+        <w:t>&lt;inttypes.h&gt;</w:t>
+      </w:r>
+      <w:r>
+        <w:rPr>
+          <w:lang w:val="en-GB"/>
+        </w:rPr>
+        <w:t xml:space="preserve"> </w:t>
+      </w:r>
+      <w:r>
+        <w:rPr>
+          <w:lang w:val="ro-RO"/>
+        </w:rPr>
+        <w:t>și redefinite în acest proiect cu urmatoarea structură</w:t>
+      </w:r>
+      <w:r>
+        <w:rPr>
+          <w:lang w:val="en-GB"/>
+        </w:rPr>
+        <w:t>:</w:t>
+      </w:r>
+      <w:r>
+        <w:rPr>
+          <w:lang w:val="en-US"/>
+        </w:rPr>
+        <w:t xml:space="preserve"> prima liter</w:t>
+      </w:r>
+      <w:r>
+        <w:rPr>
+          <w:lang w:val="ro-RO"/>
+        </w:rPr>
+        <w:t xml:space="preserve">ă reprezintă tipul general al datelor </w:t>
+      </w:r>
+      <w:r>
+        <w:rPr>
+          <w:lang w:val="en-GB"/>
+        </w:rPr>
+        <w:t>[i/u/f]</w:t>
+      </w:r>
+      <w:r>
+        <w:rPr>
+          <w:lang w:val="en-US"/>
+        </w:rPr>
+        <w:t xml:space="preserve">, </w:t>
+      </w:r>
+      <w:r>
+        <w:rPr>
+          <w:lang w:val="ro-RO"/>
+        </w:rPr>
+        <w:t xml:space="preserve">numere întregi cu semn, întregi fără semn, respectiv numere reale, următoarele cifre reprezintă numărul de biți necesari reprezentării numărului în memorie </w:t>
+      </w:r>
+      <w:r>
+        <w:rPr>
+          <w:lang w:val="en-GB"/>
+        </w:rPr>
+        <w:t>[8/16/32/64/128]</w:t>
+      </w:r>
+      <w:r>
+        <w:rPr>
+          <w:lang w:val="ro-RO"/>
+        </w:rPr>
+        <w:t>. Prin urmare, avem următoarele tipuri de date</w:t>
+      </w:r>
+      <w:r>
+        <w:rPr>
+          <w:lang w:val="en-GB"/>
+        </w:rPr>
+        <w:t>:</w:t>
+      </w:r>
+    </w:p>
+    <w:p>
+      <w:pPr>
+        <w:pStyle w:val="NoSpacing"/>
+        <w:rPr>
+          <w:lang w:val="en-GB"/>
+        </w:rPr>
+      </w:pPr>
+    </w:p>
+    <w:bookmarkStart w:id="5" w:name="_MON_1837691333"/>
+    <w:bookmarkEnd w:id="5"/>
+    <w:p>
+      <w:pPr>
+        <w:pStyle w:val="NoSpacing"/>
+        <w:rPr>
+          <w:lang w:val="en-US"/>
+        </w:rPr>
+      </w:pPr>
+      <w:r>
+        <w:rPr>
+          <w:lang w:val="en-US"/>
+        </w:rPr>
+        <w:object w:dxaOrig="9026" w:dyaOrig="3653" w14:anchorId="505E0081">
+          <v:shapetype id="_x0000_t75" coordsize="21600,21600" o:spt="75" o:preferrelative="t" path="m@4@5l@4@11@9@11@9@5xe" filled="f" stroked="f">
+            <v:stroke joinstyle="miter"/>
+            <v:formulas>
+              <v:f eqn="if lineDrawn pixelLineWidth 0"/>
+              <v:f eqn="sum @0 1 0"/>
+              <v:f eqn="sum 0 0 @1"/>
+              <v:f eqn="prod @2 1 2"/>
+              <v:f eqn="prod @3 21600 pixelWidth"/>
+              <v:f eqn="prod @3 21600 pixelHeight"/>
+              <v:f eqn="sum @0 0 1"/>
+              <v:f eqn="prod @6 1 2"/>
+              <v:f eqn="prod @7 21600 pixelWidth"/>
+              <v:f eqn="sum @8 21600 0"/>
+              <v:f eqn="prod @7 21600 pixelHeight"/>
+              <v:f eqn="sum @10 21600 0"/>
+            </v:formulas>
+            <v:path o:extrusionok="f" gradientshapeok="t" o:connecttype="rect"/>
+            <o:lock v:ext="edit" aspectratio="t"/>
+          </v:shapetype>
+          <v:shape id="_x0000_i1193" type="#_x0000_t75" style="width:403.9pt;height:163.4pt" o:ole="">
+            <v:imagedata r:id="rId12" o:title=""/>
+            <w10:bordertop type="single" width="4"/>
+            <w10:borderleft type="single" width="4"/>
+            <w10:borderbottom type="single" width="4"/>
+            <w10:borderright type="single" width="4"/>
+          </v:shape>
+          <o:OLEObject Type="Embed" ProgID="Word.OpenDocumentText.12" ShapeID="_x0000_i1193" DrawAspect="Content" ObjectID="_1837712083" r:id="rId13"/>
+        </w:object>
+      </w:r>
+    </w:p>
+    <w:p>
+      <w:pPr>
+        <w:pStyle w:val="NoSpacing"/>
+        <w:rPr>
+          <w:lang w:val="ro-RO"/>
+        </w:rPr>
+      </w:pPr>
+      <w:r>
+        <w:rPr>
+          <w:lang w:val="en-US"/>
+        </w:rPr>
+        <w:lastRenderedPageBreak/>
+        <w:tab/>
+        <w:t>Pe l</w:t>
+      </w:r>
+      <w:r>
+        <w:rPr>
+          <w:lang w:val="ro-RO"/>
+        </w:rPr>
+        <w:t>ângă acestea, definim următoarele 2 tipuri de date pentru a clarifica intenția utilizării unor variabile.</w:t>
+      </w:r>
+    </w:p>
+    <w:p>
+      <w:pPr>
+        <w:pStyle w:val="NoSpacing"/>
+        <w:rPr>
+          <w:lang w:val="ro-RO"/>
+        </w:rPr>
+      </w:pPr>
+    </w:p>
+    <w:bookmarkStart w:id="6" w:name="_MON_1837691641"/>
+    <w:bookmarkEnd w:id="6"/>
+    <w:p>
+      <w:pPr>
+        <w:pStyle w:val="NoSpacing"/>
+        <w:rPr>
+          <w:lang w:val="en-US"/>
+        </w:rPr>
+      </w:pPr>
+      <w:r>
+        <w:rPr>
+          <w:lang w:val="en-US"/>
+        </w:rPr>
+        <w:object w:dxaOrig="9026" w:dyaOrig="806" w14:anchorId="099D0BF2">
+          <v:shape id="_x0000_i1174" type="#_x0000_t75" style="width:451.4pt;height:40.35pt" o:ole="">
+            <v:imagedata r:id="rId14" o:title=""/>
+            <w10:bordertop type="single" width="4"/>
+            <w10:borderleft type="single" width="4"/>
+            <w10:borderbottom type="single" width="4"/>
+            <w10:borderright type="single" width="4"/>
+          </v:shape>
+          <o:OLEObject Type="Embed" ProgID="Word.OpenDocumentText.12" ShapeID="_x0000_i1174" DrawAspect="Content" ObjectID="_1837712084" r:id="rId15"/>
+        </w:object>
+      </w:r>
+    </w:p>
+    <w:p>
+      <w:pPr>
+        <w:pStyle w:val="NoSpacing"/>
+        <w:rPr>
+          <w:lang w:val="en-US"/>
+        </w:rPr>
+      </w:pPr>
+    </w:p>
+    <w:p>
+      <w:pPr>
+        <w:pStyle w:val="NoSpacing"/>
+        <w:ind w:firstLine="720"/>
+        <w:rPr>
+          <w:rFonts w:cs="Times New Roman"/>
+          <w:lang w:val="en-US"/>
+        </w:rPr>
+      </w:pPr>
+      <w:r>
+        <w:rPr>
+          <w:lang w:val="en-US"/>
+        </w:rPr>
+        <w:t xml:space="preserve">Cu toate acestea, utilizăm în continuare și tipul </w:t>
+      </w:r>
+      <w:r>
+        <w:rPr>
+          <w:rFonts w:ascii="Consolas" w:hAnsi="Consolas"/>
+          <w:lang w:val="en-US"/>
+        </w:rPr>
+        <w:t>char</w:t>
+      </w:r>
+      <w:r>
+        <w:rPr>
+          <w:rFonts w:cs="Times New Roman"/>
+          <w:lang w:val="en-US"/>
+        </w:rPr>
+        <w:t xml:space="preserve"> când lucrăm cu șiruri de caractere.</w:t>
+      </w:r>
+    </w:p>
+    <w:p>
+      <w:pPr>
+        <w:pStyle w:val="NoSpacing"/>
+        <w:rPr>
+          <w:rFonts w:cs="Times New Roman"/>
+          <w:lang w:val="en-US"/>
+        </w:rPr>
+      </w:pPr>
+    </w:p>
+    <w:p>
+      <w:pPr>
+        <w:pStyle w:val="NoSpacing"/>
+        <w:rPr>
+          <w:rFonts w:cs="Times New Roman"/>
+          <w:lang w:val="en-US"/>
+        </w:rPr>
+      </w:pPr>
+      <w:r>
+        <w:rPr>
+          <w:rFonts w:cs="Times New Roman"/>
+          <w:lang w:val="en-US"/>
+        </w:rPr>
+        <w:tab/>
+        <w:t>În continuare definim convenții de scriere a funcțiilor</w:t>
+      </w:r>
+      <w:r>
+        <w:rPr>
+          <w:rFonts w:cs="Times New Roman"/>
+          <w:lang w:val="en-US"/>
+        </w:rPr>
+        <w:t xml:space="preserve"> și structurile de date definite de programator. </w:t>
+      </w:r>
+    </w:p>
+    <w:p>
+      <w:pPr>
+        <w:pStyle w:val="NoSpacing"/>
+        <w:rPr>
+          <w:rFonts w:cs="Times New Roman"/>
+          <w:lang w:val="en-US"/>
+        </w:rPr>
+      </w:pPr>
+    </w:p>
+    <w:p>
+      <w:pPr>
+        <w:pStyle w:val="NoSpacing"/>
+        <w:ind w:firstLine="720"/>
+        <w:rPr>
+          <w:rFonts w:cs="Times New Roman"/>
+          <w:lang w:val="en-GB"/>
+        </w:rPr>
+      </w:pPr>
+      <w:r>
+        <w:rPr>
+          <w:rFonts w:cs="Times New Roman"/>
+          <w:lang w:val="en-US"/>
+        </w:rPr>
+        <w:t xml:space="preserve">În secțiunea </w:t>
+      </w:r>
+      <w:hyperlink w:anchor="_II._Structura" w:history="1">
+        <w:r>
+          <w:rPr>
+            <w:rStyle w:val="Hyperlink"/>
+            <w:rFonts w:cs="Times New Roman"/>
+            <w:lang w:val="en-US"/>
+          </w:rPr>
+          <w:t>II. Str</w:t>
+        </w:r>
+        <w:r>
+          <w:rPr>
+            <w:rStyle w:val="Hyperlink"/>
+            <w:rFonts w:cs="Times New Roman"/>
+            <w:lang w:val="en-US"/>
+          </w:rPr>
+          <w:t>u</w:t>
+        </w:r>
+        <w:r>
+          <w:rPr>
+            <w:rStyle w:val="Hyperlink"/>
+            <w:rFonts w:cs="Times New Roman"/>
+            <w:lang w:val="en-US"/>
+          </w:rPr>
+          <w:t>ctura</w:t>
+        </w:r>
+      </w:hyperlink>
+      <w:r>
+        <w:rPr>
+          <w:rFonts w:cs="Times New Roman"/>
+          <w:lang w:val="en-US"/>
+        </w:rPr>
+        <w:t xml:space="preserve"> vor fi prezentate în amănunt deciziile legate de arhitectura proiectului, dar, în principiu, încercăm să separăm funcționalitatea în module. Așadar, fiecare nume de funcție va avea următoarea structură</w:t>
+      </w:r>
+      <w:r>
+        <w:rPr>
+          <w:rFonts w:cs="Times New Roman"/>
+          <w:lang w:val="en-GB"/>
+        </w:rPr>
+        <w:t>:</w:t>
+      </w:r>
+      <w:r>
+        <w:rPr>
+          <w:rFonts w:cs="Times New Roman"/>
+          <w:lang w:val="en-US"/>
+        </w:rPr>
+        <w:t xml:space="preserve"> primul cuv</w:t>
+      </w:r>
+      <w:r>
+        <w:rPr>
+          <w:rFonts w:cs="Times New Roman"/>
+          <w:lang w:val="ro-RO"/>
+        </w:rPr>
+        <w:t>ânt reprezintă modulul din care face parte funcția, urmat de „</w:t>
+      </w:r>
+      <w:r>
+        <w:rPr>
+          <w:rFonts w:cs="Times New Roman"/>
+          <w:lang w:val="ro-RO"/>
+        </w:rPr>
+        <w:t xml:space="preserve"> </w:t>
+      </w:r>
+      <w:r>
+        <w:rPr>
+          <w:rFonts w:cs="Times New Roman"/>
+          <w:lang w:val="ro-RO"/>
+        </w:rPr>
+        <w:t>_</w:t>
+      </w:r>
+      <w:r>
+        <w:rPr>
+          <w:rFonts w:cs="Times New Roman"/>
+          <w:lang w:val="ro-RO"/>
+        </w:rPr>
+        <w:t xml:space="preserve"> </w:t>
+      </w:r>
+      <w:r>
+        <w:rPr>
+          <w:rFonts w:cs="Times New Roman"/>
+          <w:lang w:val="ro-RO"/>
+        </w:rPr>
+        <w:t>”, al doilea cuvânt reprezintă obiectul/componenta pe care lucrează funcția, al treilea cuvânt reprezintă acțiunea pe care o îndeplinește funcția. După aceste 3 se pot adăuga alți identificatori/discriminatori ai funcției, astfel încât acțiunea pe care o îndeplinește să fie cât mai clară. Câteva exemple de funcții pe care le vom regăsi în cod sunt</w:t>
+      </w:r>
+      <w:r>
+        <w:rPr>
+          <w:rFonts w:cs="Times New Roman"/>
+          <w:lang w:val="en-GB"/>
+        </w:rPr>
+        <w:t>:</w:t>
+      </w:r>
+    </w:p>
+    <w:p>
+      <w:pPr>
+        <w:pStyle w:val="NoSpacing"/>
+        <w:rPr>
+          <w:rFonts w:cs="Times New Roman"/>
+          <w:lang w:val="en-US"/>
+        </w:rPr>
+      </w:pPr>
+    </w:p>
+    <w:bookmarkStart w:id="7" w:name="_MON_1837693204"/>
+    <w:bookmarkEnd w:id="7"/>
+    <w:p>
+      <w:pPr>
+        <w:pStyle w:val="NoSpacing"/>
+        <w:rPr>
+          <w:lang w:val="en-US"/>
+        </w:rPr>
+      </w:pPr>
+      <w:r>
+        <w:rPr>
+          <w:lang w:val="en-US"/>
+        </w:rPr>
+        <w:object w:dxaOrig="9026" w:dyaOrig="1129" w14:anchorId="3803F6A7">
+          <v:shape id="_x0000_i1196" type="#_x0000_t75" style="width:451.4pt;height:56.55pt" o:ole="">
+            <v:imagedata r:id="rId16" o:title=""/>
+            <w10:bordertop type="single" width="4"/>
+            <w10:borderleft type="single" width="4"/>
+            <w10:borderbottom type="single" width="4"/>
+            <w10:borderright type="single" width="4"/>
+          </v:shape>
+          <o:OLEObject Type="Embed" ProgID="Word.OpenDocumentText.12" ShapeID="_x0000_i1196" DrawAspect="Content" ObjectID="_1837712085" r:id="rId17"/>
+        </w:object>
+      </w:r>
+    </w:p>
+    <w:p>
+      <w:pPr>
+        <w:rPr>
+          <w:rFonts w:cs="Times New Roman"/>
+          <w:lang w:val="en-US"/>
+        </w:rPr>
+      </w:pPr>
+    </w:p>
+    <w:p>
+      <w:pPr>
+        <w:pStyle w:val="NoSpacing"/>
+        <w:rPr>
+          <w:rFonts w:cs="Times New Roman"/>
+          <w:lang w:val="en-GB"/>
+        </w:rPr>
+      </w:pPr>
+      <w:r>
+        <w:rPr>
+          <w:rFonts w:cs="Times New Roman"/>
+          <w:lang w:val="en-US"/>
+        </w:rPr>
+        <w:tab/>
+      </w:r>
+      <w:r>
+        <w:rPr>
+          <w:rFonts w:cs="Times New Roman"/>
+          <w:lang w:val="en-US"/>
+        </w:rPr>
+        <w:t>Structurile de date definite de programator sunt formate din 1 sau mai multe cuvinte, scrise cu prima liter</w:t>
+      </w:r>
+      <w:r>
+        <w:rPr>
+          <w:rFonts w:cs="Times New Roman"/>
+          <w:lang w:val="ro-RO"/>
+        </w:rPr>
+        <w:t>ă majusculă, fără separatori între ele. Spre exemplu</w:t>
+      </w:r>
+      <w:r>
+        <w:rPr>
+          <w:rFonts w:cs="Times New Roman"/>
+          <w:lang w:val="en-GB"/>
+        </w:rPr>
+        <w:t>:</w:t>
+      </w:r>
+    </w:p>
+    <w:p>
+      <w:pPr>
+        <w:pStyle w:val="NoSpacing"/>
+        <w:rPr>
+          <w:rFonts w:cs="Times New Roman"/>
+          <w:lang w:val="en-US"/>
+        </w:rPr>
+      </w:pPr>
+    </w:p>
+    <w:bookmarkStart w:id="8" w:name="_MON_1837693451"/>
+    <w:bookmarkEnd w:id="8"/>
+    <w:p>
+      <w:pPr>
+        <w:pStyle w:val="NoSpacing"/>
+        <w:rPr>
+          <w:lang w:val="en-US"/>
+        </w:rPr>
+      </w:pPr>
+      <w:r>
+        <w:rPr>
+          <w:lang w:val="en-US"/>
+        </w:rPr>
+        <w:object w:dxaOrig="9026" w:dyaOrig="1129" w14:anchorId="3C311A47">
+          <v:shape id="_x0000_i1198" type="#_x0000_t75" style="width:451.4pt;height:56.55pt" o:ole="">
+            <v:imagedata r:id="rId18" o:title=""/>
+            <w10:bordertop type="single" width="4"/>
+            <w10:borderleft type="single" width="4"/>
+            <w10:borderbottom type="single" width="4"/>
+            <w10:borderright type="single" width="4"/>
+          </v:shape>
+          <o:OLEObject Type="Embed" ProgID="Word.OpenDocumentText.12" ShapeID="_x0000_i1198" DrawAspect="Content" ObjectID="_1837712086" r:id="rId19"/>
+        </w:object>
+      </w:r>
+    </w:p>
+    <w:p>
+      <w:pPr>
+        <w:pStyle w:val="NoSpacing"/>
+        <w:rPr>
+          <w:lang w:val="en-US"/>
+        </w:rPr>
+      </w:pPr>
+    </w:p>
+    <w:p>
+      <w:pPr>
+        <w:pStyle w:val="NoSpacing"/>
+        <w:rPr>
+          <w:lang w:val="en-GB"/>
+        </w:rPr>
+      </w:pPr>
+      <w:r>
+        <w:rPr>
+          <w:lang w:val="en-US"/>
+        </w:rPr>
+        <w:tab/>
+      </w:r>
+      <w:r>
+        <w:rPr>
+          <w:lang w:val="en-US"/>
+        </w:rPr>
+        <w:t>Proiectul se folose</w:t>
+      </w:r>
+      <w:r>
+        <w:rPr>
+          <w:lang w:val="ro-RO"/>
+        </w:rPr>
+        <w:t>ște des de constante definite la nivelul preprocesorului sau macrouri, acestea sunt formate din cuvinte separate prin „ _ ”, scrise cu majuscule și cu prefixul „ENN_”, pentru a preveni eventualele redefiniri ale unor constante cu același nume. Spre exemplu</w:t>
+      </w:r>
+      <w:r>
+        <w:rPr>
+          <w:lang w:val="en-GB"/>
+        </w:rPr>
+        <w:t>:</w:t>
+      </w:r>
+    </w:p>
+    <w:p>
+      <w:pPr>
+        <w:pStyle w:val="NoSpacing"/>
+        <w:rPr>
+          <w:lang w:val="en-US"/>
+        </w:rPr>
+      </w:pPr>
+    </w:p>
+    <w:bookmarkStart w:id="9" w:name="_MON_1837695209"/>
+    <w:bookmarkEnd w:id="9"/>
+    <w:p>
+      <w:pPr>
+        <w:pStyle w:val="NoSpacing"/>
+        <w:rPr>
+          <w:lang w:val="en-US"/>
+        </w:rPr>
+      </w:pPr>
+      <w:r>
+        <w:rPr>
+          <w:lang w:val="en-US"/>
+        </w:rPr>
+        <w:object w:dxaOrig="9026" w:dyaOrig="1129" w14:anchorId="0DF40D06">
+          <v:shape id="_x0000_i1200" type="#_x0000_t75" style="width:451.4pt;height:56.55pt" o:ole="">
+            <v:imagedata r:id="rId20" o:title=""/>
+            <w10:bordertop type="single" width="4"/>
+            <w10:borderleft type="single" width="4"/>
+            <w10:borderbottom type="single" width="4"/>
+            <w10:borderright type="single" width="4"/>
+          </v:shape>
+          <o:OLEObject Type="Embed" ProgID="Word.OpenDocumentText.12" ShapeID="_x0000_i1200" DrawAspect="Content" ObjectID="_1837712087" r:id="rId21"/>
+        </w:object>
+      </w:r>
+      <w:bookmarkStart w:id="10" w:name="_II._Structura"/>
+      <w:bookmarkEnd w:id="10"/>
+    </w:p>
+    <w:p>
+      <w:pPr>
+        <w:rPr>
+          <w:lang w:val="en-US"/>
+        </w:rPr>
+      </w:pPr>
+      <w:r>
+        <w:rPr>
+          <w:lang w:val="en-US"/>
+        </w:rPr>
+        <w:br w:type="page"/>
+      </w:r>
+    </w:p>
+    <w:p>
+      <w:pPr>
+        <w:pStyle w:val="Heading1"/>
+      </w:pPr>
+      <w:bookmarkStart w:id="11" w:name="_Toc227084076"/>
+      <w:r>
+        <w:lastRenderedPageBreak/>
+        <w:t xml:space="preserve">II. </w:t>
+      </w:r>
+      <w:r>
+        <w:t>Structura</w:t>
+      </w:r>
+      <w:bookmarkEnd w:id="11"/>
+    </w:p>
+    <w:p>
+      <w:pPr>
+        <w:pStyle w:val="NoSpacing"/>
+        <w:rPr>
+          <w:lang w:val="ro-RO"/>
+        </w:rPr>
+      </w:pPr>
+      <w:r>
+        <w:tab/>
+        <w:t>Arhitectura unui produs soft este una dintre cele mai importante p</w:t>
+      </w:r>
+      <w:r>
+        <w:rPr>
+          <w:lang w:val="ro-RO"/>
+        </w:rPr>
+        <w:t xml:space="preserve">ărți ale elaborării unei aplicații. Pentru acest proiect am ales o structură App-Core sau Aplicație-Nucleu. În directorul </w:t>
+      </w:r>
+      <w:r>
+        <w:rPr>
+          <w:i/>
+          <w:iCs/>
+          <w:lang w:val="ro-RO"/>
+        </w:rPr>
+        <w:t>Dev</w:t>
+      </w:r>
+      <w:r>
+        <w:rPr>
+          <w:lang w:val="ro-RO"/>
+        </w:rPr>
+        <w:t xml:space="preserve"> </w:t>
+      </w:r>
+      <w:r>
+        <w:rPr>
+          <w:lang w:val="ro-RO"/>
+        </w:rPr>
+        <w:t>se regăsesc 3 subdirectoare</w:t>
+      </w:r>
+      <w:r>
+        <w:rPr>
+          <w:lang w:val="en-GB"/>
+        </w:rPr>
+        <w:t>:</w:t>
+      </w:r>
+      <w:r>
+        <w:rPr>
+          <w:lang w:val="en-US"/>
+        </w:rPr>
+        <w:t xml:space="preserve"> </w:t>
+      </w:r>
+      <w:r>
+        <w:rPr>
+          <w:i/>
+          <w:iCs/>
+          <w:lang w:val="ro-RO"/>
+        </w:rPr>
+        <w:t>App</w:t>
+      </w:r>
+      <w:r>
+        <w:rPr>
+          <w:lang w:val="ro-RO"/>
+        </w:rPr>
+        <w:t xml:space="preserve">, </w:t>
+      </w:r>
+      <w:r>
+        <w:rPr>
+          <w:i/>
+          <w:iCs/>
+          <w:lang w:val="ro-RO"/>
+        </w:rPr>
+        <w:t>Core</w:t>
+      </w:r>
+      <w:r>
+        <w:rPr>
+          <w:lang w:val="ro-RO"/>
+        </w:rPr>
+        <w:t xml:space="preserve"> și </w:t>
+      </w:r>
+      <w:r>
+        <w:rPr>
+          <w:i/>
+          <w:iCs/>
+          <w:lang w:val="ro-RO"/>
+        </w:rPr>
+        <w:t>Dep</w:t>
+      </w:r>
+      <w:r>
+        <w:rPr>
+          <w:lang w:val="ro-RO"/>
+        </w:rPr>
+        <w:t>.</w:t>
+      </w:r>
+    </w:p>
+    <w:p>
+      <w:pPr>
+        <w:pStyle w:val="NoSpacing"/>
+        <w:rPr>
+          <w:lang w:val="ro-RO"/>
+        </w:rPr>
+      </w:pPr>
+      <w:r>
+        <w:rPr>
+          <w:lang w:val="ro-RO"/>
+        </w:rPr>
+        <w:tab/>
+      </w:r>
+      <w:r>
+        <w:rPr>
+          <w:i/>
+          <w:iCs/>
+          <w:lang w:val="ro-RO"/>
+        </w:rPr>
+        <w:t>Core</w:t>
+      </w:r>
+      <w:r>
+        <w:rPr>
+          <w:lang w:val="ro-RO"/>
+        </w:rPr>
+        <w:t xml:space="preserve"> conține funcționalitate ce poate fi reutilizată pentru mai multe proiecte și reprezintă nucleul proiectului. Secțiunea </w:t>
+      </w:r>
+      <w:hyperlink w:anchor="_II.1._Nucleu" w:history="1">
+        <w:r>
+          <w:rPr>
+            <w:rStyle w:val="Hyperlink"/>
+            <w:lang w:val="ro-RO"/>
+          </w:rPr>
+          <w:t xml:space="preserve">II.1. </w:t>
+        </w:r>
+        <w:r>
+          <w:rPr>
+            <w:rStyle w:val="Hyperlink"/>
+            <w:lang w:val="ro-RO"/>
+          </w:rPr>
+          <w:t>N</w:t>
+        </w:r>
+        <w:r>
+          <w:rPr>
+            <w:rStyle w:val="Hyperlink"/>
+            <w:lang w:val="ro-RO"/>
+          </w:rPr>
+          <w:t>ucleu</w:t>
+        </w:r>
+      </w:hyperlink>
+      <w:r>
+        <w:rPr>
+          <w:lang w:val="ro-RO"/>
+        </w:rPr>
+        <w:t xml:space="preserve"> prezintă în amănunt această funcționalitate.</w:t>
+      </w:r>
+    </w:p>
+    <w:p>
+      <w:pPr>
+        <w:pStyle w:val="NoSpacing"/>
+        <w:rPr>
+          <w:lang w:val="ro-RO"/>
+        </w:rPr>
+      </w:pPr>
+      <w:r>
+        <w:rPr>
+          <w:lang w:val="ro-RO"/>
+        </w:rPr>
+        <w:tab/>
+      </w:r>
+      <w:r>
+        <w:rPr>
+          <w:i/>
+          <w:iCs/>
+          <w:lang w:val="ro-RO"/>
+        </w:rPr>
+        <w:t>App</w:t>
+      </w:r>
+      <w:r>
+        <w:rPr>
+          <w:lang w:val="ro-RO"/>
+        </w:rPr>
+        <w:t xml:space="preserve"> conține codul specific pentru această aplicație, acesta se folosește de </w:t>
+      </w:r>
+      <w:r>
+        <w:rPr>
+          <w:i/>
+          <w:iCs/>
+          <w:lang w:val="ro-RO"/>
+        </w:rPr>
+        <w:t>Core</w:t>
+      </w:r>
+      <w:r>
+        <w:rPr>
+          <w:lang w:val="ro-RO"/>
+        </w:rPr>
+        <w:t xml:space="preserve"> pentru a </w:t>
+      </w:r>
+      <w:r>
+        <w:rPr>
+          <w:lang w:val="ro-RO"/>
+        </w:rPr>
+        <w:t>elabora funcționalitatea unică a acestui proiect.</w:t>
+      </w:r>
+      <w:r>
+        <w:rPr>
+          <w:lang w:val="ro-RO"/>
+        </w:rPr>
+        <w:t xml:space="preserve"> Secțiunea </w:t>
+      </w:r>
+      <w:hyperlink w:anchor="_II.2._Aplicație" w:history="1">
+        <w:r>
+          <w:rPr>
+            <w:rStyle w:val="Hyperlink"/>
+            <w:lang w:val="ro-RO"/>
+          </w:rPr>
+          <w:t>II.2. Aplicație</w:t>
+        </w:r>
+      </w:hyperlink>
+      <w:r>
+        <w:rPr>
+          <w:lang w:val="ro-RO"/>
+        </w:rPr>
+        <w:t xml:space="preserve"> prezintă mai multe despre detaliile acestui proiect.</w:t>
+      </w:r>
+    </w:p>
+    <w:p>
+      <w:pPr>
+        <w:pStyle w:val="NoSpacing"/>
+        <w:rPr>
+          <w:lang w:val="ro-RO"/>
+        </w:rPr>
+      </w:pPr>
+      <w:r>
+        <w:rPr>
+          <w:lang w:val="ro-RO"/>
+        </w:rPr>
+        <w:tab/>
+      </w:r>
+      <w:r>
+        <w:rPr>
+          <w:i/>
+          <w:iCs/>
+          <w:lang w:val="ro-RO"/>
+        </w:rPr>
+        <w:t>Dep</w:t>
+      </w:r>
+      <w:r>
+        <w:rPr>
+          <w:lang w:val="ro-RO"/>
+        </w:rPr>
+        <w:t xml:space="preserve"> conține dependențele proiectului</w:t>
+      </w:r>
+      <w:r>
+        <w:rPr>
+          <w:lang w:val="ro-RO"/>
+        </w:rPr>
+        <w:t xml:space="preserve"> descrise în secțiunea </w:t>
+      </w:r>
+      <w:hyperlink w:anchor="_I.3.1._Dependențe" w:history="1">
+        <w:r>
+          <w:rPr>
+            <w:rStyle w:val="Hyperlink"/>
+            <w:lang w:val="ro-RO"/>
+          </w:rPr>
+          <w:t>I.3.1. Depen</w:t>
+        </w:r>
+        <w:r>
+          <w:rPr>
+            <w:rStyle w:val="Hyperlink"/>
+            <w:lang w:val="ro-RO"/>
+          </w:rPr>
+          <w:t>d</w:t>
+        </w:r>
+        <w:r>
+          <w:rPr>
+            <w:rStyle w:val="Hyperlink"/>
+            <w:lang w:val="ro-RO"/>
+          </w:rPr>
+          <w:t>ențe</w:t>
+        </w:r>
+      </w:hyperlink>
+      <w:r>
+        <w:rPr>
+          <w:lang w:val="ro-RO"/>
+        </w:rPr>
+        <w:t xml:space="preserve">, acestea sunt incluse automat în </w:t>
+      </w:r>
+      <w:r>
+        <w:rPr>
+          <w:i/>
+          <w:iCs/>
+          <w:lang w:val="ro-RO"/>
+        </w:rPr>
+        <w:t>Core</w:t>
+      </w:r>
+    </w:p>
+    <w:p>
+      <w:pPr>
+        <w:pStyle w:val="Heading2"/>
+      </w:pPr>
+      <w:bookmarkStart w:id="12" w:name="_II.1._Nucleu"/>
+      <w:bookmarkStart w:id="13" w:name="_Toc227084077"/>
+      <w:bookmarkEnd w:id="12"/>
+      <w:r>
+        <w:t>II.1. Nucleu</w:t>
+      </w:r>
+      <w:bookmarkEnd w:id="13"/>
+    </w:p>
+    <w:p>
+      <w:r>
+        <w:tab/>
+        <w:t>Nucleul prezintă un sistem complex de utilitare și este la rândul lui împățit în 2 secțiuni.</w:t>
+      </w:r>
+    </w:p>
+    <w:p>
+      <w:pPr>
+        <w:pStyle w:val="Heading3"/>
+      </w:pPr>
+      <w:bookmarkStart w:id="14" w:name="_II.1.1._Bază"/>
+      <w:bookmarkEnd w:id="14"/>
+      <w:r>
+        <w:t>II.1.1. Bază</w:t>
+      </w:r>
+    </w:p>
+    <w:p>
+      <w:pPr>
+        <w:rPr>
+          <w:lang w:val="ro-RO"/>
+        </w:rPr>
+      </w:pPr>
+      <w:r>
+        <w:tab/>
+        <w:t xml:space="preserve">Baza este cea mai amplă parte a nucleului și include utilitare esențiale </w:t>
+      </w:r>
+      <w:r>
+        <w:t>pentru un program cu o complexitate crescută. Baza este împărțită în mai multe module cu diferite roluri, acestea sunt</w:t>
+      </w:r>
+      <w:r>
+        <w:rPr>
+          <w:lang w:val="en-GB"/>
+        </w:rPr>
+        <w:t>:</w:t>
+      </w:r>
+      <w:r>
+        <w:rPr>
+          <w:lang w:val="en-US"/>
+        </w:rPr>
+        <w:t xml:space="preserve"> Detectarea platformei, Macrouri ajut</w:t>
+      </w:r>
+      <w:r>
+        <w:rPr>
+          <w:lang w:val="ro-RO"/>
+        </w:rPr>
+        <w:t>ătoare, Logging și Debug, Structuri generice, Structuri matematice, Subprograme paralele, Directoare și fișiere</w:t>
+      </w:r>
+      <w:r>
+        <w:rPr>
+          <w:lang w:val="ro-RO"/>
+        </w:rPr>
+        <w:t>,</w:t>
+      </w:r>
+      <w:r>
+        <w:rPr>
+          <w:lang w:val="ro-RO"/>
+        </w:rPr>
+        <w:t xml:space="preserve"> Serializare Text.</w:t>
+      </w:r>
+    </w:p>
+    <w:p>
+      <w:pPr>
+        <w:pStyle w:val="Subtitle"/>
+        <w:rPr>
+          <w:lang w:val="ro-RO"/>
+        </w:rPr>
+      </w:pPr>
+      <w:r>
+        <w:rPr>
+          <w:lang w:val="ro-RO"/>
+        </w:rPr>
+        <w:t>Detectarea platformei</w:t>
+      </w:r>
+    </w:p>
+    <w:p>
+      <w:pPr>
+        <w:pStyle w:val="NoSpacing"/>
+        <w:rPr>
+          <w:lang w:val="en-US"/>
+        </w:rPr>
+      </w:pPr>
+      <w:r>
+        <w:rPr>
+          <w:lang w:val="ro-RO"/>
+        </w:rPr>
+        <w:tab/>
+      </w:r>
+      <w:r>
+        <w:rPr>
+          <w:lang w:val="ro-RO"/>
+        </w:rPr>
+        <w:t>Modulul de detectare a platformei se folosește de macrouri predefinite pentru a verifica sistemul de operare, compilatorul și versiunea standardului. Aceste informații sunt furnizate către programator prin 3 macrouri</w:t>
+      </w:r>
+      <w:r>
+        <w:rPr>
+          <w:lang w:val="en-GB"/>
+        </w:rPr>
+        <w:t>:</w:t>
+      </w:r>
+    </w:p>
+    <w:p>
+      <w:pPr>
+        <w:pStyle w:val="NoSpacing"/>
+        <w:rPr>
+          <w:lang w:val="en-US"/>
+        </w:rPr>
+      </w:pPr>
+      <w:r>
+        <w:rPr>
+          <w:lang w:val="en-US"/>
+        </w:rPr>
+        <w:tab/>
+      </w:r>
+      <w:bookmarkStart w:id="15" w:name="_MON_1837701118"/>
+      <w:bookmarkEnd w:id="15"/>
+      <w:r>
+        <w:rPr>
+          <w:lang w:val="en-US"/>
+        </w:rPr>
+        <w:object w:dxaOrig="9026" w:dyaOrig="2471" w14:anchorId="5AA9B6B3">
+          <v:shape id="_x0000_i1234" type="#_x0000_t75" style="width:451.4pt;height:123.45pt" o:ole="">
+            <v:imagedata r:id="rId22" o:title=""/>
+            <w10:bordertop type="single" width="4"/>
+            <w10:borderleft type="single" width="4"/>
+            <w10:borderbottom type="single" width="4"/>
+            <w10:borderright type="single" width="4"/>
+          </v:shape>
+          <o:OLEObject Type="Embed" ProgID="Word.OpenDocumentText.12" ShapeID="_x0000_i1234" DrawAspect="Content" ObjectID="_1837712088" r:id="rId23"/>
+        </w:object>
+      </w:r>
+    </w:p>
+    <w:p>
+      <w:pPr>
+        <w:pStyle w:val="NoSpacing"/>
+        <w:rPr>
+          <w:lang w:val="ro-RO"/>
+        </w:rPr>
+      </w:pPr>
+      <w:r>
+        <w:rPr>
+          <w:lang w:val="en-US"/>
+        </w:rPr>
+        <w:tab/>
+      </w:r>
+    </w:p>
+    <w:p>
+      <w:pPr>
+        <w:pStyle w:val="NoSpacing"/>
+        <w:rPr>
+          <w:rFonts w:cs="Times New Roman"/>
+          <w:lang w:val="ro-RO"/>
+        </w:rPr>
+      </w:pPr>
+      <w:r>
+        <w:rPr>
+          <w:lang w:val="ro-RO"/>
+        </w:rPr>
+        <w:tab/>
+        <w:t xml:space="preserve">În cazul în care modulul nu poate detecta una dintre aceste informații, macroul va avea valoarea </w:t>
+      </w:r>
+      <w:r>
+        <w:rPr>
+          <w:rFonts w:ascii="Consolas" w:hAnsi="Consolas"/>
+          <w:lang w:val="ro-RO"/>
+        </w:rPr>
+        <w:t>ENN_UNKNOWN</w:t>
+      </w:r>
+      <w:r>
+        <w:rPr>
+          <w:rFonts w:cs="Times New Roman"/>
+          <w:lang w:val="ro-RO"/>
+        </w:rPr>
+        <w:t xml:space="preserve"> și programul nu se va compila.</w:t>
+      </w:r>
+    </w:p>
+    <w:p>
+      <w:pPr>
+        <w:rPr>
+          <w:rFonts w:cs="Times New Roman"/>
+          <w:lang w:val="ro-RO"/>
+        </w:rPr>
+      </w:pPr>
+      <w:r>
+        <w:rPr>
+          <w:rFonts w:cs="Times New Roman"/>
+          <w:lang w:val="ro-RO"/>
+        </w:rPr>
+        <w:br w:type="page"/>
+      </w:r>
+    </w:p>
+    <w:p>
+      <w:pPr>
+        <w:pStyle w:val="Subtitle"/>
+        <w:spacing w:before="240"/>
+        <w:rPr>
+          <w:lang w:val="ro-RO"/>
+        </w:rPr>
+      </w:pPr>
+      <w:r>
+        <w:rPr>
+          <w:lang w:val="ro-RO"/>
+        </w:rPr>
+        <w:lastRenderedPageBreak/>
+        <w:t>Macrouri ajutătoare</w:t>
+      </w:r>
+    </w:p>
+    <w:p>
+      <w:pPr>
+        <w:pStyle w:val="NoSpacing"/>
+        <w:rPr>
+          <w:lang w:val="ro-RO"/>
+        </w:rPr>
+      </w:pPr>
+      <w:r>
+        <w:rPr>
+          <w:lang w:val="ro-RO"/>
+        </w:rPr>
+        <w:tab/>
+        <w:t xml:space="preserve">Modulul de macrouri ajutătoare definește </w:t>
+      </w:r>
+      <w:r>
+        <w:rPr>
+          <w:lang w:val="ro-RO"/>
+        </w:rPr>
+        <w:t>următoarele</w:t>
+      </w:r>
+    </w:p>
+    <w:p>
+      <w:pPr>
+        <w:pStyle w:val="NoSpacing"/>
+        <w:rPr>
+          <w:lang w:val="ro-RO"/>
+        </w:rPr>
+      </w:pPr>
+    </w:p>
+    <w:bookmarkStart w:id="16" w:name="_MON_1837702103"/>
+    <w:bookmarkEnd w:id="16"/>
+    <w:p>
+      <w:pPr>
+        <w:pStyle w:val="NoSpacing"/>
+        <w:rPr>
+          <w:lang w:val="en-US"/>
+        </w:rPr>
+      </w:pPr>
+      <w:r>
+        <w:rPr>
+          <w:lang w:val="en-US"/>
+        </w:rPr>
+        <w:object w:dxaOrig="9026" w:dyaOrig="806" w14:anchorId="2B6276FB">
+          <v:shape id="_x0000_i1218" type="#_x0000_t75" style="width:451.4pt;height:40.35pt" o:ole="">
+            <v:imagedata r:id="rId24" o:title=""/>
+            <w10:bordertop type="single" width="4"/>
+            <w10:borderleft type="single" width="4"/>
+            <w10:borderbottom type="single" width="4"/>
+            <w10:borderright type="single" width="4"/>
+          </v:shape>
+          <o:OLEObject Type="Embed" ProgID="Word.OpenDocumentText.12" ShapeID="_x0000_i1218" DrawAspect="Content" ObjectID="_1837712089" r:id="rId25"/>
+        </w:object>
+      </w:r>
+    </w:p>
+    <w:p>
+      <w:pPr>
+        <w:pStyle w:val="NoSpacing"/>
+        <w:rPr>
+          <w:lang w:val="en-US"/>
+        </w:rPr>
+      </w:pPr>
+    </w:p>
+    <w:p>
+      <w:pPr>
+        <w:pStyle w:val="NoSpacing"/>
+        <w:rPr>
+          <w:rFonts w:cs="Times New Roman"/>
+          <w:lang w:val="en-US"/>
+        </w:rPr>
+      </w:pPr>
+      <w:r>
+        <w:rPr>
+          <w:lang w:val="en-US"/>
+        </w:rPr>
+        <w:tab/>
+        <w:t xml:space="preserve">Funcțiile cu implementarea publică (codul este vizibil în același fișier) trebuie declarate folosind </w:t>
+      </w:r>
+      <w:r>
+        <w:rPr>
+          <w:rFonts w:ascii="Consolas" w:hAnsi="Consolas"/>
+          <w:lang w:val="en-US"/>
+        </w:rPr>
+        <w:t>ENNDEF_PUBLIC</w:t>
+      </w:r>
+      <w:r>
+        <w:rPr>
+          <w:rFonts w:cs="Times New Roman"/>
+          <w:lang w:val="en-US"/>
+        </w:rPr>
+        <w:t xml:space="preserve">, iar cele cu o implementare privată (codul se află în alt fișier) trebuie declarate folosind </w:t>
+      </w:r>
+      <w:r>
+        <w:rPr>
+          <w:rFonts w:ascii="Consolas" w:hAnsi="Consolas" w:cs="Times New Roman"/>
+          <w:lang w:val="en-US"/>
+        </w:rPr>
+        <w:t>ENNDEF_PRIVATE</w:t>
+      </w:r>
+      <w:r>
+        <w:rPr>
+          <w:rFonts w:cs="Times New Roman"/>
+          <w:lang w:val="en-US"/>
+        </w:rPr>
+        <w:t>.</w:t>
+      </w:r>
+    </w:p>
+    <w:p>
+      <w:pPr>
+        <w:pStyle w:val="NoSpacing"/>
+        <w:rPr>
+          <w:rFonts w:cs="Times New Roman"/>
+          <w:lang w:val="en-US"/>
+        </w:rPr>
+      </w:pPr>
+    </w:p>
+    <w:bookmarkStart w:id="17" w:name="_MON_1837711034"/>
+    <w:bookmarkEnd w:id="17"/>
+    <w:p>
+      <w:pPr>
+        <w:pStyle w:val="NoSpacing"/>
+        <w:rPr>
+          <w:lang w:val="en-US"/>
+        </w:rPr>
+      </w:pPr>
+      <w:r>
+        <w:rPr>
+          <w:lang w:val="en-US"/>
+        </w:rPr>
+        <w:object w:dxaOrig="9026" w:dyaOrig="806" w14:anchorId="1DA88245">
+          <v:shape id="_x0000_i1231" type="#_x0000_t75" style="width:451.4pt;height:40.35pt" o:ole="">
+            <v:imagedata r:id="rId26" o:title=""/>
+            <w10:bordertop type="single" width="4"/>
+            <w10:borderleft type="single" width="4"/>
+            <w10:borderbottom type="single" width="4"/>
+            <w10:borderright type="single" width="4"/>
+          </v:shape>
+          <o:OLEObject Type="Embed" ProgID="Word.OpenDocumentText.12" ShapeID="_x0000_i1231" DrawAspect="Content" ObjectID="_1837712090" r:id="rId27"/>
+        </w:object>
+      </w:r>
+    </w:p>
+    <w:p>
+      <w:pPr>
+        <w:pStyle w:val="NoSpacing"/>
+        <w:rPr>
+          <w:lang w:val="en-US"/>
+        </w:rPr>
+      </w:pPr>
+      <w:r>
+        <w:rPr>
+          <w:lang w:val="en-US"/>
+        </w:rPr>
+        <w:tab/>
+      </w:r>
+    </w:p>
+    <w:p>
+      <w:pPr>
+        <w:pStyle w:val="NoSpacing"/>
+        <w:rPr>
+          <w:rFonts w:cs="Times New Roman"/>
+          <w:lang w:val="ro-RO"/>
+        </w:rPr>
+      </w:pPr>
+      <w:r>
+        <w:rPr>
+          <w:lang w:val="en-US"/>
+        </w:rPr>
+        <w:tab/>
+        <w:t xml:space="preserve">Aceste macrouri îndeplinesc funcții similare cu șirurile de caracter, </w:t>
+      </w:r>
+      <w:r>
+        <w:rPr>
+          <w:rFonts w:ascii="Consolas" w:hAnsi="Consolas"/>
+          <w:lang w:val="en-US"/>
+        </w:rPr>
+        <w:t>TO_STR</w:t>
+      </w:r>
+      <w:r>
+        <w:rPr>
+          <w:rFonts w:cs="Times New Roman"/>
+          <w:lang w:val="en-US"/>
+        </w:rPr>
+        <w:t xml:space="preserve"> transformă orice primește într-un șir de caractere prin a adăuga </w:t>
+      </w:r>
+      <w:r>
+        <w:rPr>
+          <w:rFonts w:cs="Times New Roman"/>
+          <w:lang w:val="en-GB"/>
+        </w:rPr>
+        <w:t xml:space="preserve">“ </w:t>
+      </w:r>
+      <w:r>
+        <w:rPr>
+          <w:rFonts w:cs="Times New Roman"/>
+          <w:lang w:val="ro-RO"/>
+        </w:rPr>
+        <w:t xml:space="preserve">înainte de tokenul primit. </w:t>
+      </w:r>
+      <w:r>
+        <w:rPr>
+          <w:rFonts w:ascii="Consolas" w:hAnsi="Consolas" w:cs="Times New Roman"/>
+          <w:lang w:val="ro-RO"/>
+        </w:rPr>
+        <w:t>JOIN</w:t>
+      </w:r>
+      <w:r>
+        <w:rPr>
+          <w:rFonts w:cs="Times New Roman"/>
+          <w:lang w:val="ro-RO"/>
+        </w:rPr>
+        <w:t xml:space="preserve"> concatenează 2 tokenuri primite, fără a le transforma în șiruri de caractere.</w:t>
+      </w:r>
+    </w:p>
+    <w:p>
+      <w:pPr>
+        <w:pStyle w:val="NoSpacing"/>
+        <w:rPr>
+          <w:lang w:val="en-US"/>
+        </w:rPr>
+      </w:pPr>
+      <w:r>
+        <w:rPr>
+          <w:rFonts w:cs="Times New Roman"/>
+          <w:lang w:val="en-US"/>
+        </w:rPr>
+        <w:tab/>
+      </w:r>
+      <w:bookmarkStart w:id="18" w:name="_MON_1837702436"/>
+      <w:bookmarkEnd w:id="18"/>
+      <w:r>
+        <w:rPr>
+          <w:lang w:val="en-US"/>
+        </w:rPr>
+        <w:object w:dxaOrig="9026" w:dyaOrig="806" w14:anchorId="5FC8E17F">
+          <v:shape id="_x0000_i1220" type="#_x0000_t75" style="width:451.4pt;height:40.35pt" o:ole="">
+            <v:imagedata r:id="rId28" o:title=""/>
+            <w10:bordertop type="single" width="4"/>
+            <w10:borderleft type="single" width="4"/>
+            <w10:borderbottom type="single" width="4"/>
+            <w10:borderright type="single" width="4"/>
+          </v:shape>
+          <o:OLEObject Type="Embed" ProgID="Word.OpenDocumentText.12" ShapeID="_x0000_i1220" DrawAspect="Content" ObjectID="_1837712091" r:id="rId29"/>
+        </w:object>
+      </w:r>
+    </w:p>
+    <w:p>
+      <w:pPr>
+        <w:pStyle w:val="NoSpacing"/>
+        <w:rPr>
+          <w:lang w:val="en-US"/>
+        </w:rPr>
+      </w:pPr>
+    </w:p>
+    <w:p>
+      <w:pPr>
+        <w:pStyle w:val="NoSpacing"/>
+        <w:rPr>
+          <w:rFonts w:cs="Times New Roman"/>
+          <w:lang w:val="ro-RO"/>
+        </w:rPr>
+      </w:pPr>
+      <w:r>
+        <w:rPr>
+          <w:lang w:val="en-US"/>
+        </w:rPr>
+        <w:tab/>
+        <w:t>Aceste macrouri folosesc o proprietate a macrouri</w:t>
+      </w:r>
+      <w:r>
+        <w:rPr>
+          <w:lang w:val="en-US"/>
+        </w:rPr>
+        <w:t>lor</w:t>
+      </w:r>
+      <w:r>
+        <w:rPr>
+          <w:lang w:val="en-US"/>
+        </w:rPr>
+        <w:t xml:space="preserve"> cu un număr variabil de argument</w:t>
+      </w:r>
+      <w:r>
+        <w:rPr>
+          <w:lang w:val="en-US"/>
+        </w:rPr>
+        <w:t>e</w:t>
+      </w:r>
+      <w:r>
+        <w:rPr>
+          <w:lang w:val="en-US"/>
+        </w:rPr>
+        <w:t xml:space="preserve"> pentru a detecta numărul de argumente cu care este apelat macroul. </w:t>
+      </w:r>
+      <w:r>
+        <w:rPr>
+          <w:rFonts w:ascii="Consolas" w:hAnsi="Consolas"/>
+          <w:lang w:val="en-US"/>
+        </w:rPr>
+        <w:t>GET_NUM_ARGS</w:t>
+      </w:r>
+      <w:r>
+        <w:rPr>
+          <w:lang w:val="en-US"/>
+        </w:rPr>
+        <w:t xml:space="preserve"> acceptă un număr variabil de argumente (</w:t>
+      </w:r>
+      <w:r>
+        <w:rPr>
+          <w:lang w:val="en-US"/>
+        </w:rPr>
+        <w:t xml:space="preserve">0 </w:t>
+      </w:r>
+      <w:r>
+        <w:rPr>
+          <w:rFonts w:cs="Times New Roman"/>
+          <w:lang w:val="en-US"/>
+        </w:rPr>
+        <w:t>≤</w:t>
+      </w:r>
+      <w:r>
+        <w:rPr>
+          <w:lang w:val="en-US"/>
+        </w:rPr>
+        <w:t xml:space="preserve"> N </w:t>
+      </w:r>
+      <w:r>
+        <w:rPr>
+          <w:rFonts w:cs="Times New Roman"/>
+          <w:lang w:val="en-US"/>
+        </w:rPr>
+        <w:t>≤</w:t>
+      </w:r>
+      <w:r>
+        <w:rPr>
+          <w:lang w:val="en-US"/>
+        </w:rPr>
+        <w:t xml:space="preserve"> 63) </w:t>
+      </w:r>
+      <w:r>
+        <w:rPr>
+          <w:lang w:val="ro-RO"/>
+        </w:rPr>
+        <w:t>și înlocuiește apelul său cu numărul de argumente.</w:t>
+      </w:r>
+      <w:r>
+        <w:rPr>
+          <w:lang w:val="en-GB"/>
+        </w:rPr>
+        <w:t xml:space="preserve"> </w:t>
+      </w:r>
+      <w:r>
+        <w:rPr>
+          <w:lang w:val="ro-RO"/>
+        </w:rPr>
+        <w:t xml:space="preserve">În mod similar </w:t>
+      </w:r>
+      <w:r>
+        <w:rPr>
+          <w:rFonts w:ascii="Consolas" w:hAnsi="Consolas"/>
+          <w:lang w:val="ro-RO"/>
+        </w:rPr>
+        <w:t>HAS_ONE_ARG</w:t>
+      </w:r>
+      <w:r>
+        <w:rPr>
+          <w:rFonts w:cs="Times New Roman"/>
+          <w:lang w:val="ro-RO"/>
+        </w:rPr>
+        <w:t>, înlocuiește apelul său cu 1 sau 0 dacă este apelat cu un singur argument.</w:t>
+      </w:r>
+    </w:p>
+    <w:p>
+      <w:pPr>
+        <w:pStyle w:val="NoSpacing"/>
+        <w:rPr>
+          <w:rFonts w:cs="Times New Roman"/>
+          <w:lang w:val="ro-RO"/>
+        </w:rPr>
+      </w:pPr>
+    </w:p>
+    <w:bookmarkStart w:id="19" w:name="_MON_1837703470"/>
+    <w:bookmarkEnd w:id="19"/>
+    <w:p>
+      <w:pPr>
+        <w:pStyle w:val="NoSpacing"/>
+        <w:rPr>
+          <w:lang w:val="en-US"/>
+        </w:rPr>
+      </w:pPr>
+      <w:r>
+        <w:rPr>
+          <w:lang w:val="en-US"/>
+        </w:rPr>
+        <w:object w:dxaOrig="9026" w:dyaOrig="1686" w14:anchorId="51B97F7C">
+          <v:shape id="_x0000_i1228" type="#_x0000_t75" style="width:451.4pt;height:84.25pt" o:ole="">
+            <v:imagedata r:id="rId30" o:title=""/>
+            <w10:bordertop type="single" width="4"/>
+            <w10:borderleft type="single" width="4"/>
+            <w10:borderbottom type="single" width="4"/>
+            <w10:borderright type="single" width="4"/>
+          </v:shape>
+          <o:OLEObject Type="Embed" ProgID="Word.OpenDocumentText.12" ShapeID="_x0000_i1228" DrawAspect="Content" ObjectID="_1837712092" r:id="rId31"/>
+        </w:object>
+      </w:r>
+    </w:p>
+    <w:p>
+      <w:pPr>
+        <w:rPr>
+          <w:lang w:val="en-US"/>
+        </w:rPr>
+      </w:pPr>
+      <w:r>
+        <w:rPr>
+          <w:lang w:val="en-US"/>
+        </w:rPr>
+        <w:br w:type="page"/>
+      </w:r>
+    </w:p>
+    <w:p>
+      <w:pPr>
+        <w:pStyle w:val="Subtitle"/>
+        <w:spacing w:before="240"/>
+        <w:rPr>
+          <w:lang w:val="ro-RO"/>
+        </w:rPr>
+      </w:pPr>
+      <w:r>
+        <w:rPr>
+          <w:lang w:val="en-GB"/>
+        </w:rPr>
+        <w:lastRenderedPageBreak/>
+        <w:t xml:space="preserve">Logging </w:t>
+      </w:r>
+      <w:r>
+        <w:rPr>
+          <w:lang w:val="ro-RO"/>
+        </w:rPr>
+        <w:t>și Debug</w:t>
+      </w:r>
+    </w:p>
+    <w:p>
+      <w:pPr>
+        <w:pStyle w:val="NoSpacing"/>
+        <w:rPr>
+          <w:lang w:val="ro-RO"/>
+        </w:rPr>
+      </w:pPr>
+      <w:r>
+        <w:rPr>
+          <w:lang w:val="ro-RO"/>
+        </w:rPr>
+        <w:tab/>
+      </w:r>
+    </w:p>
+    <w:p>
+      <w:r>
+        <w:t>II.1.2. Opțional</w:t>
+      </w:r>
+    </w:p>
+    <w:p>
+      <w:pPr>
+        <w:pStyle w:val="Heading2"/>
+      </w:pPr>
+      <w:bookmarkStart w:id="20" w:name="_Toc227084078"/>
+      <w:bookmarkStart w:id="21" w:name="_II.2._Aplicație"/>
+      <w:bookmarkEnd w:id="21"/>
+      <w:r>
+        <w:t>II.2. Aplicație</w:t>
+      </w:r>
+      <w:bookmarkEnd w:id="20"/>
+    </w:p>
+    <w:p>
+      <w:pPr>
+        <w:pStyle w:val="Heading1"/>
+      </w:pPr>
+      <w:bookmarkStart w:id="22" w:name="_Toc227084079"/>
+      <w:r>
+        <w:t>III. Detalii tehnice</w:t>
+      </w:r>
+      <w:bookmarkEnd w:id="22"/>
+    </w:p>
+    <w:p/>
     <w:sectPr>
-      <w:footerReference w:type="first" r:id="rId12"/>
+      <w:footerReference w:type="first" r:id="rId32"/>
       <w:pgSz w:w="11906" w:h="16838"/>
       <w:pgMar w:top="1440" w:right="1440" w:bottom="1440" w:left="1440" w:header="709" w:footer="708" w:gutter="0"/>
       <w:pgNumType w:start="3"/>
       <w:cols w:space="708"/>
-      <w:titlePg/>
       <w:docGrid w:linePitch="360"/>
     </w:sectPr>
   </w:body>
@@ -555,36 +3438,53 @@
 
 <file path=word/footer1.xml><?xml version="1.0" encoding="utf-8"?>
 <w:ftr xmlns:wpc="http://schemas.microsoft.com/office/word/2010/wordprocessingCanvas" xmlns:cx="http://schemas.microsoft.com/office/drawing/2014/chartex" xmlns:cx1="http://schemas.microsoft.com/office/drawing/2015/9/8/chartex" xmlns:cx2="http://schemas.microsoft.com/office/drawing/2015/10/21/chartex" xmlns:cx3="http://schemas.microsoft.com/office/drawing/2016/5/9/chartex" xmlns:cx4="http://schemas.microsoft.com/office/drawing/2016/5/10/chartex" xmlns:cx5="http://schemas.microsoft.com/office/drawing/2016/5/11/chartex" xmlns:cx6="http://schemas.microsoft.com/office/drawing/2016/5/12/chartex" xmlns:cx7="http://schemas.microsoft.com/office/drawing/2016/5/13/chartex" xmlns:cx8="http://schemas.microsoft.com/office/drawing/2016/5/14/chartex" xmlns:mc="http://schemas.openxmlformats.org/markup-compatibility/2006" xmlns:aink="http://schemas.microsoft.com/office/drawing/2016/ink" xmlns:am3d="http://schemas.microsoft.com/office/drawing/2017/model3d" xmlns:o="urn:schemas-microsoft-com:office:office" xmlns:oel="http://schemas.microsoft.com/office/2019/extlst" xmlns:r="http://schemas.openxmlformats.org/officeDocument/2006/relationships" xmlns:m="http://schemas.openxmlformats.org/officeDocument/2006/math" xmlns:v="urn:schemas-microsoft-com:vml" xmlns:wp14="http://schemas.microsoft.com/office/word/2010/wordprocessingDrawing" xmlns:wp="http://schemas.openxmlformats.org/drawingml/2006/wordprocessingDrawing" xmlns:w10="urn:schemas-microsoft-com:office:word" xmlns:w="http://schemas.openxmlformats.org/wordprocessingml/2006/main" xmlns:w14="http://schemas.microsoft.com/office/word/2010/wordml" xmlns:w15="http://schemas.microsoft.com/office/word/2012/wordml" xmlns:w16cex="http://schemas.microsoft.com/office/word/2018/wordml/cex" xmlns:w16cid="http://schemas.microsoft.com/office/word/2016/wordml/cid" xmlns:w16="http://schemas.microsoft.com/office/word/2018/wordml" xmlns:w16du="http://schemas.microsoft.com/office/word/2023/wordml/word16du" xmlns:w16sdtdh="http://schemas.microsoft.com/office/word/2020/wordml/sdtdatahash" xmlns:w16sdtfl="http://schemas.microsoft.com/office/word/2024/wordml/sdtformatlock" xmlns:w16se="http://schemas.microsoft.com/office/word/2015/wordml/symex" xmlns:wpg="http://schemas.microsoft.com/office/word/2010/wordprocessingGroup" xmlns:wpi="http://schemas.microsoft.com/office/word/2010/wordprocessingInk" xmlns:wne="http://schemas.microsoft.com/office/word/2006/wordml" xmlns:wps="http://schemas.microsoft.com/office/word/2010/wordprocessingShape" mc:Ignorable="w14 w15 w16se w16cid w16 w16cex w16sdtdh w16sdtfl w16du wp14">
-  <w:p>
-    <w:pPr>
-      <w:pStyle w:val="Footer"/>
-      <w:jc w:val="center"/>
-    </w:pPr>
-  </w:p>
-  <w:p>
-    <w:pPr>
-      <w:pStyle w:val="Footer"/>
-    </w:pPr>
-  </w:p>
+  <w:sdt>
+    <w:sdtPr>
+      <w:id w:val="1649091342"/>
+      <w:docPartObj>
+        <w:docPartGallery w:val="Page Numbers (Bottom of Page)"/>
+        <w:docPartUnique/>
+      </w:docPartObj>
+    </w:sdtPr>
+    <w:sdtEndPr>
+      <w:rPr>
+        <w:noProof/>
+      </w:rPr>
+    </w:sdtEndPr>
+    <w:sdtContent>
+      <w:p>
+        <w:pPr>
+          <w:pStyle w:val="Footer"/>
+          <w:jc w:val="center"/>
+        </w:pPr>
+        <w:r>
+          <w:fldChar w:fldCharType="begin"/>
+        </w:r>
+        <w:r>
+          <w:instrText xml:space="preserve"> PAGE   \* MERGEFORMAT </w:instrText>
+        </w:r>
+        <w:r>
+          <w:fldChar w:fldCharType="separate"/>
+        </w:r>
+        <w:r>
+          <w:rPr>
+            <w:noProof/>
+          </w:rPr>
+          <w:t>2</w:t>
+        </w:r>
+        <w:r>
+          <w:rPr>
+            <w:noProof/>
+          </w:rPr>
+          <w:fldChar w:fldCharType="end"/>
+        </w:r>
+      </w:p>
+    </w:sdtContent>
+  </w:sdt>
 </w:ftr>
 </file>
 
 <file path=word/footer2.xml><?xml version="1.0" encoding="utf-8"?>
-<w:ftr xmlns:wpc="http://schemas.microsoft.com/office/word/2010/wordprocessingCanvas" xmlns:cx="http://schemas.microsoft.com/office/drawing/2014/chartex" xmlns:cx1="http://schemas.microsoft.com/office/drawing/2015/9/8/chartex" xmlns:cx2="http://schemas.microsoft.com/office/drawing/2015/10/21/chartex" xmlns:cx3="http://schemas.microsoft.com/office/drawing/2016/5/9/chartex" xmlns:cx4="http://schemas.microsoft.com/office/drawing/2016/5/10/chartex" xmlns:cx5="http://schemas.microsoft.com/office/drawing/2016/5/11/chartex" xmlns:cx6="http://schemas.microsoft.com/office/drawing/2016/5/12/chartex" xmlns:cx7="http://schemas.microsoft.com/office/drawing/2016/5/13/chartex" xmlns:cx8="http://schemas.microsoft.com/office/drawing/2016/5/14/chartex" xmlns:mc="http://schemas.openxmlformats.org/markup-compatibility/2006" xmlns:aink="http://schemas.microsoft.com/office/drawing/2016/ink" xmlns:am3d="http://schemas.microsoft.com/office/drawing/2017/model3d" xmlns:o="urn:schemas-microsoft-com:office:office" xmlns:oel="http://schemas.microsoft.com/office/2019/extlst" xmlns:r="http://schemas.openxmlformats.org/officeDocument/2006/relationships" xmlns:m="http://schemas.openxmlformats.org/officeDocument/2006/math" xmlns:v="urn:schemas-microsoft-com:vml" xmlns:wp14="http://schemas.microsoft.com/office/word/2010/wordprocessingDrawing" xmlns:wp="http://schemas.openxmlformats.org/drawingml/2006/wordprocessingDrawing" xmlns:w10="urn:schemas-microsoft-com:office:word" xmlns:w="http://schemas.openxmlformats.org/wordprocessingml/2006/main" xmlns:w14="http://schemas.microsoft.com/office/word/2010/wordml" xmlns:w15="http://schemas.microsoft.com/office/word/2012/wordml" xmlns:w16cex="http://schemas.microsoft.com/office/word/2018/wordml/cex" xmlns:w16cid="http://schemas.microsoft.com/office/word/2016/wordml/cid" xmlns:w16="http://schemas.microsoft.com/office/word/2018/wordml" xmlns:w16du="http://schemas.microsoft.com/office/word/2023/wordml/word16du" xmlns:w16sdtdh="http://schemas.microsoft.com/office/word/2020/wordml/sdtdatahash" xmlns:w16sdtfl="http://schemas.microsoft.com/office/word/2024/wordml/sdtformatlock" xmlns:w16se="http://schemas.microsoft.com/office/word/2015/wordml/symex" xmlns:wpg="http://schemas.microsoft.com/office/word/2010/wordprocessingGroup" xmlns:wpi="http://schemas.microsoft.com/office/word/2010/wordprocessingInk" xmlns:wne="http://schemas.microsoft.com/office/word/2006/wordml" xmlns:wps="http://schemas.microsoft.com/office/word/2010/wordprocessingShape" mc:Ignorable="w14 w15 w16se w16cid w16 w16cex w16sdtdh w16sdtfl w16du wp14">
-  <w:p>
-    <w:pPr>
-      <w:pStyle w:val="Footer"/>
-      <w:tabs>
-        <w:tab w:val="clear" w:pos="4513"/>
-        <w:tab w:val="clear" w:pos="9026"/>
-        <w:tab w:val="left" w:pos="1161"/>
-      </w:tabs>
-    </w:pPr>
-  </w:p>
-</w:ftr>
-</file>
-
-<file path=word/footer3.xml><?xml version="1.0" encoding="utf-8"?>
 <w:ftr xmlns:wpc="http://schemas.microsoft.com/office/word/2010/wordprocessingCanvas" xmlns:cx="http://schemas.microsoft.com/office/drawing/2014/chartex" xmlns:cx1="http://schemas.microsoft.com/office/drawing/2015/9/8/chartex" xmlns:cx2="http://schemas.microsoft.com/office/drawing/2015/10/21/chartex" xmlns:cx3="http://schemas.microsoft.com/office/drawing/2016/5/9/chartex" xmlns:cx4="http://schemas.microsoft.com/office/drawing/2016/5/10/chartex" xmlns:cx5="http://schemas.microsoft.com/office/drawing/2016/5/11/chartex" xmlns:cx6="http://schemas.microsoft.com/office/drawing/2016/5/12/chartex" xmlns:cx7="http://schemas.microsoft.com/office/drawing/2016/5/13/chartex" xmlns:cx8="http://schemas.microsoft.com/office/drawing/2016/5/14/chartex" xmlns:mc="http://schemas.openxmlformats.org/markup-compatibility/2006" xmlns:aink="http://schemas.microsoft.com/office/drawing/2016/ink" xmlns:am3d="http://schemas.microsoft.com/office/drawing/2017/model3d" xmlns:o="urn:schemas-microsoft-com:office:office" xmlns:oel="http://schemas.microsoft.com/office/2019/extlst" xmlns:r="http://schemas.openxmlformats.org/officeDocument/2006/relationships" xmlns:m="http://schemas.openxmlformats.org/officeDocument/2006/math" xmlns:v="urn:schemas-microsoft-com:vml" xmlns:wp14="http://schemas.microsoft.com/office/word/2010/wordprocessingDrawing" xmlns:wp="http://schemas.openxmlformats.org/drawingml/2006/wordprocessingDrawing" xmlns:w10="urn:schemas-microsoft-com:office:word" xmlns:w="http://schemas.openxmlformats.org/wordprocessingml/2006/main" xmlns:w14="http://schemas.microsoft.com/office/word/2010/wordml" xmlns:w15="http://schemas.microsoft.com/office/word/2012/wordml" xmlns:w16cex="http://schemas.microsoft.com/office/word/2018/wordml/cex" xmlns:w16cid="http://schemas.microsoft.com/office/word/2016/wordml/cid" xmlns:w16="http://schemas.microsoft.com/office/word/2018/wordml" xmlns:w16du="http://schemas.microsoft.com/office/word/2023/wordml/word16du" xmlns:w16sdtdh="http://schemas.microsoft.com/office/word/2020/wordml/sdtdatahash" xmlns:w16sdtfl="http://schemas.microsoft.com/office/word/2024/wordml/sdtformatlock" xmlns:w16se="http://schemas.microsoft.com/office/word/2015/wordml/symex" xmlns:wpg="http://schemas.microsoft.com/office/word/2010/wordprocessingGroup" xmlns:wpi="http://schemas.microsoft.com/office/word/2010/wordprocessingInk" xmlns:wne="http://schemas.microsoft.com/office/word/2006/wordml" xmlns:wps="http://schemas.microsoft.com/office/word/2010/wordprocessingShape" mc:Ignorable="w14 w15 w16se w16cid w16 w16cex w16sdtdh w16sdtfl w16du wp14">
   <w:sdt>
     <w:sdtPr>
@@ -659,80 +3559,213 @@
       </w:r>
     </w:p>
   </w:footnote>
+  <w:footnote w:id="1">
+    <w:p>
+      <w:pPr>
+        <w:pStyle w:val="FootnoteText"/>
+        <w:rPr>
+          <w:lang w:val="ro-RO"/>
+        </w:rPr>
+      </w:pPr>
+      <w:r>
+        <w:rPr>
+          <w:rStyle w:val="FootnoteReference"/>
+        </w:rPr>
+        <w:footnoteRef/>
+      </w:r>
+      <w:r>
+        <w:t xml:space="preserve"> </w:t>
+      </w:r>
+      <w:r>
+        <w:rPr>
+          <w:lang w:val="ro-RO"/>
+        </w:rPr>
+        <w:t>Black Box Effect = sistem abstract ce poate fi observat doar prin datele de intrare și ieșire, comportamentul intern nu este cunoscut de către utilizator</w:t>
+      </w:r>
+    </w:p>
+  </w:footnote>
+  <w:footnote w:id="2">
+    <w:p>
+      <w:pPr>
+        <w:pStyle w:val="FootnoteText"/>
+        <w:rPr>
+          <w:lang w:val="ro-RO"/>
+        </w:rPr>
+      </w:pPr>
+      <w:r>
+        <w:rPr>
+          <w:rStyle w:val="FootnoteReference"/>
+        </w:rPr>
+        <w:footnoteRef/>
+      </w:r>
+      <w:r>
+        <w:t xml:space="preserve"> </w:t>
+      </w:r>
+      <w:r>
+        <w:rPr>
+          <w:lang w:val="ro-RO"/>
+        </w:rPr>
+        <w:t>În secțiunea</w:t>
+      </w:r>
+      <w:r>
+        <w:rPr>
+          <w:lang w:val="ro-RO"/>
+        </w:rPr>
+        <w:t xml:space="preserve"> </w:t>
+      </w:r>
+      <w:hyperlink w:anchor="_II.1.1._Bază" w:history="1">
+        <w:r>
+          <w:rPr>
+            <w:rStyle w:val="Hyperlink"/>
+            <w:lang w:val="ro-RO"/>
+          </w:rPr>
+          <w:t>II.1.1. Bază</w:t>
+        </w:r>
+      </w:hyperlink>
+      <w:r>
+        <w:rPr>
+          <w:lang w:val="ro-RO"/>
+        </w:rPr>
+        <w:t xml:space="preserve"> </w:t>
+      </w:r>
+      <w:r>
+        <w:rPr>
+          <w:lang w:val="ro-RO"/>
+        </w:rPr>
+        <w:t>vom folosi o extensie a compilatorului</w:t>
+      </w:r>
+      <w:r>
+        <w:rPr>
+          <w:lang w:val="ro-RO"/>
+        </w:rPr>
+        <w:t xml:space="preserve"> GCC</w:t>
+      </w:r>
+      <w:r>
+        <w:rPr>
+          <w:lang w:val="ro-RO"/>
+        </w:rPr>
+        <w:t xml:space="preserve"> ce nu este prezentă în standardul C99</w:t>
+      </w:r>
+      <w:r>
+        <w:rPr>
+          <w:lang w:val="ro-RO"/>
+        </w:rPr>
+        <w:t xml:space="preserve"> </w:t>
+      </w:r>
+    </w:p>
+  </w:footnote>
+  <w:footnote w:id="3">
+    <w:p>
+      <w:pPr>
+        <w:pStyle w:val="FootnoteText"/>
+        <w:rPr>
+          <w:lang w:val="ro-RO"/>
+        </w:rPr>
+      </w:pPr>
+      <w:r>
+        <w:rPr>
+          <w:rStyle w:val="FootnoteReference"/>
+        </w:rPr>
+        <w:footnoteRef/>
+      </w:r>
+      <w:r>
+        <w:t xml:space="preserve"> </w:t>
+      </w:r>
+      <w:r>
+        <w:rPr>
+          <w:lang w:val="ro-RO"/>
+        </w:rPr>
+        <w:t>Open-Source = model de elaborare a produselor soft ce se bazează pe publicarea implementării</w:t>
+      </w:r>
+      <w:r>
+        <w:rPr>
+          <w:lang w:val="ro-RO"/>
+        </w:rPr>
+        <w:t xml:space="preserve"> proiectului</w:t>
+      </w:r>
+    </w:p>
+  </w:footnote>
+  <w:footnote w:id="4">
+    <w:p>
+      <w:pPr>
+        <w:pStyle w:val="FootnoteText"/>
+        <w:rPr>
+          <w:lang w:val="ro-RO"/>
+        </w:rPr>
+      </w:pPr>
+      <w:r>
+        <w:rPr>
+          <w:rStyle w:val="FootnoteReference"/>
+        </w:rPr>
+        <w:footnoteRef/>
+      </w:r>
+      <w:r>
+        <w:t xml:space="preserve"> </w:t>
+      </w:r>
+      <w:r>
+        <w:rPr>
+          <w:lang w:val="ro-RO"/>
+        </w:rPr>
+        <w:t xml:space="preserve">API (Application Programming Interface) = interfață </w:t>
+      </w:r>
+      <w:r>
+        <w:rPr>
+          <w:lang w:val="ro-RO"/>
+        </w:rPr>
+        <w:t>ce permite</w:t>
+      </w:r>
+      <w:r>
+        <w:rPr>
+          <w:lang w:val="ro-RO"/>
+        </w:rPr>
+        <w:t xml:space="preserve"> comunicarea între programe</w:t>
+      </w:r>
+      <w:r>
+        <w:rPr>
+          <w:lang w:val="ro-RO"/>
+        </w:rPr>
+        <w:t>, utilizată</w:t>
+      </w:r>
+      <w:r>
+        <w:rPr>
+          <w:lang w:val="ro-RO"/>
+        </w:rPr>
+        <w:t xml:space="preserve"> </w:t>
+      </w:r>
+      <w:r>
+        <w:rPr>
+          <w:lang w:val="ro-RO"/>
+        </w:rPr>
+        <w:t>când implementarea unui program nu este publică, dar oferă funcționalitate pentru a interacționa cu acesta</w:t>
+      </w:r>
+    </w:p>
+  </w:footnote>
+  <w:footnote w:id="5">
+    <w:p>
+      <w:pPr>
+        <w:pStyle w:val="FootnoteText"/>
+        <w:rPr>
+          <w:lang w:val="ro-RO"/>
+        </w:rPr>
+      </w:pPr>
+      <w:r>
+        <w:rPr>
+          <w:rStyle w:val="FootnoteReference"/>
+        </w:rPr>
+        <w:footnoteRef/>
+      </w:r>
+      <w:r>
+        <w:t xml:space="preserve"> </w:t>
+      </w:r>
+      <w:r>
+        <w:rPr>
+          <w:lang w:val="ro-RO"/>
+        </w:rPr>
+        <w:t>Driver = program ce acționează drept interfață între o componentă hardware și una software</w:t>
+      </w:r>
+    </w:p>
+  </w:footnote>
 </w:footnotes>
-</file>
-
-<file path=word/header1.xml><?xml version="1.0" encoding="utf-8"?>
-<w:hdr xmlns:wpc="http://schemas.microsoft.com/office/word/2010/wordprocessingCanvas" xmlns:cx="http://schemas.microsoft.com/office/drawing/2014/chartex" xmlns:cx1="http://schemas.microsoft.com/office/drawing/2015/9/8/chartex" xmlns:cx2="http://schemas.microsoft.com/office/drawing/2015/10/21/chartex" xmlns:cx3="http://schemas.microsoft.com/office/drawing/2016/5/9/chartex" xmlns:cx4="http://schemas.microsoft.com/office/drawing/2016/5/10/chartex" xmlns:cx5="http://schemas.microsoft.com/office/drawing/2016/5/11/chartex" xmlns:cx6="http://schemas.microsoft.com/office/drawing/2016/5/12/chartex" xmlns:cx7="http://schemas.microsoft.com/office/drawing/2016/5/13/chartex" xmlns:cx8="http://schemas.microsoft.com/office/drawing/2016/5/14/chartex" xmlns:mc="http://schemas.openxmlformats.org/markup-compatibility/2006" xmlns:aink="http://schemas.microsoft.com/office/drawing/2016/ink" xmlns:am3d="http://schemas.microsoft.com/office/drawing/2017/model3d" xmlns:o="urn:schemas-microsoft-com:office:office" xmlns:oel="http://schemas.microsoft.com/office/2019/extlst" xmlns:r="http://schemas.openxmlformats.org/officeDocument/2006/relationships" xmlns:m="http://schemas.openxmlformats.org/officeDocument/2006/math" xmlns:v="urn:schemas-microsoft-com:vml" xmlns:wp14="http://schemas.microsoft.com/office/word/2010/wordprocessingDrawing" xmlns:wp="http://schemas.openxmlformats.org/drawingml/2006/wordprocessingDrawing" xmlns:w10="urn:schemas-microsoft-com:office:word" xmlns:w="http://schemas.openxmlformats.org/wordprocessingml/2006/main" xmlns:w14="http://schemas.microsoft.com/office/word/2010/wordml" xmlns:w15="http://schemas.microsoft.com/office/word/2012/wordml" xmlns:w16cex="http://schemas.microsoft.com/office/word/2018/wordml/cex" xmlns:w16cid="http://schemas.microsoft.com/office/word/2016/wordml/cid" xmlns:w16="http://schemas.microsoft.com/office/word/2018/wordml" xmlns:w16du="http://schemas.microsoft.com/office/word/2023/wordml/word16du" xmlns:w16sdtdh="http://schemas.microsoft.com/office/word/2020/wordml/sdtdatahash" xmlns:w16sdtfl="http://schemas.microsoft.com/office/word/2024/wordml/sdtformatlock" xmlns:w16se="http://schemas.microsoft.com/office/word/2015/wordml/symex" xmlns:wpg="http://schemas.microsoft.com/office/word/2010/wordprocessingGroup" xmlns:wpi="http://schemas.microsoft.com/office/word/2010/wordprocessingInk" xmlns:wne="http://schemas.microsoft.com/office/word/2006/wordml" xmlns:wps="http://schemas.microsoft.com/office/word/2010/wordprocessingShape" mc:Ignorable="w14 w15 w16se w16cid w16 w16cex w16sdtdh w16sdtfl w16du wp14">
-  <w:p>
-    <w:pPr>
-      <w:pStyle w:val="Header"/>
-    </w:pPr>
-    <w:r>
-      <w:rPr>
-        <w:noProof/>
-      </w:rPr>
-      <w:drawing>
-        <wp:inline distT="0" distB="0" distL="0" distR="0" wp14:anchorId="638F3362" wp14:editId="07B31ADC">
-          <wp:extent cx="1743814" cy="863600"/>
-          <wp:effectExtent l="0" t="0" r="8890" b="0"/>
-          <wp:docPr id="1875251720" name="Picture 1"/>
-          <wp:cNvGraphicFramePr>
-            <a:graphicFrameLocks xmlns:a="http://schemas.openxmlformats.org/drawingml/2006/main" noChangeAspect="1"/>
-          </wp:cNvGraphicFramePr>
-          <a:graphic xmlns:a="http://schemas.openxmlformats.org/drawingml/2006/main">
-            <a:graphicData uri="http://schemas.openxmlformats.org/drawingml/2006/picture">
-              <pic:pic xmlns:pic="http://schemas.openxmlformats.org/drawingml/2006/picture">
-                <pic:nvPicPr>
-                  <pic:cNvPr id="0" name="Picture 1"/>
-                  <pic:cNvPicPr>
-                    <a:picLocks noChangeAspect="1" noChangeArrowheads="1"/>
-                  </pic:cNvPicPr>
-                </pic:nvPicPr>
-                <pic:blipFill>
-                  <a:blip r:embed="rId1">
-                    <a:extLst>
-                      <a:ext uri="{28A0092B-C50C-407E-A947-70E740481C1C}">
-                        <a14:useLocalDpi xmlns:a14="http://schemas.microsoft.com/office/drawing/2010/main" val="0"/>
-                      </a:ext>
-                    </a:extLst>
-                  </a:blip>
-                  <a:srcRect/>
-                  <a:stretch>
-                    <a:fillRect/>
-                  </a:stretch>
-                </pic:blipFill>
-                <pic:spPr bwMode="auto">
-                  <a:xfrm>
-                    <a:off x="0" y="0"/>
-                    <a:ext cx="1765411" cy="874296"/>
-                  </a:xfrm>
-                  <a:prstGeom prst="rect">
-                    <a:avLst/>
-                  </a:prstGeom>
-                  <a:noFill/>
-                  <a:ln>
-                    <a:noFill/>
-                  </a:ln>
-                </pic:spPr>
-              </pic:pic>
-            </a:graphicData>
-          </a:graphic>
-        </wp:inline>
-      </w:drawing>
-    </w:r>
-  </w:p>
-</w:hdr>
-</file>
-
-<file path=word/header2.xml><?xml version="1.0" encoding="utf-8"?>
-<w:hdr xmlns:wpc="http://schemas.microsoft.com/office/word/2010/wordprocessingCanvas" xmlns:cx="http://schemas.microsoft.com/office/drawing/2014/chartex" xmlns:cx1="http://schemas.microsoft.com/office/drawing/2015/9/8/chartex" xmlns:cx2="http://schemas.microsoft.com/office/drawing/2015/10/21/chartex" xmlns:cx3="http://schemas.microsoft.com/office/drawing/2016/5/9/chartex" xmlns:cx4="http://schemas.microsoft.com/office/drawing/2016/5/10/chartex" xmlns:cx5="http://schemas.microsoft.com/office/drawing/2016/5/11/chartex" xmlns:cx6="http://schemas.microsoft.com/office/drawing/2016/5/12/chartex" xmlns:cx7="http://schemas.microsoft.com/office/drawing/2016/5/13/chartex" xmlns:cx8="http://schemas.microsoft.com/office/drawing/2016/5/14/chartex" xmlns:mc="http://schemas.openxmlformats.org/markup-compatibility/2006" xmlns:aink="http://schemas.microsoft.com/office/drawing/2016/ink" xmlns:am3d="http://schemas.microsoft.com/office/drawing/2017/model3d" xmlns:o="urn:schemas-microsoft-com:office:office" xmlns:oel="http://schemas.microsoft.com/office/2019/extlst" xmlns:r="http://schemas.openxmlformats.org/officeDocument/2006/relationships" xmlns:m="http://schemas.openxmlformats.org/officeDocument/2006/math" xmlns:v="urn:schemas-microsoft-com:vml" xmlns:wp14="http://schemas.microsoft.com/office/word/2010/wordprocessingDrawing" xmlns:wp="http://schemas.openxmlformats.org/drawingml/2006/wordprocessingDrawing" xmlns:w10="urn:schemas-microsoft-com:office:word" xmlns:w="http://schemas.openxmlformats.org/wordprocessingml/2006/main" xmlns:w14="http://schemas.microsoft.com/office/word/2010/wordml" xmlns:w15="http://schemas.microsoft.com/office/word/2012/wordml" xmlns:w16cex="http://schemas.microsoft.com/office/word/2018/wordml/cex" xmlns:w16cid="http://schemas.microsoft.com/office/word/2016/wordml/cid" xmlns:w16="http://schemas.microsoft.com/office/word/2018/wordml" xmlns:w16du="http://schemas.microsoft.com/office/word/2023/wordml/word16du" xmlns:w16sdtdh="http://schemas.microsoft.com/office/word/2020/wordml/sdtdatahash" xmlns:w16sdtfl="http://schemas.microsoft.com/office/word/2024/wordml/sdtformatlock" xmlns:w16se="http://schemas.microsoft.com/office/word/2015/wordml/symex" xmlns:wpg="http://schemas.microsoft.com/office/word/2010/wordprocessingGroup" xmlns:wpi="http://schemas.microsoft.com/office/word/2010/wordprocessingInk" xmlns:wne="http://schemas.microsoft.com/office/word/2006/wordml" xmlns:wps="http://schemas.microsoft.com/office/word/2010/wordprocessingShape" mc:Ignorable="w14 w15 w16se w16cid w16 w16cex w16sdtdh w16sdtfl w16du wp14">
-  <w:p>
-    <w:pPr>
-      <w:pStyle w:val="Header"/>
-    </w:pPr>
-  </w:p>
-</w:hdr>
 </file>
 
 <file path=word/numbering.xml><?xml version="1.0" encoding="utf-8"?>
@@ -1005,6 +4038,119 @@
     </w:lvl>
   </w:abstractNum>
   <w:abstractNum w:abstractNumId="3" w15:restartNumberingAfterBreak="0">
+    <w:nsid w:val="60F9066D"/>
+    <w:multiLevelType w:val="hybridMultilevel"/>
+    <w:tmpl w:val="D7E03FD0"/>
+    <w:lvl w:ilvl="0" w:tplc="D5C81C30">
+      <w:start w:val="1"/>
+      <w:numFmt w:val="bullet"/>
+      <w:lvlText w:val=""/>
+      <w:lvlJc w:val="left"/>
+      <w:pPr>
+        <w:ind w:left="1800" w:hanging="360"/>
+      </w:pPr>
+      <w:rPr>
+        <w:rFonts w:ascii="Symbol" w:hAnsi="Symbol" w:hint="default"/>
+      </w:rPr>
+    </w:lvl>
+    <w:lvl w:ilvl="1" w:tplc="0C000003" w:tentative="1">
+      <w:start w:val="1"/>
+      <w:numFmt w:val="bullet"/>
+      <w:lvlText w:val="o"/>
+      <w:lvlJc w:val="left"/>
+      <w:pPr>
+        <w:ind w:left="2520" w:hanging="360"/>
+      </w:pPr>
+      <w:rPr>
+        <w:rFonts w:ascii="Courier New" w:hAnsi="Courier New" w:cs="Courier New" w:hint="default"/>
+      </w:rPr>
+    </w:lvl>
+    <w:lvl w:ilvl="2" w:tplc="0C000005" w:tentative="1">
+      <w:start w:val="1"/>
+      <w:numFmt w:val="bullet"/>
+      <w:lvlText w:val=""/>
+      <w:lvlJc w:val="left"/>
+      <w:pPr>
+        <w:ind w:left="3240" w:hanging="360"/>
+      </w:pPr>
+      <w:rPr>
+        <w:rFonts w:ascii="Wingdings" w:hAnsi="Wingdings" w:hint="default"/>
+      </w:rPr>
+    </w:lvl>
+    <w:lvl w:ilvl="3" w:tplc="0C000001" w:tentative="1">
+      <w:start w:val="1"/>
+      <w:numFmt w:val="bullet"/>
+      <w:lvlText w:val=""/>
+      <w:lvlJc w:val="left"/>
+      <w:pPr>
+        <w:ind w:left="3960" w:hanging="360"/>
+      </w:pPr>
+      <w:rPr>
+        <w:rFonts w:ascii="Symbol" w:hAnsi="Symbol" w:hint="default"/>
+      </w:rPr>
+    </w:lvl>
+    <w:lvl w:ilvl="4" w:tplc="0C000003" w:tentative="1">
+      <w:start w:val="1"/>
+      <w:numFmt w:val="bullet"/>
+      <w:lvlText w:val="o"/>
+      <w:lvlJc w:val="left"/>
+      <w:pPr>
+        <w:ind w:left="4680" w:hanging="360"/>
+      </w:pPr>
+      <w:rPr>
+        <w:rFonts w:ascii="Courier New" w:hAnsi="Courier New" w:cs="Courier New" w:hint="default"/>
+      </w:rPr>
+    </w:lvl>
+    <w:lvl w:ilvl="5" w:tplc="0C000005" w:tentative="1">
+      <w:start w:val="1"/>
+      <w:numFmt w:val="bullet"/>
+      <w:lvlText w:val=""/>
+      <w:lvlJc w:val="left"/>
+      <w:pPr>
+        <w:ind w:left="5400" w:hanging="360"/>
+      </w:pPr>
+      <w:rPr>
+        <w:rFonts w:ascii="Wingdings" w:hAnsi="Wingdings" w:hint="default"/>
+      </w:rPr>
+    </w:lvl>
+    <w:lvl w:ilvl="6" w:tplc="0C000001" w:tentative="1">
+      <w:start w:val="1"/>
+      <w:numFmt w:val="bullet"/>
+      <w:lvlText w:val=""/>
+      <w:lvlJc w:val="left"/>
+      <w:pPr>
+        <w:ind w:left="6120" w:hanging="360"/>
+      </w:pPr>
+      <w:rPr>
+        <w:rFonts w:ascii="Symbol" w:hAnsi="Symbol" w:hint="default"/>
+      </w:rPr>
+    </w:lvl>
+    <w:lvl w:ilvl="7" w:tplc="0C000003" w:tentative="1">
+      <w:start w:val="1"/>
+      <w:numFmt w:val="bullet"/>
+      <w:lvlText w:val="o"/>
+      <w:lvlJc w:val="left"/>
+      <w:pPr>
+        <w:ind w:left="6840" w:hanging="360"/>
+      </w:pPr>
+      <w:rPr>
+        <w:rFonts w:ascii="Courier New" w:hAnsi="Courier New" w:cs="Courier New" w:hint="default"/>
+      </w:rPr>
+    </w:lvl>
+    <w:lvl w:ilvl="8" w:tplc="0C000005" w:tentative="1">
+      <w:start w:val="1"/>
+      <w:numFmt w:val="bullet"/>
+      <w:lvlText w:val=""/>
+      <w:lvlJc w:val="left"/>
+      <w:pPr>
+        <w:ind w:left="7560" w:hanging="360"/>
+      </w:pPr>
+      <w:rPr>
+        <w:rFonts w:ascii="Wingdings" w:hAnsi="Wingdings" w:hint="default"/>
+      </w:rPr>
+    </w:lvl>
+  </w:abstractNum>
+  <w:abstractNum w:abstractNumId="4" w15:restartNumberingAfterBreak="0">
     <w:nsid w:val="73D800F5"/>
     <w:multiLevelType w:val="hybridMultilevel"/>
     <w:tmpl w:val="66D462D4"/>
@@ -1100,10 +4246,13 @@
     <w:abstractNumId w:val="2"/>
   </w:num>
   <w:num w:numId="3" w16cid:durableId="377583731">
-    <w:abstractNumId w:val="3"/>
+    <w:abstractNumId w:val="4"/>
   </w:num>
   <w:num w:numId="4" w16cid:durableId="1110051117">
     <w:abstractNumId w:val="1"/>
+  </w:num>
+  <w:num w:numId="5" w16cid:durableId="1594119395">
+    <w:abstractNumId w:val="3"/>
   </w:num>
 </w:numbering>
 </file>
@@ -1565,10 +4714,9 @@
     <w:next w:val="Normal"/>
     <w:link w:val="Heading3Char"/>
     <w:uiPriority w:val="9"/>
-    <w:semiHidden/>
     <w:unhideWhenUsed/>
     <w:qFormat/>
-    <w:rsid w:val="00C071D0"/>
+    <w:rsid w:val="00E93F0C"/>
     <w:pPr>
       <w:keepNext/>
       <w:keepLines/>
@@ -1577,8 +4725,6 @@
     </w:pPr>
     <w:rPr>
       <w:rFonts w:eastAsiaTheme="majorEastAsia" w:cstheme="majorBidi"/>
-      <w:color w:val="0F4761" w:themeColor="accent1" w:themeShade="BF"/>
-      <w:sz w:val="28"/>
       <w:szCs w:val="28"/>
     </w:rPr>
   </w:style>
@@ -1775,12 +4921,10 @@
     <w:basedOn w:val="DefaultParagraphFont"/>
     <w:link w:val="Heading3"/>
     <w:uiPriority w:val="9"/>
-    <w:semiHidden/>
-    <w:rsid w:val="00C071D0"/>
+    <w:rsid w:val="00E93F0C"/>
     <w:rPr>
-      <w:rFonts w:eastAsiaTheme="majorEastAsia" w:cstheme="majorBidi"/>
-      <w:color w:val="0F4761" w:themeColor="accent1" w:themeShade="BF"/>
-      <w:sz w:val="28"/>
+      <w:rFonts w:ascii="Times New Roman" w:eastAsiaTheme="majorEastAsia" w:hAnsi="Times New Roman" w:cstheme="majorBidi"/>
+      <w:color w:val="000000" w:themeColor="text1"/>
       <w:szCs w:val="28"/>
     </w:rPr>
   </w:style>
@@ -1903,7 +5047,7 @@
     <w:link w:val="SubtitleChar"/>
     <w:uiPriority w:val="11"/>
     <w:qFormat/>
-    <w:rsid w:val="00C071D0"/>
+    <w:rsid w:val="009C760E"/>
     <w:pPr>
       <w:numPr>
         <w:ilvl w:val="1"/>
@@ -1911,9 +5055,8 @@
     </w:pPr>
     <w:rPr>
       <w:rFonts w:eastAsiaTheme="majorEastAsia" w:cstheme="majorBidi"/>
-      <w:color w:val="595959" w:themeColor="text1" w:themeTint="A6"/>
+      <w:color w:val="ADADAD" w:themeColor="background2" w:themeShade="BF"/>
       <w:spacing w:val="15"/>
-      <w:sz w:val="28"/>
       <w:szCs w:val="28"/>
     </w:rPr>
   </w:style>
@@ -1922,12 +5065,11 @@
     <w:basedOn w:val="DefaultParagraphFont"/>
     <w:link w:val="Subtitle"/>
     <w:uiPriority w:val="11"/>
-    <w:rsid w:val="00C071D0"/>
+    <w:rsid w:val="009C760E"/>
     <w:rPr>
-      <w:rFonts w:eastAsiaTheme="majorEastAsia" w:cstheme="majorBidi"/>
-      <w:color w:val="595959" w:themeColor="text1" w:themeTint="A6"/>
+      <w:rFonts w:ascii="Times New Roman" w:eastAsiaTheme="majorEastAsia" w:hAnsi="Times New Roman" w:cstheme="majorBidi"/>
+      <w:color w:val="ADADAD" w:themeColor="background2" w:themeShade="BF"/>
       <w:spacing w:val="15"/>
-      <w:sz w:val="28"/>
       <w:szCs w:val="28"/>
     </w:rPr>
   </w:style>
@@ -2098,10 +5240,13 @@
     <w:autoRedefine/>
     <w:uiPriority w:val="39"/>
     <w:unhideWhenUsed/>
-    <w:rsid w:val="00CB3F46"/>
+    <w:rsid w:val="00EC4683"/>
     <w:pPr>
       <w:spacing w:after="100"/>
     </w:pPr>
+    <w:rPr>
+      <w:smallCaps/>
+    </w:rPr>
   </w:style>
   <w:style w:type="paragraph" w:styleId="TOC2">
     <w:name w:val="toc 2"/>
@@ -2110,11 +5255,14 @@
     <w:autoRedefine/>
     <w:uiPriority w:val="39"/>
     <w:unhideWhenUsed/>
-    <w:rsid w:val="00CB3F46"/>
+    <w:rsid w:val="00EC4683"/>
     <w:pPr>
       <w:spacing w:after="100"/>
       <w:ind w:left="240"/>
     </w:pPr>
+    <w:rPr>
+      <w:smallCaps/>
+    </w:rPr>
   </w:style>
   <w:style w:type="character" w:styleId="Hyperlink">
     <w:name w:val="Hyperlink"/>
@@ -2124,6 +5272,71 @@
     <w:rsid w:val="00CB3F46"/>
     <w:rPr>
       <w:color w:val="467886" w:themeColor="hyperlink"/>
+      <w:u w:val="single"/>
+    </w:rPr>
+  </w:style>
+  <w:style w:type="paragraph" w:styleId="FootnoteText">
+    <w:name w:val="footnote text"/>
+    <w:basedOn w:val="Normal"/>
+    <w:link w:val="FootnoteTextChar"/>
+    <w:uiPriority w:val="99"/>
+    <w:semiHidden/>
+    <w:unhideWhenUsed/>
+    <w:rsid w:val="00C604DB"/>
+    <w:pPr>
+      <w:spacing w:after="0" w:line="240" w:lineRule="auto"/>
+    </w:pPr>
+    <w:rPr>
+      <w:sz w:val="20"/>
+      <w:szCs w:val="20"/>
+    </w:rPr>
+  </w:style>
+  <w:style w:type="character" w:customStyle="1" w:styleId="FootnoteTextChar">
+    <w:name w:val="Footnote Text Char"/>
+    <w:basedOn w:val="DefaultParagraphFont"/>
+    <w:link w:val="FootnoteText"/>
+    <w:uiPriority w:val="99"/>
+    <w:semiHidden/>
+    <w:rsid w:val="00C604DB"/>
+    <w:rPr>
+      <w:rFonts w:ascii="Times New Roman" w:hAnsi="Times New Roman"/>
+      <w:color w:val="000000" w:themeColor="text1"/>
+      <w:sz w:val="20"/>
+      <w:szCs w:val="20"/>
+    </w:rPr>
+  </w:style>
+  <w:style w:type="character" w:styleId="FootnoteReference">
+    <w:name w:val="footnote reference"/>
+    <w:basedOn w:val="DefaultParagraphFont"/>
+    <w:uiPriority w:val="99"/>
+    <w:semiHidden/>
+    <w:unhideWhenUsed/>
+    <w:rsid w:val="00C604DB"/>
+    <w:rPr>
+      <w:vertAlign w:val="superscript"/>
+    </w:rPr>
+  </w:style>
+  <w:style w:type="character" w:styleId="UnresolvedMention">
+    <w:name w:val="Unresolved Mention"/>
+    <w:basedOn w:val="DefaultParagraphFont"/>
+    <w:uiPriority w:val="99"/>
+    <w:semiHidden/>
+    <w:unhideWhenUsed/>
+    <w:rsid w:val="005832D5"/>
+    <w:rPr>
+      <w:color w:val="605E5C"/>
+      <w:shd w:val="clear" w:color="auto" w:fill="E1DFDD"/>
+    </w:rPr>
+  </w:style>
+  <w:style w:type="character" w:styleId="FollowedHyperlink">
+    <w:name w:val="FollowedHyperlink"/>
+    <w:basedOn w:val="DefaultParagraphFont"/>
+    <w:uiPriority w:val="99"/>
+    <w:semiHidden/>
+    <w:unhideWhenUsed/>
+    <w:rsid w:val="005832D5"/>
+    <w:rPr>
+      <w:color w:val="96607D" w:themeColor="followedHyperlink"/>
       <w:u w:val="single"/>
     </w:rPr>
   </w:style>

</xml_diff>

<commit_message>
More Docs and Rendering
</commit_message>
<xml_diff>
--- a/Doc.docx
+++ b/Doc.docx
@@ -1895,14 +1895,14 @@
             <v:path o:extrusionok="f" gradientshapeok="t" o:connecttype="rect"/>
             <o:lock v:ext="edit" aspectratio="t"/>
           </v:shapetype>
-          <v:shape id="_x0000_i1025" type="#_x0000_t75" style="width:403.9pt;height:163.65pt" o:ole="" o:bordertopcolor="this" o:borderleftcolor="this" o:borderbottomcolor="this" o:borderrightcolor="this">
+          <v:shape id="_x0000_i1025" type="#_x0000_t75" style="width:404pt;height:163.65pt" o:ole="" o:bordertopcolor="this" o:borderleftcolor="this" o:borderbottomcolor="this" o:borderrightcolor="this">
             <v:imagedata r:id="rId12" o:title=""/>
             <w10:bordertop type="single" width="4"/>
             <w10:borderleft type="single" width="4"/>
             <w10:borderbottom type="single" width="4"/>
             <w10:borderright type="single" width="4"/>
           </v:shape>
-          <o:OLEObject Type="Embed" ProgID="Word.OpenDocumentText.12" ShapeID="_x0000_i1025" DrawAspect="Content" ObjectID="_1837765790" r:id="rId13"/>
+          <o:OLEObject Type="Embed" ProgID="Word.OpenDocumentText.12" ShapeID="_x0000_i1025" DrawAspect="Content" ObjectID="_1837877689" r:id="rId13"/>
         </w:object>
       </w:r>
     </w:p>
@@ -1950,14 +1950,14 @@
           <w:lang w:val="en-US"/>
         </w:rPr>
         <w:object w:dxaOrig="9026" w:dyaOrig="806" w14:anchorId="099D0BF2">
-          <v:shape id="_x0000_i1026" type="#_x0000_t75" style="width:451.3pt;height:40.3pt" o:ole="" o:bordertopcolor="this" o:borderleftcolor="this" o:borderbottomcolor="this" o:borderrightcolor="this">
+          <v:shape id="_x0000_i1026" type="#_x0000_t75" style="width:451.35pt;height:40.35pt" o:ole="" o:bordertopcolor="this" o:borderleftcolor="this" o:borderbottomcolor="this" o:borderrightcolor="this">
             <v:imagedata r:id="rId14" o:title=""/>
             <w10:bordertop type="single" width="4"/>
             <w10:borderleft type="single" width="4"/>
             <w10:borderbottom type="single" width="4"/>
             <w10:borderright type="single" width="4"/>
           </v:shape>
-          <o:OLEObject Type="Embed" ProgID="Word.OpenDocumentText.12" ShapeID="_x0000_i1026" DrawAspect="Content" ObjectID="_1837765791" r:id="rId15"/>
+          <o:OLEObject Type="Embed" ProgID="Word.OpenDocumentText.12" ShapeID="_x0000_i1026" DrawAspect="Content" ObjectID="_1837877690" r:id="rId15"/>
         </w:object>
       </w:r>
     </w:p>
@@ -2154,14 +2154,14 @@
           <w:lang w:val="en-US"/>
         </w:rPr>
         <w:object w:dxaOrig="9026" w:dyaOrig="1129" w14:anchorId="3803F6A7">
-          <v:shape id="_x0000_i1027" type="#_x0000_t75" style="width:451.3pt;height:56.45pt" o:ole="" o:bordertopcolor="this" o:borderleftcolor="this" o:borderbottomcolor="this" o:borderrightcolor="this">
+          <v:shape id="_x0000_i1027" type="#_x0000_t75" style="width:451.35pt;height:56.35pt" o:ole="" o:bordertopcolor="this" o:borderleftcolor="this" o:borderbottomcolor="this" o:borderrightcolor="this">
             <v:imagedata r:id="rId16" o:title=""/>
             <w10:bordertop type="single" width="4"/>
             <w10:borderleft type="single" width="4"/>
             <w10:borderbottom type="single" width="4"/>
             <w10:borderright type="single" width="4"/>
           </v:shape>
-          <o:OLEObject Type="Embed" ProgID="Word.OpenDocumentText.12" ShapeID="_x0000_i1027" DrawAspect="Content" ObjectID="_1837765792" r:id="rId17"/>
+          <o:OLEObject Type="Embed" ProgID="Word.OpenDocumentText.12" ShapeID="_x0000_i1027" DrawAspect="Content" ObjectID="_1837877691" r:id="rId17"/>
         </w:object>
       </w:r>
     </w:p>
@@ -2233,14 +2233,14 @@
           <w:lang w:val="en-US"/>
         </w:rPr>
         <w:object w:dxaOrig="9026" w:dyaOrig="1129" w14:anchorId="3C311A47">
-          <v:shape id="_x0000_i1028" type="#_x0000_t75" style="width:451.3pt;height:56.45pt" o:ole="" o:bordertopcolor="this" o:borderleftcolor="this" o:borderbottomcolor="this" o:borderrightcolor="this">
+          <v:shape id="_x0000_i1028" type="#_x0000_t75" style="width:451.35pt;height:56.35pt" o:ole="" o:bordertopcolor="this" o:borderleftcolor="this" o:borderbottomcolor="this" o:borderrightcolor="this">
             <v:imagedata r:id="rId18" o:title=""/>
             <w10:bordertop type="single" width="4"/>
             <w10:borderleft type="single" width="4"/>
             <w10:borderbottom type="single" width="4"/>
             <w10:borderright type="single" width="4"/>
           </v:shape>
-          <o:OLEObject Type="Embed" ProgID="Word.OpenDocumentText.12" ShapeID="_x0000_i1028" DrawAspect="Content" ObjectID="_1837765793" r:id="rId19"/>
+          <o:OLEObject Type="Embed" ProgID="Word.OpenDocumentText.12" ShapeID="_x0000_i1028" DrawAspect="Content" ObjectID="_1837877692" r:id="rId19"/>
         </w:object>
       </w:r>
     </w:p>
@@ -2306,14 +2306,14 @@
           <w:lang w:val="en-US"/>
         </w:rPr>
         <w:object w:dxaOrig="9026" w:dyaOrig="1129" w14:anchorId="0DF40D06">
-          <v:shape id="_x0000_i1029" type="#_x0000_t75" style="width:451.3pt;height:56.45pt" o:ole="" o:bordertopcolor="this" o:borderleftcolor="this" o:borderbottomcolor="this" o:borderrightcolor="this">
+          <v:shape id="_x0000_i1029" type="#_x0000_t75" style="width:451.35pt;height:56.35pt" o:ole="" o:bordertopcolor="this" o:borderleftcolor="this" o:borderbottomcolor="this" o:borderrightcolor="this">
             <v:imagedata r:id="rId20" o:title=""/>
             <w10:bordertop type="single" width="4"/>
             <w10:borderleft type="single" width="4"/>
             <w10:borderbottom type="single" width="4"/>
             <w10:borderright type="single" width="4"/>
           </v:shape>
-          <o:OLEObject Type="Embed" ProgID="Word.OpenDocumentText.12" ShapeID="_x0000_i1029" DrawAspect="Content" ObjectID="_1837765794" r:id="rId21"/>
+          <o:OLEObject Type="Embed" ProgID="Word.OpenDocumentText.12" ShapeID="_x0000_i1029" DrawAspect="Content" ObjectID="_1837877693" r:id="rId21"/>
         </w:object>
       </w:r>
       <w:bookmarkStart w:id="10" w:name="_II._Structura"/>
@@ -2452,16 +2452,16 @@
         <mc:AlternateContent>
           <mc:Choice Requires="wps">
             <w:drawing>
-              <wp:anchor distT="0" distB="0" distL="114300" distR="114300" simplePos="0" relativeHeight="251660288" behindDoc="0" locked="0" layoutInCell="1" allowOverlap="1" wp14:anchorId="1083A79F" wp14:editId="032E45B5">
+              <wp:anchor distT="0" distB="0" distL="114300" distR="114300" simplePos="0" relativeHeight="251660288" behindDoc="0" locked="0" layoutInCell="1" allowOverlap="1" wp14:anchorId="1083A79F" wp14:editId="0FD14CFF">
                 <wp:simplePos x="0" y="0"/>
                 <wp:positionH relativeFrom="column">
                   <wp:posOffset>2907665</wp:posOffset>
                 </wp:positionH>
                 <wp:positionV relativeFrom="paragraph">
-                  <wp:posOffset>2012950</wp:posOffset>
+                  <wp:posOffset>2101850</wp:posOffset>
                 </wp:positionV>
                 <wp:extent cx="2741295" cy="635"/>
-                <wp:effectExtent l="0" t="0" r="0" b="0"/>
+                <wp:effectExtent l="0" t="0" r="1905" b="8255"/>
                 <wp:wrapSquare wrapText="bothSides"/>
                 <wp:docPr id="1225403176" name="Text Box 1"/>
                 <wp:cNvGraphicFramePr/>
@@ -2489,34 +2489,34 @@
                           <w:p>
                             <w:pPr>
                               <w:pStyle w:val="Caption"/>
+                              <w:jc w:val="center"/>
                               <w:rPr>
                                 <w:noProof/>
                                 <w:color w:val="000000" w:themeColor="text1"/>
-                                <w:lang w:val="ro-RO"/>
+                                <w:lang w:val="en-US"/>
                               </w:rPr>
                             </w:pPr>
                             <w:r>
+                              <w:rPr>
+                                <w:b/>
+                                <w:bCs/>
+                              </w:rPr>
                               <w:t xml:space="preserve">Figura </w:t>
                             </w:r>
-                            <w:fldSimple w:instr=" STYLEREF 1 \s ">
-                              <w:r>
-                                <w:rPr>
-                                  <w:noProof/>
-                                </w:rPr>
-                                <w:t>0</w:t>
-                              </w:r>
-                            </w:fldSimple>
                             <w:r>
-                              <w:t>.</w:t>
+                              <w:rPr>
+                                <w:b/>
+                                <w:bCs/>
+                                <w:lang w:val="en-US"/>
+                              </w:rPr>
+                              <w:t>II.1.</w:t>
                             </w:r>
-                            <w:fldSimple w:instr=" SEQ Figura \* ARABIC \s 1 ">
-                              <w:r>
-                                <w:rPr>
-                                  <w:noProof/>
-                                </w:rPr>
-                                <w:t>1</w:t>
-                              </w:r>
-                            </w:fldSimple>
+                            <w:r>
+                              <w:rPr>
+                                <w:lang w:val="en-US"/>
+                              </w:rPr>
+                              <w:t xml:space="preserve"> Structura directorului Dev</w:t>
+                            </w:r>
                           </w:p>
                         </w:txbxContent>
                       </wps:txbx>
@@ -2538,40 +2538,40 @@
                 <v:stroke joinstyle="miter"/>
                 <v:path gradientshapeok="t" o:connecttype="rect"/>
               </v:shapetype>
-              <v:shape id="Text Box 1" o:spid="_x0000_s1026" type="#_x0000_t202" style="position:absolute;left:0;text-align:left;margin-left:228.95pt;margin-top:158.5pt;width:215.85pt;height:.05pt;z-index:251660288;visibility:visible;mso-wrap-style:square;mso-wrap-distance-left:9pt;mso-wrap-distance-top:0;mso-wrap-distance-right:9pt;mso-wrap-distance-bottom:0;mso-position-horizontal:absolute;mso-position-horizontal-relative:text;mso-position-vertical:absolute;mso-position-vertical-relative:text;v-text-anchor:top" o:gfxdata="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" stroked="f">
+              <v:shape id="Text Box 1" o:spid="_x0000_s1026" type="#_x0000_t202" style="position:absolute;left:0;text-align:left;margin-left:228.95pt;margin-top:165.5pt;width:215.85pt;height:.05pt;z-index:251660288;visibility:visible;mso-wrap-style:square;mso-wrap-distance-left:9pt;mso-wrap-distance-top:0;mso-wrap-distance-right:9pt;mso-wrap-distance-bottom:0;mso-position-horizontal:absolute;mso-position-horizontal-relative:text;mso-position-vertical:absolute;mso-position-vertical-relative:text;v-text-anchor:top" o:gfxdata="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" stroked="f">
                 <v:textbox style="mso-fit-shape-to-text:t" inset="0,0,0,0">
                   <w:txbxContent>
                     <w:p>
                       <w:pPr>
                         <w:pStyle w:val="Caption"/>
+                        <w:jc w:val="center"/>
                         <w:rPr>
                           <w:noProof/>
                           <w:color w:val="000000" w:themeColor="text1"/>
-                          <w:lang w:val="ro-RO"/>
+                          <w:lang w:val="en-US"/>
                         </w:rPr>
                       </w:pPr>
                       <w:r>
+                        <w:rPr>
+                          <w:b/>
+                          <w:bCs/>
+                        </w:rPr>
                         <w:t xml:space="preserve">Figura </w:t>
                       </w:r>
-                      <w:fldSimple w:instr=" STYLEREF 1 \s ">
-                        <w:r>
-                          <w:rPr>
-                            <w:noProof/>
-                          </w:rPr>
-                          <w:t>0</w:t>
-                        </w:r>
-                      </w:fldSimple>
                       <w:r>
-                        <w:t>.</w:t>
+                        <w:rPr>
+                          <w:b/>
+                          <w:bCs/>
+                          <w:lang w:val="en-US"/>
+                        </w:rPr>
+                        <w:t>II.1.</w:t>
                       </w:r>
-                      <w:fldSimple w:instr=" SEQ Figura \* ARABIC \s 1 ">
-                        <w:r>
-                          <w:rPr>
-                            <w:noProof/>
-                          </w:rPr>
-                          <w:t>1</w:t>
-                        </w:r>
-                      </w:fldSimple>
+                      <w:r>
+                        <w:rPr>
+                          <w:lang w:val="en-US"/>
+                        </w:rPr>
+                        <w:t xml:space="preserve"> Structura directorului Dev</w:t>
+                      </w:r>
                     </w:p>
                   </w:txbxContent>
                 </v:textbox>
@@ -2587,13 +2587,13 @@
           <w:lang w:val="ro-RO"/>
         </w:rPr>
         <w:drawing>
-          <wp:anchor distT="0" distB="0" distL="114300" distR="114300" simplePos="0" relativeHeight="251658240" behindDoc="0" locked="0" layoutInCell="1" allowOverlap="1" wp14:anchorId="02C7CA36" wp14:editId="258BD540">
+          <wp:anchor distT="0" distB="0" distL="114300" distR="114300" simplePos="0" relativeHeight="251658240" behindDoc="0" locked="0" layoutInCell="1" allowOverlap="1" wp14:anchorId="02C7CA36" wp14:editId="14A9C1C2">
             <wp:simplePos x="0" y="0"/>
             <wp:positionH relativeFrom="margin">
               <wp:posOffset>2907665</wp:posOffset>
             </wp:positionH>
             <wp:positionV relativeFrom="paragraph">
-              <wp:posOffset>46990</wp:posOffset>
+              <wp:posOffset>123190</wp:posOffset>
             </wp:positionV>
             <wp:extent cx="2741295" cy="1908810"/>
             <wp:effectExtent l="0" t="0" r="0" b="15240"/>
@@ -2777,6 +2777,14 @@
         </w:rPr>
         <w:t>Core</w:t>
       </w:r>
+      <w:r>
+        <w:rPr>
+          <w:i/>
+          <w:iCs/>
+          <w:lang w:val="ro-RO"/>
+        </w:rPr>
+        <w:t>.</w:t>
+      </w:r>
     </w:p>
     <w:p>
       <w:pPr>
@@ -2925,7 +2933,7 @@
             <w10:borderbottom type="single" width="4"/>
             <w10:borderright type="single" width="4"/>
           </v:shape>
-          <o:OLEObject Type="Embed" ProgID="Word.OpenDocumentText.12" ShapeID="_x0000_i1030" DrawAspect="Content" ObjectID="_1837765795" r:id="rId28"/>
+          <o:OLEObject Type="Embed" ProgID="Word.OpenDocumentText.12" ShapeID="_x0000_i1030" DrawAspect="Content" ObjectID="_1837877694" r:id="rId28"/>
         </w:object>
       </w:r>
     </w:p>
@@ -3054,7 +3062,7 @@
             <w10:borderbottom type="single" width="4"/>
             <w10:borderright type="single" width="4"/>
           </v:shape>
-          <o:OLEObject Type="Embed" ProgID="Word.OpenDocumentText.12" ShapeID="_x0000_i1031" DrawAspect="Content" ObjectID="_1837765796" r:id="rId30"/>
+          <o:OLEObject Type="Embed" ProgID="Word.OpenDocumentText.12" ShapeID="_x0000_i1031" DrawAspect="Content" ObjectID="_1837877695" r:id="rId30"/>
         </w:object>
       </w:r>
     </w:p>
@@ -3140,7 +3148,7 @@
             <w10:borderbottom type="single" width="4"/>
             <w10:borderright type="single" width="4"/>
           </v:shape>
-          <o:OLEObject Type="Embed" ProgID="Word.OpenDocumentText.12" ShapeID="_x0000_i1032" DrawAspect="Content" ObjectID="_1837765797" r:id="rId32"/>
+          <o:OLEObject Type="Embed" ProgID="Word.OpenDocumentText.12" ShapeID="_x0000_i1032" DrawAspect="Content" ObjectID="_1837877696" r:id="rId32"/>
         </w:object>
       </w:r>
     </w:p>
@@ -3244,7 +3252,7 @@
             <w10:borderbottom type="single" width="4"/>
             <w10:borderright type="single" width="4"/>
           </v:shape>
-          <o:OLEObject Type="Embed" ProgID="Word.OpenDocumentText.12" ShapeID="_x0000_i1033" DrawAspect="Content" ObjectID="_1837765798" r:id="rId34"/>
+          <o:OLEObject Type="Embed" ProgID="Word.OpenDocumentText.12" ShapeID="_x0000_i1033" DrawAspect="Content" ObjectID="_1837877697" r:id="rId34"/>
         </w:object>
       </w:r>
     </w:p>
@@ -3403,7 +3411,7 @@
             <w10:borderbottom type="single" width="4"/>
             <w10:borderright type="single" width="4"/>
           </v:shape>
-          <o:OLEObject Type="Embed" ProgID="Word.OpenDocumentText.12" ShapeID="_x0000_i1034" DrawAspect="Content" ObjectID="_1837765799" r:id="rId36"/>
+          <o:OLEObject Type="Embed" ProgID="Word.OpenDocumentText.12" ShapeID="_x0000_i1034" DrawAspect="Content" ObjectID="_1837877698" r:id="rId36"/>
         </w:object>
       </w:r>
     </w:p>
@@ -3800,6 +3808,20 @@
       <w:r>
         <w:rPr>
           <w:rFonts w:cs="Times New Roman"/>
+          <w:lang w:val="en-GB"/>
+        </w:rPr>
+        <w:t xml:space="preserve"> la </w:t>
+      </w:r>
+      <w:r>
+        <w:rPr>
+          <w:rFonts w:cs="Times New Roman"/>
+          <w:lang w:val="ro-RO"/>
+        </w:rPr>
+        <w:t>începutul oricărei funcții</w:t>
+      </w:r>
+      <w:r>
+        <w:rPr>
+          <w:rFonts w:cs="Times New Roman"/>
           <w:lang w:val="ro-RO"/>
         </w:rPr>
         <w:t xml:space="preserve">, ce poate fi apelat fără argumente pentru a extrage numele funcției în care a fost apelat, sau cu un singur argument, reprezentând un nume pentru funcția în care se află. Similar, macroul </w:t>
@@ -4133,28 +4155,49 @@
     </w:p>
     <w:p>
       <w:pPr>
+        <w:rPr>
+          <w:rFonts w:cs="Times New Roman"/>
+          <w:lang w:val="ro-RO"/>
+        </w:rPr>
+      </w:pPr>
+      <w:r>
+        <w:rPr>
+          <w:rFonts w:cs="Times New Roman"/>
+          <w:lang w:val="ro-RO"/>
+        </w:rPr>
+        <w:br w:type="page"/>
+      </w:r>
+    </w:p>
+    <w:p>
+      <w:pPr>
         <w:pStyle w:val="NoSpacing"/>
         <w:rPr>
           <w:rFonts w:cs="Times New Roman"/>
-          <w:lang w:val="ro-RO"/>
-        </w:rPr>
-      </w:pPr>
-    </w:p>
-    <w:p>
-      <w:pPr>
-        <w:pStyle w:val="NoSpacing"/>
-        <w:rPr>
-          <w:rFonts w:cs="Times New Roman"/>
-          <w:lang w:val="en-GB"/>
-        </w:rPr>
-      </w:pPr>
-      <w:r>
-        <w:rPr>
-          <w:rFonts w:cs="Times New Roman"/>
-          <w:lang w:val="ro-RO"/>
-        </w:rPr>
+          <w:lang w:val="en-US"/>
+        </w:rPr>
+      </w:pPr>
+      <w:r>
+        <w:rPr>
+          <w:rFonts w:cs="Times New Roman"/>
+          <w:lang w:val="ro-RO"/>
+        </w:rPr>
+        <w:lastRenderedPageBreak/>
         <w:tab/>
-        <w:t xml:space="preserve">După terminarea programului, bufferele sunt scrise în memorie în fișiere din directorul </w:t>
+        <w:t>După terminarea programului, bufferele sunt scrise</w:t>
+      </w:r>
+      <w:r>
+        <w:rPr>
+          <w:rFonts w:cs="Times New Roman"/>
+          <w:lang w:val="ro-RO"/>
+        </w:rPr>
+        <w:t xml:space="preserve"> </w:t>
+      </w:r>
+      <w:r>
+        <w:rPr>
+          <w:rFonts w:cs="Times New Roman"/>
+          <w:lang w:val="ro-RO"/>
+        </w:rPr>
+        <w:t xml:space="preserve">în fișiere din directorul </w:t>
       </w:r>
       <w:r>
         <w:rPr>
@@ -4170,12 +4213,19 @@
           <w:rFonts w:cs="Times New Roman"/>
           <w:lang w:val="ro-RO"/>
         </w:rPr>
-        <w:t>. Spre exemplu</w:t>
-      </w:r>
-      <w:r>
-        <w:rPr>
-          <w:rFonts w:cs="Times New Roman"/>
-          <w:lang w:val="en-GB"/>
+        <w:t xml:space="preserve">. </w:t>
+      </w:r>
+      <w:r>
+        <w:rPr>
+          <w:rFonts w:cs="Times New Roman"/>
+          <w:lang w:val="ro-RO"/>
+        </w:rPr>
+        <w:t>O utilizare corectă a acestui sistem de debug arată în felul următor</w:t>
+      </w:r>
+      <w:r>
+        <w:rPr>
+          <w:rFonts w:cs="Times New Roman"/>
+          <w:lang w:val="en-US"/>
         </w:rPr>
         <w:t>:</w:t>
       </w:r>
@@ -4188,6 +4238,26 @@
           <w:lang w:val="en-US"/>
         </w:rPr>
       </w:pPr>
+    </w:p>
+    <w:p>
+      <w:pPr>
+        <w:pStyle w:val="NoSpacing"/>
+        <w:rPr>
+          <w:rFonts w:cs="Times New Roman"/>
+          <w:i/>
+          <w:iCs/>
+          <w:lang w:val="en-US"/>
+        </w:rPr>
+      </w:pPr>
+      <w:r>
+        <w:rPr>
+          <w:rFonts w:cs="Times New Roman"/>
+          <w:i/>
+          <w:iCs/>
+          <w:lang w:val="en-US"/>
+        </w:rPr>
+        <w:t>main.c</w:t>
+      </w:r>
     </w:p>
     <w:bookmarkStart w:id="20" w:name="_MON_1837753066"/>
     <w:bookmarkEnd w:id="20"/>
@@ -4195,67 +4265,1484 @@
       <w:pPr>
         <w:pStyle w:val="NoSpacing"/>
         <w:rPr>
-          <w:rFonts w:cs="Times New Roman"/>
-          <w:lang w:val="en-US"/>
-        </w:rPr>
-      </w:pPr>
-      <w:r>
-        <w:rPr>
-          <w:lang w:val="en-US"/>
-        </w:rPr>
-        <w:object w:dxaOrig="9026" w:dyaOrig="3170" w14:anchorId="6957392A">
-          <v:shape id="_x0000_i1042" type="#_x0000_t75" style="width:451.35pt;height:158.65pt" o:ole="">
+          <w:lang w:val="en-US"/>
+        </w:rPr>
+      </w:pPr>
+      <w:r>
+        <w:rPr>
+          <w:lang w:val="en-US"/>
+        </w:rPr>
+        <w:object w:dxaOrig="9026" w:dyaOrig="6838" w14:anchorId="6957392A">
+          <v:shape id="_x0000_i1035" type="#_x0000_t75" style="width:451.35pt;height:342pt" o:ole="" o:bordertopcolor="this" o:borderleftcolor="this" o:borderbottomcolor="this" o:borderrightcolor="this">
             <v:imagedata r:id="rId37" o:title=""/>
             <w10:bordertop type="single" width="4"/>
             <w10:borderleft type="single" width="4"/>
             <w10:borderbottom type="single" width="4"/>
             <w10:borderright type="single" width="4"/>
           </v:shape>
-          <o:OLEObject Type="Embed" ProgID="Word.OpenDocumentText.12" ShapeID="_x0000_i1042" DrawAspect="Content" ObjectID="_1837765800" r:id="rId38"/>
+          <o:OLEObject Type="Embed" ProgID="Word.OpenDocumentText.12" ShapeID="_x0000_i1035" DrawAspect="Content" ObjectID="_1837877699" r:id="rId38"/>
         </w:object>
       </w:r>
     </w:p>
     <w:p>
       <w:pPr>
-        <w:rPr>
-          <w:lang w:val="ro-RO"/>
-        </w:rPr>
-      </w:pPr>
-      <w:r>
+        <w:pStyle w:val="NoSpacing"/>
+        <w:rPr>
+          <w:lang w:val="en-US"/>
+        </w:rPr>
+      </w:pPr>
+    </w:p>
+    <w:p>
+      <w:pPr>
+        <w:pStyle w:val="NoSpacing"/>
+        <w:rPr>
+          <w:i/>
+          <w:iCs/>
+          <w:lang w:val="en-US"/>
+        </w:rPr>
+      </w:pPr>
+      <w:r>
+        <w:rPr>
+          <w:i/>
+          <w:iCs/>
+          <w:lang w:val="en-US"/>
+        </w:rPr>
+        <w:t>2026-04-16-15-29-40.log</w:t>
+      </w:r>
+    </w:p>
+    <w:bookmarkStart w:id="21" w:name="_MON_1837858724"/>
+    <w:bookmarkEnd w:id="21"/>
+    <w:p>
+      <w:pPr>
+        <w:pStyle w:val="NoSpacing"/>
+        <w:rPr>
+          <w:lang w:val="en-US"/>
+        </w:rPr>
+      </w:pPr>
+      <w:r>
+        <w:rPr>
+          <w:lang w:val="en-US"/>
+        </w:rPr>
+        <w:object w:dxaOrig="9026" w:dyaOrig="2529" w14:anchorId="4C5F2198">
+          <v:shape id="_x0000_i1036" type="#_x0000_t75" style="width:451.35pt;height:126.35pt" o:ole="" o:bordertopcolor="this" o:borderleftcolor="this" o:borderbottomcolor="this" o:borderrightcolor="this">
+            <v:imagedata r:id="rId39" o:title=""/>
+            <w10:bordertop type="single" width="4"/>
+            <w10:borderleft type="single" width="4"/>
+            <w10:borderbottom type="single" width="4"/>
+            <w10:borderright type="single" width="4"/>
+          </v:shape>
+          <o:OLEObject Type="Embed" ProgID="Word.OpenDocumentText.12" ShapeID="_x0000_i1036" DrawAspect="Content" ObjectID="_1837877700" r:id="rId40"/>
+        </w:object>
+      </w:r>
+    </w:p>
+    <w:p>
+      <w:pPr>
+        <w:pStyle w:val="NoSpacing"/>
+        <w:rPr>
+          <w:lang w:val="en-US"/>
+        </w:rPr>
+      </w:pPr>
+    </w:p>
+    <w:p>
+      <w:pPr>
+        <w:pStyle w:val="NoSpacing"/>
+        <w:rPr>
+          <w:i/>
+          <w:iCs/>
+          <w:lang w:val="en-US"/>
+        </w:rPr>
+      </w:pPr>
+      <w:r>
+        <w:rPr>
+          <w:i/>
+          <w:iCs/>
+          <w:lang w:val="en-US"/>
+        </w:rPr>
+        <w:t>2026-04-16-15-29-40.memlog</w:t>
+      </w:r>
+    </w:p>
+    <w:bookmarkStart w:id="22" w:name="_MON_1837858877"/>
+    <w:bookmarkEnd w:id="22"/>
+    <w:p>
+      <w:pPr>
+        <w:pStyle w:val="NoSpacing"/>
+        <w:rPr>
+          <w:lang w:val="en-US"/>
+        </w:rPr>
+      </w:pPr>
+      <w:r>
+        <w:rPr>
+          <w:lang w:val="en-US"/>
+        </w:rPr>
+        <w:object w:dxaOrig="9026" w:dyaOrig="1686" w14:anchorId="7147624A">
+          <v:shape id="_x0000_i1037" type="#_x0000_t75" style="width:451.35pt;height:84.35pt" o:ole="" o:bordertopcolor="this" o:borderleftcolor="this" o:borderbottomcolor="this" o:borderrightcolor="this">
+            <v:imagedata r:id="rId41" o:title=""/>
+            <w10:bordertop type="single" width="4"/>
+            <w10:borderleft type="single" width="4"/>
+            <w10:borderbottom type="single" width="4"/>
+            <w10:borderright type="single" width="4"/>
+          </v:shape>
+          <o:OLEObject Type="Embed" ProgID="Word.OpenDocumentText.12" ShapeID="_x0000_i1037" DrawAspect="Content" ObjectID="_1837877701" r:id="rId42"/>
+        </w:object>
+      </w:r>
+    </w:p>
+    <w:p>
+      <w:pPr>
+        <w:rPr>
+          <w:lang w:val="en-US"/>
+        </w:rPr>
+      </w:pPr>
+      <w:r>
+        <w:rPr>
+          <w:lang w:val="en-US"/>
+        </w:rPr>
+        <w:br w:type="page"/>
+      </w:r>
+    </w:p>
+    <w:p>
+      <w:pPr>
+        <w:pStyle w:val="Subtitle"/>
+        <w:rPr>
+          <w:lang w:val="en-US"/>
+        </w:rPr>
+      </w:pPr>
+      <w:r>
+        <w:rPr>
+          <w:lang w:val="en-US"/>
+        </w:rPr>
+        <w:lastRenderedPageBreak/>
+        <w:t>Structuri Generice</w:t>
+      </w:r>
+    </w:p>
+    <w:p>
+      <w:pPr>
+        <w:pStyle w:val="NoSpacing"/>
+        <w:rPr>
+          <w:rFonts w:cs="Times New Roman"/>
+          <w:lang w:val="ro-RO"/>
+        </w:rPr>
+      </w:pPr>
+      <w:r>
+        <w:rPr>
+          <w:lang w:val="en-US"/>
+        </w:rPr>
+        <w:tab/>
+      </w:r>
+      <w:r>
+        <w:rPr>
+          <w:lang w:val="en-US"/>
+        </w:rPr>
+        <w:t>Unele dintre cele mai folositoare unelte g</w:t>
+      </w:r>
+      <w:r>
+        <w:rPr>
+          <w:lang w:val="ro-RO"/>
+        </w:rPr>
+        <w:t>ăsite în limbajele de programare moderne sunt structurile dinamice, cum ar fi tablouri dinamice, liste înlănțuite, stiva sau coada alocată dinamic. Toate acestea sunt relativ ușor de implementat într-un limbaj precum C, însă un asemenea limbaj nu prezintă un mod de a reutiliza o implementare pentru mai multe tipuri de date, așadar același cod trebuie rescris pentru fiecare tip de date folosit.</w:t>
+      </w:r>
+      <w:r>
+        <w:rPr>
+          <w:lang w:val="ro-RO"/>
+        </w:rPr>
+        <w:t xml:space="preserve"> Biblioteca noastră vine cu o soluție pentru această problemă prin 2 structuri de date generice</w:t>
+      </w:r>
+      <w:r>
+        <w:rPr>
+          <w:lang w:val="en-US"/>
+        </w:rPr>
+        <w:t>:</w:t>
+      </w:r>
+      <w:r>
+        <w:rPr>
+          <w:lang w:val="ro-RO"/>
+        </w:rPr>
+        <w:t xml:space="preserve"> </w:t>
+      </w:r>
+      <w:r>
+        <w:rPr>
+          <w:rFonts w:ascii="Consolas" w:hAnsi="Consolas"/>
+          <w:lang w:val="ro-RO"/>
+        </w:rPr>
+        <w:t>vector</w:t>
+      </w:r>
+      <w:r>
+        <w:rPr>
+          <w:rFonts w:cs="Times New Roman"/>
+          <w:lang w:val="ro-RO"/>
+        </w:rPr>
+        <w:t xml:space="preserve"> și</w:t>
+      </w:r>
+      <w:r>
+        <w:rPr>
+          <w:rFonts w:ascii="Consolas" w:hAnsi="Consolas"/>
+          <w:lang w:val="ro-RO"/>
+        </w:rPr>
+        <w:t xml:space="preserve"> deque</w:t>
+      </w:r>
+      <w:r>
+        <w:rPr>
+          <w:rFonts w:cs="Times New Roman"/>
+          <w:lang w:val="ro-RO"/>
+        </w:rPr>
+        <w:t>.</w:t>
+      </w:r>
+      <w:r>
+        <w:rPr>
+          <w:rFonts w:cs="Times New Roman"/>
+          <w:lang w:val="ro-RO"/>
+        </w:rPr>
+        <w:t xml:space="preserve"> Aplicația noastră se folosește des de </w:t>
+      </w:r>
+      <w:r>
+        <w:rPr>
+          <w:rFonts w:ascii="Consolas" w:hAnsi="Consolas" w:cs="Times New Roman"/>
+          <w:lang w:val="ro-RO"/>
+        </w:rPr>
+        <w:t>vector</w:t>
+      </w:r>
+      <w:r>
+        <w:rPr>
+          <w:rFonts w:cs="Times New Roman"/>
+          <w:lang w:val="ro-RO"/>
+        </w:rPr>
+        <w:t>, așadar îl vom prezenta pe acesta.</w:t>
+      </w:r>
+    </w:p>
+    <w:p>
+      <w:pPr>
+        <w:pStyle w:val="NoSpacing"/>
+        <w:rPr>
+          <w:rFonts w:cs="Times New Roman"/>
+          <w:lang w:val="ro-RO"/>
+        </w:rPr>
+      </w:pPr>
+      <w:r>
+        <w:rPr>
+          <w:rFonts w:cs="Times New Roman"/>
+          <w:lang w:val="ro-RO"/>
+        </w:rPr>
+        <w:tab/>
+      </w:r>
+      <w:r>
+        <w:rPr>
+          <w:rFonts w:ascii="Consolas" w:hAnsi="Consolas" w:cs="Times New Roman"/>
+          <w:lang w:val="ro-RO"/>
+        </w:rPr>
+        <w:t>vector</w:t>
+      </w:r>
+      <w:r>
+        <w:rPr>
+          <w:rFonts w:cs="Times New Roman"/>
+          <w:lang w:val="ro-RO"/>
+        </w:rPr>
+        <w:t xml:space="preserve"> este o structură generică ce implementează un tablou dinamic ce poate fi folosit pentru orice tip de date. Un exemplu de utilizare a acestuia este</w:t>
+      </w:r>
+      <w:r>
+        <w:rPr>
+          <w:rFonts w:cs="Times New Roman"/>
+          <w:lang w:val="en-US"/>
+        </w:rPr>
+        <w:t>:</w:t>
+      </w:r>
+    </w:p>
+    <w:p>
+      <w:pPr>
+        <w:pStyle w:val="NoSpacing"/>
+        <w:rPr>
+          <w:rFonts w:cs="Times New Roman"/>
+          <w:lang w:val="ro-RO"/>
+        </w:rPr>
+      </w:pPr>
+    </w:p>
+    <w:bookmarkStart w:id="23" w:name="_MON_1837860742"/>
+    <w:bookmarkEnd w:id="23"/>
+    <w:p>
+      <w:pPr>
+        <w:pStyle w:val="NoSpacing"/>
+        <w:rPr>
+          <w:lang w:val="en-US"/>
+        </w:rPr>
+      </w:pPr>
+      <w:r>
+        <w:rPr>
+          <w:lang w:val="en-US"/>
+        </w:rPr>
+        <w:object w:dxaOrig="9026" w:dyaOrig="1405" w14:anchorId="2193020A">
+          <v:shape id="_x0000_i1038" type="#_x0000_t75" style="width:451.35pt;height:70.35pt" o:ole="" o:bordertopcolor="this" o:borderleftcolor="this" o:borderbottomcolor="this" o:borderrightcolor="this">
+            <v:imagedata r:id="rId43" o:title=""/>
+            <w10:bordertop type="single" width="4"/>
+            <w10:borderleft type="single" width="4"/>
+            <w10:borderbottom type="single" width="4"/>
+            <w10:borderright type="single" width="4"/>
+          </v:shape>
+          <o:OLEObject Type="Embed" ProgID="Word.OpenDocumentText.12" ShapeID="_x0000_i1038" DrawAspect="Content" ObjectID="_1837877702" r:id="rId44"/>
+        </w:object>
+      </w:r>
+    </w:p>
+    <w:p>
+      <w:pPr>
+        <w:pStyle w:val="NoSpacing"/>
+        <w:rPr>
+          <w:lang w:val="en-US"/>
+        </w:rPr>
+      </w:pPr>
+    </w:p>
+    <w:p>
+      <w:pPr>
+        <w:pStyle w:val="NoSpacing"/>
+        <w:rPr>
+          <w:rFonts w:cs="Times New Roman"/>
+          <w:lang w:val="en-US"/>
+        </w:rPr>
+      </w:pPr>
+      <w:r>
+        <w:rPr>
+          <w:lang w:val="en-US"/>
+        </w:rPr>
+        <w:tab/>
+        <w:t>Implementarea intern</w:t>
+      </w:r>
+      <w:r>
+        <w:rPr>
+          <w:lang w:val="ro-RO"/>
+        </w:rPr>
+        <w:t xml:space="preserve">ă a acestuia se bazează, ca multe alte elemente din această bibliotecă, pe macrouri. Structura internă pentru </w:t>
+      </w:r>
+      <w:r>
+        <w:rPr>
+          <w:rFonts w:ascii="Consolas" w:hAnsi="Consolas"/>
+          <w:lang w:val="ro-RO"/>
+        </w:rPr>
+        <w:t>vector</w:t>
+      </w:r>
+      <w:r>
+        <w:rPr>
+          <w:rFonts w:cs="Times New Roman"/>
+          <w:lang w:val="ro-RO"/>
+        </w:rPr>
+        <w:t xml:space="preserve"> este</w:t>
+      </w:r>
+      <w:r>
+        <w:rPr>
+          <w:rFonts w:cs="Times New Roman"/>
+          <w:lang w:val="en-US"/>
+        </w:rPr>
+        <w:t>:</w:t>
+      </w:r>
+    </w:p>
+    <w:p>
+      <w:pPr>
+        <w:pStyle w:val="NoSpacing"/>
+        <w:rPr>
+          <w:rFonts w:cs="Times New Roman"/>
+          <w:lang w:val="en-US"/>
+        </w:rPr>
+      </w:pPr>
+    </w:p>
+    <w:bookmarkStart w:id="24" w:name="_MON_1837861156"/>
+    <w:bookmarkEnd w:id="24"/>
+    <w:p>
+      <w:pPr>
+        <w:pStyle w:val="NoSpacing"/>
+        <w:rPr>
+          <w:lang w:val="en-US"/>
+        </w:rPr>
+      </w:pPr>
+      <w:r>
+        <w:rPr>
+          <w:lang w:val="en-US"/>
+        </w:rPr>
+        <w:object w:dxaOrig="9026" w:dyaOrig="1967" w14:anchorId="50087815">
+          <v:shape id="_x0000_i1039" type="#_x0000_t75" style="width:451.35pt;height:98.35pt" o:ole="" o:bordertopcolor="this" o:borderleftcolor="this" o:borderbottomcolor="this" o:borderrightcolor="this">
+            <v:imagedata r:id="rId45" o:title=""/>
+            <w10:bordertop type="single" width="4"/>
+            <w10:borderleft type="single" width="4"/>
+            <w10:borderbottom type="single" width="4"/>
+            <w10:borderright type="single" width="4"/>
+          </v:shape>
+          <o:OLEObject Type="Embed" ProgID="Word.OpenDocumentText.12" ShapeID="_x0000_i1039" DrawAspect="Content" ObjectID="_1837877703" r:id="rId46"/>
+        </w:object>
+      </w:r>
+    </w:p>
+    <w:p>
+      <w:pPr>
+        <w:pStyle w:val="NoSpacing"/>
+        <w:rPr>
+          <w:lang w:val="en-US"/>
+        </w:rPr>
+      </w:pPr>
+    </w:p>
+    <w:p>
+      <w:pPr>
+        <w:pStyle w:val="NoSpacing"/>
+        <w:rPr>
+          <w:lang w:val="ro-RO"/>
+        </w:rPr>
+      </w:pPr>
+      <w:r>
+        <w:rPr>
+          <w:lang w:val="en-US"/>
+        </w:rPr>
+        <w:tab/>
+        <w:t>Opera</w:t>
+      </w:r>
+      <w:r>
+        <w:rPr>
+          <w:lang w:val="ro-RO"/>
+        </w:rPr>
+        <w:t>țiile posibile pe această structură sunt</w:t>
+      </w:r>
+      <w:r>
+        <w:rPr>
+          <w:lang w:val="en-US"/>
+        </w:rPr>
+        <w:t>:</w:t>
+      </w:r>
+    </w:p>
+    <w:p>
+      <w:pPr>
+        <w:pStyle w:val="NoSpacing"/>
+        <w:rPr>
+          <w:lang w:val="ro-RO"/>
+        </w:rPr>
+      </w:pPr>
+    </w:p>
+    <w:bookmarkStart w:id="25" w:name="_MON_1837861625"/>
+    <w:bookmarkEnd w:id="25"/>
+    <w:p>
+      <w:pPr>
+        <w:pStyle w:val="NoSpacing"/>
+        <w:rPr>
+          <w:lang w:val="en-US"/>
+        </w:rPr>
+      </w:pPr>
+      <w:r>
+        <w:rPr>
+          <w:lang w:val="en-US"/>
+        </w:rPr>
+        <w:object w:dxaOrig="9026" w:dyaOrig="3372" w14:anchorId="6502F521">
+          <v:shape id="_x0000_i1040" type="#_x0000_t75" style="width:451.35pt;height:168.65pt" o:ole="" o:bordertopcolor="this" o:borderleftcolor="this" o:borderbottomcolor="this" o:borderrightcolor="this">
+            <v:imagedata r:id="rId47" o:title=""/>
+            <w10:bordertop type="single" width="4"/>
+            <w10:borderleft type="single" width="4"/>
+            <w10:borderbottom type="single" width="4"/>
+            <w10:borderright type="single" width="4"/>
+          </v:shape>
+          <o:OLEObject Type="Embed" ProgID="Word.OpenDocumentText.12" ShapeID="_x0000_i1040" DrawAspect="Content" ObjectID="_1837877704" r:id="rId48"/>
+        </w:object>
+      </w:r>
+    </w:p>
+    <w:p>
+      <w:pPr>
+        <w:rPr>
+          <w:lang w:val="en-US"/>
+        </w:rPr>
+      </w:pPr>
+      <w:r>
+        <w:rPr>
+          <w:lang w:val="en-US"/>
+        </w:rPr>
+        <w:br w:type="page"/>
+      </w:r>
+    </w:p>
+    <w:p>
+      <w:pPr>
+        <w:pStyle w:val="NoSpacing"/>
+        <w:rPr>
+          <w:rFonts w:cs="Times New Roman"/>
+          <w:lang w:val="en-US"/>
+        </w:rPr>
+      </w:pPr>
+      <w:r>
+        <w:rPr>
+          <w:rFonts w:ascii="Consolas" w:hAnsi="Consolas"/>
+          <w:lang w:val="en-US"/>
+        </w:rPr>
+        <w:lastRenderedPageBreak/>
+        <w:t>vector_sort</w:t>
+      </w:r>
+      <w:r>
+        <w:rPr>
+          <w:rFonts w:cs="Times New Roman"/>
+          <w:lang w:val="en-US"/>
+        </w:rPr>
+        <w:t xml:space="preserve"> </w:t>
+      </w:r>
+      <w:r>
+        <w:rPr>
+          <w:rFonts w:cs="Times New Roman"/>
+          <w:lang w:val="ro-RO"/>
+        </w:rPr>
+        <w:t>și</w:t>
+      </w:r>
+      <w:r>
+        <w:rPr>
+          <w:rFonts w:ascii="Consolas" w:hAnsi="Consolas"/>
+          <w:lang w:val="ro-RO"/>
+        </w:rPr>
+        <w:t xml:space="preserve"> vector_binary_search</w:t>
+      </w:r>
+      <w:r>
+        <w:rPr>
+          <w:rFonts w:cs="Times New Roman"/>
+          <w:lang w:val="ro-RO"/>
+        </w:rPr>
+        <w:t xml:space="preserve"> se folosesc de </w:t>
+      </w:r>
+      <w:r>
+        <w:rPr>
+          <w:rFonts w:ascii="Consolas" w:hAnsi="Consolas" w:cs="Times New Roman"/>
+          <w:lang w:val="ro-RO"/>
+        </w:rPr>
+        <w:t>cmp</w:t>
+      </w:r>
+      <w:r>
+        <w:rPr>
+          <w:rFonts w:cs="Times New Roman"/>
+          <w:lang w:val="ro-RO"/>
+        </w:rPr>
+        <w:t>, o funcție de comparare a elementelor din vector ce trebuie să accepte 2 variabile de tipul elementelor din vector și să returneze o variabilă de tip</w:t>
+      </w:r>
+      <w:r>
+        <w:rPr>
+          <w:rFonts w:cs="Times New Roman"/>
+          <w:lang w:val="en-US"/>
+        </w:rPr>
+        <w:t>:</w:t>
+      </w:r>
+    </w:p>
+    <w:p>
+      <w:pPr>
+        <w:pStyle w:val="NoSpacing"/>
+        <w:rPr>
+          <w:rFonts w:cs="Times New Roman"/>
+          <w:lang w:val="ro-RO"/>
+        </w:rPr>
+      </w:pPr>
+    </w:p>
+    <w:bookmarkStart w:id="26" w:name="_MON_1837862370"/>
+    <w:bookmarkEnd w:id="26"/>
+    <w:p>
+      <w:pPr>
+        <w:pStyle w:val="NoSpacing"/>
+        <w:rPr>
+          <w:lang w:val="en-US"/>
+        </w:rPr>
+      </w:pPr>
+      <w:r>
+        <w:rPr>
+          <w:lang w:val="en-US"/>
+        </w:rPr>
+        <w:object w:dxaOrig="9026" w:dyaOrig="1686" w14:anchorId="32856A70">
+          <v:shape id="_x0000_i1041" type="#_x0000_t75" style="width:451.35pt;height:84.35pt" o:ole="" o:bordertopcolor="this" o:borderleftcolor="this" o:borderbottomcolor="this" o:borderrightcolor="this">
+            <v:imagedata r:id="rId49" o:title=""/>
+            <w10:bordertop type="single" width="4"/>
+            <w10:borderleft type="single" width="4"/>
+            <w10:borderbottom type="single" width="4"/>
+            <w10:borderright type="single" width="4"/>
+          </v:shape>
+          <o:OLEObject Type="Embed" ProgID="Word.OpenDocumentText.12" ShapeID="_x0000_i1041" DrawAspect="Content" ObjectID="_1837877705" r:id="rId50"/>
+        </w:object>
+      </w:r>
+    </w:p>
+    <w:p>
+      <w:pPr>
+        <w:pStyle w:val="NoSpacing"/>
+        <w:rPr>
+          <w:lang w:val="en-US"/>
+        </w:rPr>
+      </w:pPr>
+    </w:p>
+    <w:p>
+      <w:pPr>
+        <w:pStyle w:val="NoSpacing"/>
+        <w:rPr>
+          <w:rFonts w:cs="Times New Roman"/>
+          <w:lang w:val="en-US"/>
+        </w:rPr>
+      </w:pPr>
+      <w:r>
+        <w:rPr>
+          <w:lang w:val="en-US"/>
+        </w:rPr>
+        <w:tab/>
+      </w:r>
+      <w:r>
+        <w:rPr>
+          <w:rFonts w:ascii="Consolas" w:hAnsi="Consolas"/>
+          <w:lang w:val="en-US"/>
+        </w:rPr>
+        <w:t>vector_sort</w:t>
+      </w:r>
+      <w:r>
+        <w:rPr>
+          <w:rFonts w:cs="Times New Roman"/>
+          <w:lang w:val="en-US"/>
+        </w:rPr>
+        <w:t xml:space="preserve"> va </w:t>
+      </w:r>
+      <w:r>
+        <w:rPr>
+          <w:rFonts w:cs="Times New Roman"/>
+          <w:lang w:val="en-US"/>
+        </w:rPr>
+        <w:t>interschimba</w:t>
+      </w:r>
+      <w:r>
+        <w:rPr>
+          <w:rFonts w:cs="Times New Roman"/>
+          <w:lang w:val="en-US"/>
+        </w:rPr>
+        <w:t xml:space="preserve"> elemente dacă</w:t>
+      </w:r>
+      <w:r>
+        <w:rPr>
+          <w:rFonts w:cs="Times New Roman"/>
+          <w:lang w:val="en-US"/>
+        </w:rPr>
+        <w:t xml:space="preserve"> </w:t>
+      </w:r>
+      <w:r>
+        <w:rPr>
+          <w:rFonts w:ascii="Consolas" w:hAnsi="Consolas" w:cs="Times New Roman"/>
+          <w:lang w:val="en-US"/>
+        </w:rPr>
+        <w:t>cmp</w:t>
+      </w:r>
+      <w:r>
+        <w:rPr>
+          <w:rFonts w:cs="Times New Roman"/>
+          <w:lang w:val="en-US"/>
+        </w:rPr>
+        <w:t xml:space="preserve"> returnează </w:t>
+      </w:r>
+      <w:r>
+        <w:rPr>
+          <w:rFonts w:ascii="Consolas" w:hAnsi="Consolas" w:cs="Times New Roman"/>
+          <w:lang w:val="en-US"/>
+        </w:rPr>
+        <w:t>ENN_SMALLER</w:t>
+      </w:r>
+      <w:r>
+        <w:rPr>
+          <w:rFonts w:cs="Times New Roman"/>
+          <w:lang w:val="en-US"/>
+        </w:rPr>
+        <w:t>.</w:t>
+      </w:r>
+    </w:p>
+    <w:p>
+      <w:pPr>
+        <w:pStyle w:val="NoSpacing"/>
+        <w:rPr>
+          <w:rFonts w:cs="Times New Roman"/>
+          <w:lang w:val="en-US"/>
+        </w:rPr>
+      </w:pPr>
+    </w:p>
+    <w:p>
+      <w:pPr>
+        <w:pStyle w:val="NoSpacing"/>
+        <w:rPr>
+          <w:rFonts w:cs="Times New Roman"/>
+          <w:lang w:val="en-US"/>
+        </w:rPr>
+      </w:pPr>
+      <w:r>
+        <w:rPr>
+          <w:rFonts w:cs="Times New Roman"/>
+          <w:lang w:val="en-US"/>
+        </w:rPr>
+        <w:tab/>
+        <w:t>Pe lângă aceste structuri, biblioteca oferă și o modalitate de a interschimba 2 variabile, indiferent de tipul lor:</w:t>
+      </w:r>
+    </w:p>
+    <w:p>
+      <w:pPr>
+        <w:pStyle w:val="NoSpacing"/>
+        <w:rPr>
+          <w:rFonts w:cs="Times New Roman"/>
+          <w:lang w:val="ro-RO"/>
+        </w:rPr>
+      </w:pPr>
+    </w:p>
+    <w:bookmarkStart w:id="27" w:name="_MON_1837862718"/>
+    <w:bookmarkEnd w:id="27"/>
+    <w:p>
+      <w:pPr>
+        <w:pStyle w:val="NoSpacing"/>
+        <w:rPr>
+          <w:lang w:val="en-US"/>
+        </w:rPr>
+      </w:pPr>
+      <w:r>
+        <w:rPr>
+          <w:lang w:val="en-US"/>
+        </w:rPr>
+        <w:object w:dxaOrig="9026" w:dyaOrig="3239" w14:anchorId="7C6C1D17">
+          <v:shape id="_x0000_i1042" type="#_x0000_t75" style="width:451.35pt;height:162pt" o:ole="" o:bordertopcolor="this" o:borderleftcolor="this" o:borderbottomcolor="this" o:borderrightcolor="this">
+            <v:imagedata r:id="rId51" o:title=""/>
+            <w10:bordertop type="single" width="4"/>
+            <w10:borderleft type="single" width="4"/>
+            <w10:borderbottom type="single" width="4"/>
+            <w10:borderright type="single" width="4"/>
+          </v:shape>
+          <o:OLEObject Type="Embed" ProgID="Word.OpenDocumentText.12" ShapeID="_x0000_i1042" DrawAspect="Content" ObjectID="_1837877706" r:id="rId52"/>
+        </w:object>
+      </w:r>
+    </w:p>
+    <w:p>
+      <w:pPr>
+        <w:rPr>
+          <w:lang w:val="en-US"/>
+        </w:rPr>
+      </w:pPr>
+      <w:r>
+        <w:rPr>
+          <w:lang w:val="en-US"/>
+        </w:rPr>
+        <w:br w:type="page"/>
+      </w:r>
+    </w:p>
+    <w:p>
+      <w:pPr>
+        <w:pStyle w:val="Subtitle"/>
+        <w:rPr>
+          <w:lang w:val="ro-RO"/>
+        </w:rPr>
+      </w:pPr>
+      <w:r>
+        <w:rPr>
+          <w:lang w:val="ro-RO"/>
+        </w:rPr>
+        <w:lastRenderedPageBreak/>
+        <w:t>Structuri matematice</w:t>
+      </w:r>
+    </w:p>
+    <w:p>
+      <w:pPr>
+        <w:pStyle w:val="NoSpacing"/>
+        <w:rPr>
+          <w:lang w:val="ro-RO"/>
+        </w:rPr>
+      </w:pPr>
+      <w:r>
+        <w:rPr>
+          <w:lang w:val="ro-RO"/>
+        </w:rPr>
+        <w:tab/>
+        <w:t>Acest modul definește structuri de vectori și matrici matematice pentru fiecare tip de date. Spre exemplu</w:t>
+      </w:r>
+      <w:r>
+        <w:rPr>
+          <w:lang w:val="en-US"/>
+        </w:rPr>
+        <w:t>:</w:t>
+      </w:r>
+    </w:p>
+    <w:p>
+      <w:pPr>
+        <w:pStyle w:val="NoSpacing"/>
+        <w:rPr>
+          <w:lang w:val="ro-RO"/>
+        </w:rPr>
+      </w:pPr>
+      <w:r>
+        <w:rPr>
+          <w:lang w:val="ro-RO"/>
+        </w:rPr>
+        <w:tab/>
+      </w:r>
+    </w:p>
+    <w:bookmarkStart w:id="28" w:name="_MON_1837863191"/>
+    <w:bookmarkEnd w:id="28"/>
+    <w:p>
+      <w:pPr>
+        <w:pStyle w:val="NoSpacing"/>
+        <w:rPr>
+          <w:lang w:val="en-US"/>
+        </w:rPr>
+      </w:pPr>
+      <w:r>
+        <w:rPr>
+          <w:lang w:val="en-US"/>
+        </w:rPr>
+        <w:object w:dxaOrig="9026" w:dyaOrig="1031" w14:anchorId="3EB73B57">
+          <v:shape id="_x0000_i1043" type="#_x0000_t75" style="width:451.35pt;height:51.65pt" o:ole="" o:bordertopcolor="this" o:borderleftcolor="this" o:borderbottomcolor="this" o:borderrightcolor="this">
+            <v:imagedata r:id="rId53" o:title=""/>
+            <w10:bordertop type="single" width="4"/>
+            <w10:borderleft type="single" width="4"/>
+            <w10:borderbottom type="single" width="4"/>
+            <w10:borderright type="single" width="4"/>
+          </v:shape>
+          <o:OLEObject Type="Embed" ProgID="Word.OpenDocumentText.12" ShapeID="_x0000_i1043" DrawAspect="Content" ObjectID="_1837877707" r:id="rId54"/>
+        </w:object>
+      </w:r>
+    </w:p>
+    <w:p>
+      <w:pPr>
+        <w:pStyle w:val="NoSpacing"/>
+        <w:rPr>
+          <w:lang w:val="en-US"/>
+        </w:rPr>
+      </w:pPr>
+    </w:p>
+    <w:p>
+      <w:pPr>
+        <w:pStyle w:val="Subtitle"/>
+        <w:rPr>
+          <w:lang w:val="ro-RO"/>
+        </w:rPr>
+      </w:pPr>
+      <w:r>
+        <w:rPr>
+          <w:lang w:val="ro-RO"/>
+        </w:rPr>
+        <w:t>Subprograme paralele</w:t>
+      </w:r>
+    </w:p>
+    <w:p>
+      <w:pPr>
+        <w:pStyle w:val="NoSpacing"/>
+        <w:rPr>
+          <w:lang w:val="ro-RO"/>
+        </w:rPr>
+      </w:pPr>
+      <w:r>
+        <w:rPr>
+          <w:lang w:val="ro-RO"/>
+        </w:rPr>
+        <w:tab/>
+        <w:t>Subprogramele paralele sau threadurile sunt un subcapitol complex al informaticii. Deoarece această aplicație nu se folosește de ele, nu le vom prezenta în această lucrare.</w:t>
+      </w:r>
+    </w:p>
+    <w:p>
+      <w:pPr>
+        <w:pStyle w:val="NoSpacing"/>
+        <w:rPr>
+          <w:lang w:val="ro-RO"/>
+        </w:rPr>
+      </w:pPr>
+    </w:p>
+    <w:p>
+      <w:pPr>
+        <w:pStyle w:val="Subtitle"/>
+        <w:rPr>
+          <w:lang w:val="ro-RO"/>
+        </w:rPr>
+      </w:pPr>
+      <w:r>
+        <w:rPr>
+          <w:lang w:val="ro-RO"/>
+        </w:rPr>
+        <w:t>Directoare și fișiere</w:t>
+      </w:r>
+    </w:p>
+    <w:p>
+      <w:pPr>
+        <w:pStyle w:val="NoSpacing"/>
+        <w:rPr>
+          <w:lang w:val="ro-RO"/>
+        </w:rPr>
+      </w:pPr>
+      <w:r>
+        <w:rPr>
+          <w:lang w:val="ro-RO"/>
+        </w:rPr>
+        <w:tab/>
+        <w:t>Acest modul conține câteva utilitare folositoare pentru lucrul cu directoare și citirea integrală a unui fișier sau scrierea unuia.</w:t>
+      </w:r>
+    </w:p>
+    <w:p>
+      <w:pPr>
+        <w:pStyle w:val="NoSpacing"/>
+        <w:rPr>
+          <w:lang w:val="ro-RO"/>
+        </w:rPr>
+      </w:pPr>
+      <w:r>
+        <w:rPr>
+          <w:lang w:val="ro-RO"/>
+        </w:rPr>
+        <w:tab/>
+      </w:r>
+    </w:p>
+    <w:bookmarkStart w:id="29" w:name="_MON_1837865696"/>
+    <w:bookmarkEnd w:id="29"/>
+    <w:p>
+      <w:pPr>
+        <w:pStyle w:val="NoSpacing"/>
+        <w:rPr>
+          <w:lang w:val="en-US"/>
+        </w:rPr>
+      </w:pPr>
+      <w:r>
+        <w:rPr>
+          <w:lang w:val="en-US"/>
+        </w:rPr>
+        <w:object w:dxaOrig="9026" w:dyaOrig="2543" w14:anchorId="52BBFB16">
+          <v:shape id="_x0000_i1044" type="#_x0000_t75" style="width:451.35pt;height:127pt" o:ole="" o:bordertopcolor="this" o:borderleftcolor="this" o:borderbottomcolor="this" o:borderrightcolor="this">
+            <v:imagedata r:id="rId55" o:title=""/>
+            <w10:bordertop type="single" width="4"/>
+            <w10:borderleft type="single" width="4"/>
+            <w10:borderbottom type="single" width="4"/>
+            <w10:borderright type="single" width="4"/>
+          </v:shape>
+          <o:OLEObject Type="Embed" ProgID="Word.OpenDocumentText.12" ShapeID="_x0000_i1044" DrawAspect="Content" ObjectID="_1837877708" r:id="rId56"/>
+        </w:object>
+      </w:r>
+    </w:p>
+    <w:p>
+      <w:pPr>
+        <w:pStyle w:val="NoSpacing"/>
+        <w:rPr>
+          <w:lang w:val="en-US"/>
+        </w:rPr>
+      </w:pPr>
+    </w:p>
+    <w:p>
+      <w:pPr>
+        <w:pStyle w:val="Subtitle"/>
+        <w:rPr>
+          <w:lang w:val="en-US"/>
+        </w:rPr>
+      </w:pPr>
+      <w:r>
+        <w:rPr>
+          <w:lang w:val="en-US"/>
+        </w:rPr>
+        <w:t>Serializare text</w:t>
+      </w:r>
+    </w:p>
+    <w:p>
+      <w:pPr>
+        <w:pStyle w:val="NoSpacing"/>
+        <w:rPr>
+          <w:lang w:val="ro-RO"/>
+        </w:rPr>
+      </w:pPr>
+      <w:r>
+        <w:rPr>
+          <w:lang w:val="en-US"/>
+        </w:rPr>
+        <w:tab/>
+        <w:t xml:space="preserve">Serializarea este procesul prin care date structurate sunt transformate </w:t>
+      </w:r>
+      <w:r>
+        <w:rPr>
+          <w:lang w:val="ro-RO"/>
+        </w:rPr>
+        <w:t xml:space="preserve">într-un format </w:t>
+      </w:r>
+      <w:r>
+        <w:rPr>
+          <w:lang w:val="ro-RO"/>
+        </w:rPr>
+        <w:t>pentru memorare îndelungată, din care pot fi reconstruite</w:t>
+      </w:r>
+      <w:r>
+        <w:rPr>
+          <w:lang w:val="ro-RO"/>
+        </w:rPr>
+        <w:t>.</w:t>
+      </w:r>
+      <w:r>
+        <w:rPr>
+          <w:lang w:val="ro-RO"/>
+        </w:rPr>
+        <w:t xml:space="preserve"> Pentru a asigura integritatea datelor, acest modul se folosește de serializarea text, spre deosebire de cea binară.</w:t>
+      </w:r>
+    </w:p>
+    <w:p>
+      <w:pPr>
+        <w:pStyle w:val="NoSpacing"/>
+        <w:rPr>
+          <w:lang w:val="en-US"/>
+        </w:rPr>
+      </w:pPr>
+      <w:r>
+        <w:rPr>
+          <w:lang w:val="ro-RO"/>
+        </w:rPr>
+        <w:tab/>
+        <w:t xml:space="preserve">Programul citește și scrie fișiere cu extensia </w:t>
+      </w:r>
+      <w:r>
+        <w:rPr>
+          <w:i/>
+          <w:iCs/>
+          <w:lang w:val="ro-RO"/>
+        </w:rPr>
+        <w:t>.enn</w:t>
+      </w:r>
+      <w:r>
+        <w:rPr>
+          <w:lang w:val="ro-RO"/>
+        </w:rPr>
+        <w:t xml:space="preserve">, structura </w:t>
+      </w:r>
+      <w:r>
+        <w:rPr>
+          <w:lang w:val="ro-RO"/>
+        </w:rPr>
+        <w:t xml:space="preserve">datelor </w:t>
+      </w:r>
+      <w:r>
+        <w:rPr>
+          <w:lang w:val="ro-RO"/>
+        </w:rPr>
+        <w:t>se bazează pe un arbore cu rădăcină. Fiecare nod al arborelui este format dintr-un șir de caractere, reprezentând cheia prin care este identificat și o valoare ce poate fi</w:t>
+      </w:r>
+      <w:r>
+        <w:rPr>
+          <w:lang w:val="en-US"/>
+        </w:rPr>
+        <w:t xml:space="preserve">: </w:t>
+      </w:r>
+      <w:r>
+        <w:rPr>
+          <w:lang w:val="ro-RO"/>
+        </w:rPr>
+        <w:t>un șir de caractere, o valoare întreagă, o valoare reală, o listă de noduri.</w:t>
+      </w:r>
+    </w:p>
+    <w:p>
+      <w:pPr>
+        <w:pStyle w:val="NoSpacing"/>
+        <w:rPr>
+          <w:lang w:val="ro-RO"/>
+        </w:rPr>
+      </w:pPr>
+    </w:p>
+    <w:bookmarkStart w:id="30" w:name="_MON_1837873183"/>
+    <w:bookmarkEnd w:id="30"/>
+    <w:p>
+      <w:pPr>
+        <w:pStyle w:val="NoSpacing"/>
+        <w:rPr>
+          <w:lang w:val="en-US"/>
+        </w:rPr>
+      </w:pPr>
+      <w:r>
+        <w:rPr>
+          <w:lang w:val="en-US"/>
+        </w:rPr>
+        <w:object w:dxaOrig="9026" w:dyaOrig="3091" w14:anchorId="678539CD">
+          <v:shape id="_x0000_i1045" type="#_x0000_t75" style="width:451.35pt;height:154.65pt" o:ole="" o:bordertopcolor="this" o:borderleftcolor="this" o:borderbottomcolor="this" o:borderrightcolor="this">
+            <v:imagedata r:id="rId57" o:title=""/>
+            <w10:bordertop type="single" width="4"/>
+            <w10:borderleft type="single" width="4"/>
+            <w10:borderbottom type="single" width="4"/>
+            <w10:borderright type="single" width="4"/>
+          </v:shape>
+          <o:OLEObject Type="Embed" ProgID="Word.OpenDocumentText.12" ShapeID="_x0000_i1045" DrawAspect="Content" ObjectID="_1837877709" r:id="rId58"/>
+        </w:object>
+      </w:r>
+    </w:p>
+    <w:p>
+      <w:pPr>
+        <w:pStyle w:val="NoSpacing"/>
+        <w:rPr>
+          <w:lang w:val="en-US"/>
+        </w:rPr>
+      </w:pPr>
+      <w:r>
+        <w:rPr>
+          <w:lang w:val="en-US"/>
+        </w:rPr>
+        <w:lastRenderedPageBreak/>
+        <w:tab/>
+        <w:t>Fiecare nod poate fi accesat printr-o cale reprezentat</w:t>
+      </w:r>
+      <w:r>
+        <w:rPr>
+          <w:lang w:val="ro-RO"/>
+        </w:rPr>
+        <w:t xml:space="preserve">ă de o succesiune de chei separate prin caracterul „ </w:t>
+      </w:r>
+      <w:r>
+        <w:rPr>
+          <w:lang w:val="en-US"/>
+        </w:rPr>
+        <w:t>|</w:t>
+      </w:r>
+      <w:r>
+        <w:rPr>
+          <w:lang w:val="ro-RO"/>
+        </w:rPr>
+        <w:t xml:space="preserve"> ”. </w:t>
+      </w:r>
+      <w:r>
+        <w:rPr>
+          <w:lang w:val="ro-RO"/>
+        </w:rPr>
+        <w:t xml:space="preserve">Operațiile posibile pentru fiecare nod din acest format sunt </w:t>
+      </w:r>
+      <w:r>
+        <w:rPr>
+          <w:rFonts w:ascii="Consolas" w:hAnsi="Consolas"/>
+          <w:lang w:val="ro-RO"/>
+        </w:rPr>
+        <w:t>put</w:t>
+      </w:r>
+      <w:r>
+        <w:rPr>
+          <w:lang w:val="ro-RO"/>
+        </w:rPr>
+        <w:t xml:space="preserve"> și </w:t>
+      </w:r>
+      <w:r>
+        <w:rPr>
+          <w:rFonts w:ascii="Consolas" w:hAnsi="Consolas"/>
+          <w:lang w:val="ro-RO"/>
+        </w:rPr>
+        <w:t>get</w:t>
+      </w:r>
+      <w:r>
+        <w:rPr>
+          <w:lang w:val="ro-RO"/>
+        </w:rPr>
+        <w:t xml:space="preserve">. </w:t>
+      </w:r>
+      <w:r>
+        <w:rPr>
+          <w:lang w:val="ro-RO"/>
+        </w:rPr>
+        <w:t>Spre exemplu</w:t>
+      </w:r>
+      <w:r>
+        <w:rPr>
+          <w:lang w:val="en-US"/>
+        </w:rPr>
+        <w:t>:</w:t>
+      </w:r>
+    </w:p>
+    <w:p>
+      <w:pPr>
+        <w:pStyle w:val="NoSpacing"/>
+        <w:rPr>
+          <w:lang w:val="en-US"/>
+        </w:rPr>
+      </w:pPr>
+    </w:p>
+    <w:bookmarkStart w:id="31" w:name="_MON_1837873955"/>
+    <w:bookmarkEnd w:id="31"/>
+    <w:p>
+      <w:pPr>
+        <w:pStyle w:val="NoSpacing"/>
+        <w:rPr>
+          <w:lang w:val="en-US"/>
+        </w:rPr>
+      </w:pPr>
+      <w:r>
+        <w:rPr>
+          <w:lang w:val="en-US"/>
+        </w:rPr>
+        <w:object w:dxaOrig="9026" w:dyaOrig="843" w14:anchorId="73E55CA8">
+          <v:shape id="_x0000_i1046" type="#_x0000_t75" style="width:451.35pt;height:42pt" o:ole="" o:bordertopcolor="this" o:borderleftcolor="this" o:borderbottomcolor="this" o:borderrightcolor="this">
+            <v:imagedata r:id="rId59" o:title=""/>
+            <w10:bordertop type="single" width="4"/>
+            <w10:borderleft type="single" width="4"/>
+            <w10:borderbottom type="single" width="4"/>
+            <w10:borderright type="single" width="4"/>
+          </v:shape>
+          <o:OLEObject Type="Embed" ProgID="Word.OpenDocumentText.12" ShapeID="_x0000_i1046" DrawAspect="Content" ObjectID="_1837877710" r:id="rId60"/>
+        </w:object>
+      </w:r>
+    </w:p>
+    <w:p>
+      <w:pPr>
+        <w:pStyle w:val="NoSpacing"/>
+        <w:rPr>
+          <w:lang w:val="en-US"/>
+        </w:rPr>
+      </w:pPr>
+    </w:p>
+    <w:p>
+      <w:pPr>
+        <w:pStyle w:val="NoSpacing"/>
+        <w:rPr>
+          <w:lang w:val="ro-RO"/>
+        </w:rPr>
+      </w:pPr>
+      <w:r>
+        <w:rPr>
+          <w:lang w:val="en-US"/>
+        </w:rPr>
+        <w:tab/>
+        <w:t>Aceste opera</w:t>
+      </w:r>
+      <w:r>
+        <w:rPr>
+          <w:lang w:val="ro-RO"/>
+        </w:rPr>
+        <w:t>ții vor rezulta</w:t>
+      </w:r>
+      <w:r>
+        <w:rPr>
+          <w:lang w:val="ro-RO"/>
+        </w:rPr>
+        <w:t>, în urma scrierii, într-un fișier ce conține</w:t>
+      </w:r>
+      <w:r>
+        <w:rPr>
+          <w:lang w:val="en-US"/>
+        </w:rPr>
+        <w:t>:</w:t>
+      </w:r>
+    </w:p>
+    <w:p>
+      <w:pPr>
+        <w:pStyle w:val="NoSpacing"/>
+        <w:rPr>
+          <w:lang w:val="ro-RO"/>
+        </w:rPr>
+      </w:pPr>
+    </w:p>
+    <w:bookmarkStart w:id="32" w:name="_MON_1837874127"/>
+    <w:bookmarkEnd w:id="32"/>
+    <w:p>
+      <w:pPr>
+        <w:pStyle w:val="NoSpacing"/>
+        <w:rPr>
+          <w:lang w:val="en-US"/>
+        </w:rPr>
+      </w:pPr>
+      <w:r>
+        <w:rPr>
+          <w:lang w:val="en-US"/>
+        </w:rPr>
+        <w:object w:dxaOrig="9026" w:dyaOrig="2529" w14:anchorId="5A57E5A3">
+          <v:shape id="_x0000_i1047" type="#_x0000_t75" style="width:451.35pt;height:126.35pt" o:ole="" o:bordertopcolor="this" o:borderleftcolor="this" o:borderbottomcolor="this" o:borderrightcolor="this">
+            <v:imagedata r:id="rId61" o:title=""/>
+            <w10:bordertop type="single" width="4"/>
+            <w10:borderleft type="single" width="4"/>
+            <w10:borderbottom type="single" width="4"/>
+            <w10:borderright type="single" width="4"/>
+          </v:shape>
+          <o:OLEObject Type="Embed" ProgID="Word.OpenDocumentText.12" ShapeID="_x0000_i1047" DrawAspect="Content" ObjectID="_1837877711" r:id="rId62"/>
+        </w:object>
+      </w:r>
+    </w:p>
+    <w:p>
+      <w:pPr>
+        <w:pStyle w:val="NoSpacing"/>
+        <w:rPr>
+          <w:lang w:val="en-US"/>
+        </w:rPr>
+      </w:pPr>
+      <w:r>
+        <w:rPr>
+          <w:lang w:val="en-US"/>
+        </w:rPr>
+        <w:tab/>
+      </w:r>
+    </w:p>
+    <w:p>
+      <w:pPr>
+        <w:pStyle w:val="NoSpacing"/>
+        <w:rPr>
+          <w:lang w:val="ro-RO"/>
+        </w:rPr>
+      </w:pPr>
+      <w:r>
+        <w:rPr>
+          <w:lang w:val="en-US"/>
+        </w:rPr>
+        <w:tab/>
+        <w:t>Se observ</w:t>
+      </w:r>
+      <w:r>
+        <w:rPr>
+          <w:lang w:val="ro-RO"/>
+        </w:rPr>
+        <w:t>ă faptul că cheile fiecărui nod nu trebuie să fie unice, dar căile complete către fiecare nod sunt, dacă două elemente sunt scrise cu aceeași cale programul va suprascrie ultima valoare specificată.</w:t>
+      </w:r>
+    </w:p>
+    <w:p>
+      <w:pPr>
+        <w:pStyle w:val="NoSpacing"/>
+        <w:rPr>
+          <w:lang w:val="ro-RO"/>
+        </w:rPr>
+      </w:pPr>
+      <w:r>
+        <w:rPr>
+          <w:lang w:val="ro-RO"/>
+        </w:rPr>
+        <w:tab/>
+        <w:t>Funcțiile ce prelucrează acest format de serializare sunt</w:t>
+      </w:r>
+      <w:r>
+        <w:rPr>
+          <w:lang w:val="en-US"/>
+        </w:rPr>
+        <w:t>:</w:t>
+      </w:r>
+    </w:p>
+    <w:p>
+      <w:pPr>
+        <w:pStyle w:val="NoSpacing"/>
+        <w:rPr>
+          <w:lang w:val="ro-RO"/>
+        </w:rPr>
+      </w:pPr>
+    </w:p>
+    <w:bookmarkStart w:id="33" w:name="_MON_1837874618"/>
+    <w:bookmarkEnd w:id="33"/>
+    <w:p>
+      <w:pPr>
+        <w:rPr>
+          <w:lang w:val="ro-RO"/>
+        </w:rPr>
+      </w:pPr>
+      <w:r>
+        <w:rPr>
+          <w:lang w:val="en-US"/>
+        </w:rPr>
+        <w:object w:dxaOrig="9026" w:dyaOrig="3349" w14:anchorId="2CF35EDE">
+          <v:shape id="_x0000_i1048" type="#_x0000_t75" style="width:451.35pt;height:167.35pt" o:ole="" o:bordertopcolor="this" o:borderleftcolor="this" o:borderbottomcolor="this" o:borderrightcolor="this">
+            <v:imagedata r:id="rId63" o:title=""/>
+            <w10:bordertop type="single" width="4"/>
+            <w10:borderleft type="single" width="4"/>
+            <w10:borderbottom type="single" width="4"/>
+            <w10:borderright type="single" width="4"/>
+          </v:shape>
+          <o:OLEObject Type="Embed" ProgID="Word.OpenDocumentText.12" ShapeID="_x0000_i1048" DrawAspect="Content" ObjectID="_1837877712" r:id="rId64"/>
+        </w:object>
+      </w:r>
+    </w:p>
+    <w:p>
+      <w:pPr>
+        <w:rPr>
+          <w:lang w:val="en-US"/>
+        </w:rPr>
+      </w:pPr>
+      <w:r>
+        <w:rPr>
+          <w:lang w:val="en-US"/>
+        </w:rPr>
+        <w:br w:type="page"/>
+      </w:r>
+    </w:p>
+    <w:p>
+      <w:pPr>
+        <w:pStyle w:val="Heading3"/>
+        <w:rPr>
+          <w:lang w:val="ro-RO"/>
+        </w:rPr>
+      </w:pPr>
+      <w:r>
+        <w:lastRenderedPageBreak/>
         <w:t>II.1.2. Opțional</w:t>
       </w:r>
-      <w:r>
-        <w:rPr>
-          <w:lang w:val="ro-RO"/>
-        </w:rPr>
-        <w:t xml:space="preserve"> </w:t>
+    </w:p>
+    <w:p>
+      <w:pPr>
+        <w:pStyle w:val="NoSpacing"/>
+        <w:rPr>
+          <w:lang w:val="ro-RO"/>
+        </w:rPr>
+      </w:pPr>
+      <w:r>
+        <w:rPr>
+          <w:lang w:val="ro-RO"/>
+        </w:rPr>
+        <w:tab/>
+        <w:t>Partea opțională a nucleului include module pentru a lucra cu contexte grafice. Modulele acestei biblioteci sunt</w:t>
+      </w:r>
+      <w:r>
+        <w:rPr>
+          <w:lang w:val="en-US"/>
+        </w:rPr>
+        <w:t>:</w:t>
+      </w:r>
+      <w:r>
+        <w:rPr>
+          <w:lang w:val="ro-RO"/>
+        </w:rPr>
+        <w:t xml:space="preserve"> Sistemul de Layere, Sistemul de Evenimente, Sistemul de Panouri.</w:t>
+      </w:r>
+    </w:p>
+    <w:p>
+      <w:pPr>
+        <w:pStyle w:val="NoSpacing"/>
+        <w:rPr>
+          <w:lang w:val="ro-RO"/>
+        </w:rPr>
+      </w:pPr>
+    </w:p>
+    <w:p>
+      <w:pPr>
+        <w:pStyle w:val="Subtitle"/>
+        <w:rPr>
+          <w:lang w:val="ro-RO"/>
+        </w:rPr>
+      </w:pPr>
+      <w:r>
+        <w:rPr>
+          <w:lang w:val="ro-RO"/>
+        </w:rPr>
+        <w:t>Sistemul de Layere</w:t>
+      </w:r>
+    </w:p>
+    <w:p>
+      <w:pPr>
+        <w:pStyle w:val="NoSpacing"/>
+        <w:rPr>
+          <w:lang w:val="en-US"/>
+        </w:rPr>
+      </w:pPr>
+      <w:r>
+        <w:rPr>
+          <w:lang w:val="ro-RO"/>
+        </w:rPr>
+        <w:tab/>
+      </w:r>
+      <w:r>
+        <w:rPr>
+          <w:lang w:val="ro-RO"/>
+        </w:rPr>
+        <w:t>Organizarea elementelor unei aplicații grafice</w:t>
+      </w:r>
+      <w:r>
+        <w:rPr>
+          <w:lang w:val="ro-RO"/>
+        </w:rPr>
+        <w:t xml:space="preserve"> poate fi realizată în mai multe moduri. Această bibliotecă folosește un sistem de layere sau straturi. </w:t>
+      </w:r>
+      <w:r>
+        <w:rPr>
+          <w:lang w:val="ro-RO"/>
+        </w:rPr>
+        <w:t xml:space="preserve">Fiecare strat </w:t>
       </w:r>
     </w:p>
     <w:p>
       <w:pPr>
         <w:pStyle w:val="Heading2"/>
       </w:pPr>
-      <w:bookmarkStart w:id="21" w:name="_II.2._Aplicație"/>
-      <w:bookmarkStart w:id="22" w:name="_Toc227084078"/>
-      <w:bookmarkEnd w:id="21"/>
+      <w:bookmarkStart w:id="34" w:name="_II.2._Aplicație"/>
+      <w:bookmarkStart w:id="35" w:name="_Toc227084078"/>
+      <w:bookmarkEnd w:id="34"/>
       <w:r>
         <w:t>II.2. Aplicație</w:t>
       </w:r>
-      <w:bookmarkEnd w:id="22"/>
+      <w:bookmarkEnd w:id="35"/>
     </w:p>
     <w:p>
       <w:pPr>
         <w:pStyle w:val="Heading1"/>
       </w:pPr>
-      <w:bookmarkStart w:id="23" w:name="_Toc227084079"/>
+      <w:bookmarkStart w:id="36" w:name="_Toc227084079"/>
       <w:r>
         <w:t>III. Detalii tehnice</w:t>
       </w:r>
-      <w:bookmarkEnd w:id="23"/>
+      <w:bookmarkEnd w:id="36"/>
     </w:p>
     <w:p/>
     <w:sectPr>
-      <w:footerReference w:type="first" r:id="rId39"/>
+      <w:footerReference w:type="first" r:id="rId65"/>
       <w:pgSz w:w="11906" w:h="16838"/>
       <w:pgMar w:top="1440" w:right="1440" w:bottom="1440" w:left="1440" w:header="709" w:footer="708" w:gutter="0"/>
       <w:pgNumType w:start="3"/>
@@ -7474,6 +8961,33 @@
         </a:p>
       </dgm:t>
     </dgm:pt>
+    <dgm:pt modelId="{AA5B74FF-56D6-48F0-8C85-A7B37F700C66}">
+      <dgm:prSet/>
+      <dgm:spPr/>
+      <dgm:t>
+        <a:bodyPr/>
+        <a:lstStyle/>
+        <a:p>
+          <a:r>
+            <a:rPr lang="en-US">
+              <a:latin typeface="Consolas" panose="020B0609020204030204" pitchFamily="49" charset="0"/>
+            </a:rPr>
+            <a:t>Config</a:t>
+          </a:r>
+          <a:endParaRPr lang="LID4096">
+            <a:latin typeface="Consolas" panose="020B0609020204030204" pitchFamily="49" charset="0"/>
+          </a:endParaRPr>
+        </a:p>
+      </dgm:t>
+    </dgm:pt>
+    <dgm:pt modelId="{C9D760A4-5FE7-4C3D-863F-AB057E218401}" type="parTrans" cxnId="{FCBC1C74-763B-4165-9B7F-4E446064CAB3}">
+      <dgm:prSet/>
+      <dgm:spPr/>
+    </dgm:pt>
+    <dgm:pt modelId="{007225E3-B4E9-4248-B4D4-50B03A6EA4F3}" type="sibTrans" cxnId="{FCBC1C74-763B-4165-9B7F-4E446064CAB3}">
+      <dgm:prSet/>
+      <dgm:spPr/>
+    </dgm:pt>
     <dgm:pt modelId="{92F78CD7-8E96-460D-A8B6-D214295679C1}" type="pres">
       <dgm:prSet presAssocID="{F9335119-39F8-4447-87FC-F5554F3E9ACF}" presName="hierChild1" presStyleCnt="0">
         <dgm:presLayoutVars>
@@ -7596,7 +9110,7 @@
       <dgm:spPr/>
     </dgm:pt>
     <dgm:pt modelId="{CCA81168-0189-41BA-A46C-64692F98151F}" type="pres">
-      <dgm:prSet presAssocID="{0F3F8333-32C1-4083-97B5-089972BBECF9}" presName="Name37" presStyleLbl="parChTrans1D3" presStyleIdx="0" presStyleCnt="5"/>
+      <dgm:prSet presAssocID="{0F3F8333-32C1-4083-97B5-089972BBECF9}" presName="Name37" presStyleLbl="parChTrans1D3" presStyleIdx="0" presStyleCnt="6"/>
       <dgm:spPr/>
     </dgm:pt>
     <dgm:pt modelId="{EE94C1F9-D7BC-48D7-BD8F-ABDEC796115E}" type="pres">
@@ -7612,7 +9126,7 @@
       <dgm:spPr/>
     </dgm:pt>
     <dgm:pt modelId="{09EE6FDB-B20C-48EA-83D5-F9E144629EC7}" type="pres">
-      <dgm:prSet presAssocID="{F4625E5F-F398-4DC3-90B3-89D847C1B4D2}" presName="rootText" presStyleLbl="node3" presStyleIdx="0" presStyleCnt="5" custScaleX="31864" custScaleY="31864">
+      <dgm:prSet presAssocID="{F4625E5F-F398-4DC3-90B3-89D847C1B4D2}" presName="rootText" presStyleLbl="node3" presStyleIdx="0" presStyleCnt="6" custScaleX="31864" custScaleY="31864">
         <dgm:presLayoutVars>
           <dgm:chPref val="3"/>
         </dgm:presLayoutVars>
@@ -7624,7 +9138,7 @@
       </dgm:spPr>
     </dgm:pt>
     <dgm:pt modelId="{6526433B-C5F5-4831-9B87-E729CA5E4EEE}" type="pres">
-      <dgm:prSet presAssocID="{F4625E5F-F398-4DC3-90B3-89D847C1B4D2}" presName="rootConnector" presStyleLbl="node3" presStyleIdx="0" presStyleCnt="5"/>
+      <dgm:prSet presAssocID="{F4625E5F-F398-4DC3-90B3-89D847C1B4D2}" presName="rootConnector" presStyleLbl="node3" presStyleIdx="0" presStyleCnt="6"/>
       <dgm:spPr/>
     </dgm:pt>
     <dgm:pt modelId="{999F3703-6519-419D-A259-A0A178DEC328}" type="pres">
@@ -7636,7 +9150,7 @@
       <dgm:spPr/>
     </dgm:pt>
     <dgm:pt modelId="{2F8B7603-464C-4D89-8E80-582F0AB68DF7}" type="pres">
-      <dgm:prSet presAssocID="{1A9B7C97-70C2-47DD-980C-C5466AB90939}" presName="Name37" presStyleLbl="parChTrans1D3" presStyleIdx="1" presStyleCnt="5"/>
+      <dgm:prSet presAssocID="{1A9B7C97-70C2-47DD-980C-C5466AB90939}" presName="Name37" presStyleLbl="parChTrans1D3" presStyleIdx="1" presStyleCnt="6"/>
       <dgm:spPr/>
     </dgm:pt>
     <dgm:pt modelId="{3E573529-860D-45E2-9E6A-5968D04A542F}" type="pres">
@@ -7652,7 +9166,7 @@
       <dgm:spPr/>
     </dgm:pt>
     <dgm:pt modelId="{FA8E117F-E0C5-437E-82C3-7C00811F661F}" type="pres">
-      <dgm:prSet presAssocID="{9AF368FB-4B45-4D1C-9A89-76A4E3C17264}" presName="rootText" presStyleLbl="node3" presStyleIdx="1" presStyleCnt="5" custScaleX="31864" custScaleY="31864">
+      <dgm:prSet presAssocID="{9AF368FB-4B45-4D1C-9A89-76A4E3C17264}" presName="rootText" presStyleLbl="node3" presStyleIdx="1" presStyleCnt="6" custScaleX="31864" custScaleY="31864">
         <dgm:presLayoutVars>
           <dgm:chPref val="3"/>
         </dgm:presLayoutVars>
@@ -7664,7 +9178,7 @@
       </dgm:spPr>
     </dgm:pt>
     <dgm:pt modelId="{72E11B87-5125-4E0C-B6F7-0359D28AF1F3}" type="pres">
-      <dgm:prSet presAssocID="{9AF368FB-4B45-4D1C-9A89-76A4E3C17264}" presName="rootConnector" presStyleLbl="node3" presStyleIdx="1" presStyleCnt="5"/>
+      <dgm:prSet presAssocID="{9AF368FB-4B45-4D1C-9A89-76A4E3C17264}" presName="rootConnector" presStyleLbl="node3" presStyleIdx="1" presStyleCnt="6"/>
       <dgm:spPr/>
     </dgm:pt>
     <dgm:pt modelId="{77EE1D98-3820-4858-AFB9-AA1C5320906A}" type="pres">
@@ -7673,6 +9187,46 @@
     </dgm:pt>
     <dgm:pt modelId="{05A0A25E-F64B-4D88-B7E3-68E73B0B2AAE}" type="pres">
       <dgm:prSet presAssocID="{9AF368FB-4B45-4D1C-9A89-76A4E3C17264}" presName="hierChild5" presStyleCnt="0"/>
+      <dgm:spPr/>
+    </dgm:pt>
+    <dgm:pt modelId="{4BD53DA3-C735-4B6A-B693-38819A5463C4}" type="pres">
+      <dgm:prSet presAssocID="{C9D760A4-5FE7-4C3D-863F-AB057E218401}" presName="Name37" presStyleLbl="parChTrans1D3" presStyleIdx="2" presStyleCnt="6"/>
+      <dgm:spPr/>
+    </dgm:pt>
+    <dgm:pt modelId="{E851D2A3-925B-4A24-85FC-2546854DC79A}" type="pres">
+      <dgm:prSet presAssocID="{AA5B74FF-56D6-48F0-8C85-A7B37F700C66}" presName="hierRoot2" presStyleCnt="0">
+        <dgm:presLayoutVars>
+          <dgm:hierBranch val="init"/>
+        </dgm:presLayoutVars>
+      </dgm:prSet>
+      <dgm:spPr/>
+    </dgm:pt>
+    <dgm:pt modelId="{4D945E0A-E66D-46AE-A910-1F46D7447466}" type="pres">
+      <dgm:prSet presAssocID="{AA5B74FF-56D6-48F0-8C85-A7B37F700C66}" presName="rootComposite" presStyleCnt="0"/>
+      <dgm:spPr/>
+    </dgm:pt>
+    <dgm:pt modelId="{1E20BDB5-2D3F-4CA6-868B-8295F52808CE}" type="pres">
+      <dgm:prSet presAssocID="{AA5B74FF-56D6-48F0-8C85-A7B37F700C66}" presName="rootText" presStyleLbl="node3" presStyleIdx="2" presStyleCnt="6" custScaleX="35050" custScaleY="35050">
+        <dgm:presLayoutVars>
+          <dgm:chPref val="3"/>
+        </dgm:presLayoutVars>
+      </dgm:prSet>
+      <dgm:spPr>
+        <a:prstGeom prst="roundRect">
+          <a:avLst/>
+        </a:prstGeom>
+      </dgm:spPr>
+    </dgm:pt>
+    <dgm:pt modelId="{043E20EC-C195-4393-A06A-16A01E757E3F}" type="pres">
+      <dgm:prSet presAssocID="{AA5B74FF-56D6-48F0-8C85-A7B37F700C66}" presName="rootConnector" presStyleLbl="node3" presStyleIdx="2" presStyleCnt="6"/>
+      <dgm:spPr/>
+    </dgm:pt>
+    <dgm:pt modelId="{6D9772D0-A6CD-4162-BD8A-CD291D32808A}" type="pres">
+      <dgm:prSet presAssocID="{AA5B74FF-56D6-48F0-8C85-A7B37F700C66}" presName="hierChild4" presStyleCnt="0"/>
+      <dgm:spPr/>
+    </dgm:pt>
+    <dgm:pt modelId="{63A93404-7D07-45C5-B270-A426974B607E}" type="pres">
+      <dgm:prSet presAssocID="{AA5B74FF-56D6-48F0-8C85-A7B37F700C66}" presName="hierChild5" presStyleCnt="0"/>
       <dgm:spPr/>
     </dgm:pt>
     <dgm:pt modelId="{17938E14-FE37-4BEB-A42D-07EFBE64E6C3}" type="pres">
@@ -7716,7 +9270,7 @@
       <dgm:spPr/>
     </dgm:pt>
     <dgm:pt modelId="{CCE1B735-7DFA-485A-A618-8184D2A76BAE}" type="pres">
-      <dgm:prSet presAssocID="{07D87F42-4C5F-4722-9299-CE807D487FE7}" presName="Name37" presStyleLbl="parChTrans1D3" presStyleIdx="2" presStyleCnt="5"/>
+      <dgm:prSet presAssocID="{07D87F42-4C5F-4722-9299-CE807D487FE7}" presName="Name37" presStyleLbl="parChTrans1D3" presStyleIdx="3" presStyleCnt="6"/>
       <dgm:spPr/>
     </dgm:pt>
     <dgm:pt modelId="{E68F693D-F000-4E27-9B94-22530918BE79}" type="pres">
@@ -7732,7 +9286,7 @@
       <dgm:spPr/>
     </dgm:pt>
     <dgm:pt modelId="{BDAB8503-CA1A-4DA9-AC21-C237E7CBF35F}" type="pres">
-      <dgm:prSet presAssocID="{95ACFE52-3D22-4691-A5A9-4075BD05EE61}" presName="rootText" presStyleLbl="node3" presStyleIdx="2" presStyleCnt="5" custScaleX="31864" custScaleY="31864">
+      <dgm:prSet presAssocID="{95ACFE52-3D22-4691-A5A9-4075BD05EE61}" presName="rootText" presStyleLbl="node3" presStyleIdx="3" presStyleCnt="6" custScaleX="31864" custScaleY="31864">
         <dgm:presLayoutVars>
           <dgm:chPref val="3"/>
         </dgm:presLayoutVars>
@@ -7744,7 +9298,7 @@
       </dgm:spPr>
     </dgm:pt>
     <dgm:pt modelId="{AD7A8F42-5B99-4967-8748-2D4992695794}" type="pres">
-      <dgm:prSet presAssocID="{95ACFE52-3D22-4691-A5A9-4075BD05EE61}" presName="rootConnector" presStyleLbl="node3" presStyleIdx="2" presStyleCnt="5"/>
+      <dgm:prSet presAssocID="{95ACFE52-3D22-4691-A5A9-4075BD05EE61}" presName="rootConnector" presStyleLbl="node3" presStyleIdx="3" presStyleCnt="6"/>
       <dgm:spPr/>
     </dgm:pt>
     <dgm:pt modelId="{9DEA2D6C-D8E1-4EA5-AACD-2AFD80398862}" type="pres">
@@ -7756,7 +9310,7 @@
       <dgm:spPr/>
     </dgm:pt>
     <dgm:pt modelId="{1E87C4D7-DC16-47C0-A390-48B5EA10EC43}" type="pres">
-      <dgm:prSet presAssocID="{D40E78EA-EC45-424B-A9D8-A737DA1E485E}" presName="Name37" presStyleLbl="parChTrans1D3" presStyleIdx="3" presStyleCnt="5"/>
+      <dgm:prSet presAssocID="{D40E78EA-EC45-424B-A9D8-A737DA1E485E}" presName="Name37" presStyleLbl="parChTrans1D3" presStyleIdx="4" presStyleCnt="6"/>
       <dgm:spPr/>
     </dgm:pt>
     <dgm:pt modelId="{D0DAFDE3-5BEF-43C7-806C-AC7C5AB5EA34}" type="pres">
@@ -7772,7 +9326,7 @@
       <dgm:spPr/>
     </dgm:pt>
     <dgm:pt modelId="{0E859B9F-7638-4867-A69B-A25086E02911}" type="pres">
-      <dgm:prSet presAssocID="{615DA8CC-E3F2-4B38-8639-133BEA94731A}" presName="rootText" presStyleLbl="node3" presStyleIdx="3" presStyleCnt="5" custScaleX="31864" custScaleY="31864">
+      <dgm:prSet presAssocID="{615DA8CC-E3F2-4B38-8639-133BEA94731A}" presName="rootText" presStyleLbl="node3" presStyleIdx="4" presStyleCnt="6" custScaleX="31864" custScaleY="31864">
         <dgm:presLayoutVars>
           <dgm:chPref val="3"/>
         </dgm:presLayoutVars>
@@ -7784,7 +9338,7 @@
       </dgm:spPr>
     </dgm:pt>
     <dgm:pt modelId="{368FC640-DFA7-41D1-820C-75541C4D4B90}" type="pres">
-      <dgm:prSet presAssocID="{615DA8CC-E3F2-4B38-8639-133BEA94731A}" presName="rootConnector" presStyleLbl="node3" presStyleIdx="3" presStyleCnt="5"/>
+      <dgm:prSet presAssocID="{615DA8CC-E3F2-4B38-8639-133BEA94731A}" presName="rootConnector" presStyleLbl="node3" presStyleIdx="4" presStyleCnt="6"/>
       <dgm:spPr/>
     </dgm:pt>
     <dgm:pt modelId="{BFD50CA9-6185-4155-A7DB-389EF5511B88}" type="pres">
@@ -7796,7 +9350,7 @@
       <dgm:spPr/>
     </dgm:pt>
     <dgm:pt modelId="{409CFB27-97C8-4A61-BFA6-0C33E2A10C93}" type="pres">
-      <dgm:prSet presAssocID="{9D92917B-9139-4E73-BBFD-28587590EBD1}" presName="Name37" presStyleLbl="parChTrans1D3" presStyleIdx="4" presStyleCnt="5"/>
+      <dgm:prSet presAssocID="{9D92917B-9139-4E73-BBFD-28587590EBD1}" presName="Name37" presStyleLbl="parChTrans1D3" presStyleIdx="5" presStyleCnt="6"/>
       <dgm:spPr/>
     </dgm:pt>
     <dgm:pt modelId="{0273E919-33A5-484B-B3E5-541C05CC017A}" type="pres">
@@ -7812,7 +9366,7 @@
       <dgm:spPr/>
     </dgm:pt>
     <dgm:pt modelId="{05DD8525-0C49-4CCF-A7F7-7D7C78B1D1A2}" type="pres">
-      <dgm:prSet presAssocID="{2D5A7530-A04B-4AD8-B905-65B474FCBD0D}" presName="rootText" presStyleLbl="node3" presStyleIdx="4" presStyleCnt="5" custScaleX="31864" custScaleY="31864">
+      <dgm:prSet presAssocID="{2D5A7530-A04B-4AD8-B905-65B474FCBD0D}" presName="rootText" presStyleLbl="node3" presStyleIdx="5" presStyleCnt="6" custScaleX="31864" custScaleY="31864">
         <dgm:presLayoutVars>
           <dgm:chPref val="3"/>
         </dgm:presLayoutVars>
@@ -7824,7 +9378,7 @@
       </dgm:spPr>
     </dgm:pt>
     <dgm:pt modelId="{59A36E52-E75B-410D-B214-B03D15E2F254}" type="pres">
-      <dgm:prSet presAssocID="{2D5A7530-A04B-4AD8-B905-65B474FCBD0D}" presName="rootConnector" presStyleLbl="node3" presStyleIdx="4" presStyleCnt="5"/>
+      <dgm:prSet presAssocID="{2D5A7530-A04B-4AD8-B905-65B474FCBD0D}" presName="rootConnector" presStyleLbl="node3" presStyleIdx="5" presStyleCnt="6"/>
       <dgm:spPr/>
     </dgm:pt>
     <dgm:pt modelId="{C45723AB-FBF3-42E5-BA52-A2956FFB7879}" type="pres">
@@ -7850,6 +9404,7 @@
     <dgm:cxn modelId="{466F3E0B-90B0-44C6-828B-F42CC3CBC477}" type="presOf" srcId="{2D5A7530-A04B-4AD8-B905-65B474FCBD0D}" destId="{59A36E52-E75B-410D-B214-B03D15E2F254}" srcOrd="1" destOrd="0" presId="urn:microsoft.com/office/officeart/2005/8/layout/orgChart1"/>
     <dgm:cxn modelId="{EADE6814-246E-4FB9-AE65-B428327AA5C8}" type="presOf" srcId="{2D5A7530-A04B-4AD8-B905-65B474FCBD0D}" destId="{05DD8525-0C49-4CCF-A7F7-7D7C78B1D1A2}" srcOrd="0" destOrd="0" presId="urn:microsoft.com/office/officeart/2005/8/layout/orgChart1"/>
     <dgm:cxn modelId="{E098F216-7E2A-490C-875E-50930D2AF0B7}" type="presOf" srcId="{F4625E5F-F398-4DC3-90B3-89D847C1B4D2}" destId="{6526433B-C5F5-4831-9B87-E729CA5E4EEE}" srcOrd="1" destOrd="0" presId="urn:microsoft.com/office/officeart/2005/8/layout/orgChart1"/>
+    <dgm:cxn modelId="{2706CE18-3855-4CED-91E6-867E7CE8E65F}" type="presOf" srcId="{AA5B74FF-56D6-48F0-8C85-A7B37F700C66}" destId="{043E20EC-C195-4393-A06A-16A01E757E3F}" srcOrd="1" destOrd="0" presId="urn:microsoft.com/office/officeart/2005/8/layout/orgChart1"/>
     <dgm:cxn modelId="{09F3E822-BD83-4F25-8782-62F10994EB04}" srcId="{F9335119-39F8-4447-87FC-F5554F3E9ACF}" destId="{50418B31-E03F-42EC-85E7-0D48D52B34E9}" srcOrd="0" destOrd="0" parTransId="{B3865441-19DD-4CFF-A945-522EF3F14F38}" sibTransId="{D276D12E-16C6-4008-B49F-02C0FD219252}"/>
     <dgm:cxn modelId="{84262B23-4272-49C8-8DC4-9F49EBBC40AC}" srcId="{50418B31-E03F-42EC-85E7-0D48D52B34E9}" destId="{11FD73A5-F39D-4D3E-B56A-249FBABF43E0}" srcOrd="1" destOrd="0" parTransId="{656E856C-81E5-43CE-B501-47EA07C99497}" sibTransId="{BE4BA206-8DF4-4DAC-9B4E-F7B46D8CF844}"/>
     <dgm:cxn modelId="{E42E7226-A214-4C82-88EC-9F7D4F54493E}" srcId="{50418B31-E03F-42EC-85E7-0D48D52B34E9}" destId="{C26A3EB6-3289-4A2D-A5A9-7911B9EF7160}" srcOrd="0" destOrd="0" parTransId="{735ED275-B64C-4CCB-AA62-F645717AD80F}" sibTransId="{D14A3485-9360-441B-9573-993DC6553F6A}"/>
@@ -7866,12 +9421,14 @@
     <dgm:cxn modelId="{13E78B70-DF83-45F3-BEC7-ADC3680E8D91}" type="presOf" srcId="{95ACFE52-3D22-4691-A5A9-4075BD05EE61}" destId="{AD7A8F42-5B99-4967-8748-2D4992695794}" srcOrd="1" destOrd="0" presId="urn:microsoft.com/office/officeart/2005/8/layout/orgChart1"/>
     <dgm:cxn modelId="{C91C6871-0AC8-4985-A34E-DB4C11AF302E}" type="presOf" srcId="{D40E78EA-EC45-424B-A9D8-A737DA1E485E}" destId="{1E87C4D7-DC16-47C0-A390-48B5EA10EC43}" srcOrd="0" destOrd="0" presId="urn:microsoft.com/office/officeart/2005/8/layout/orgChart1"/>
     <dgm:cxn modelId="{E05F6252-0531-42FA-B07F-D1A1CA2EAC52}" type="presOf" srcId="{95ACFE52-3D22-4691-A5A9-4075BD05EE61}" destId="{BDAB8503-CA1A-4DA9-AC21-C237E7CBF35F}" srcOrd="0" destOrd="0" presId="urn:microsoft.com/office/officeart/2005/8/layout/orgChart1"/>
+    <dgm:cxn modelId="{FCBC1C74-763B-4165-9B7F-4E446064CAB3}" srcId="{11FD73A5-F39D-4D3E-B56A-249FBABF43E0}" destId="{AA5B74FF-56D6-48F0-8C85-A7B37F700C66}" srcOrd="2" destOrd="0" parTransId="{C9D760A4-5FE7-4C3D-863F-AB057E218401}" sibTransId="{007225E3-B4E9-4248-B4D4-50B03A6EA4F3}"/>
     <dgm:cxn modelId="{BB1AFB56-77B5-4EBD-ABCF-C7B12B1E6A1D}" srcId="{6A74A563-BA45-49AD-9BB9-407D7486370E}" destId="{95ACFE52-3D22-4691-A5A9-4075BD05EE61}" srcOrd="0" destOrd="0" parTransId="{07D87F42-4C5F-4722-9299-CE807D487FE7}" sibTransId="{BC0763AA-D55E-49A8-8A66-439C46EE0C13}"/>
     <dgm:cxn modelId="{DB12EC57-3C97-4F60-AC7F-E6CC846B3D1B}" type="presOf" srcId="{50418B31-E03F-42EC-85E7-0D48D52B34E9}" destId="{6BAE9566-31C0-4D8C-B369-91FDA1DFBB44}" srcOrd="0" destOrd="0" presId="urn:microsoft.com/office/officeart/2005/8/layout/orgChart1"/>
     <dgm:cxn modelId="{80DABA58-C8D5-4DDB-B99E-18965B9AD8E6}" type="presOf" srcId="{E5DB8B48-B7FB-4AA3-BA43-5284474140E0}" destId="{27895697-2032-4A1C-B16E-AA01602D2D37}" srcOrd="0" destOrd="0" presId="urn:microsoft.com/office/officeart/2005/8/layout/orgChart1"/>
     <dgm:cxn modelId="{3487177C-DC01-400C-8CC9-E6B78C4943CF}" srcId="{11FD73A5-F39D-4D3E-B56A-249FBABF43E0}" destId="{F4625E5F-F398-4DC3-90B3-89D847C1B4D2}" srcOrd="0" destOrd="0" parTransId="{0F3F8333-32C1-4083-97B5-089972BBECF9}" sibTransId="{8286885C-47C9-4353-A097-7FE0B81C520A}"/>
     <dgm:cxn modelId="{DD81D47D-EBF4-4D42-AA24-087980DB812E}" type="presOf" srcId="{9AF368FB-4B45-4D1C-9A89-76A4E3C17264}" destId="{72E11B87-5125-4E0C-B6F7-0359D28AF1F3}" srcOrd="1" destOrd="0" presId="urn:microsoft.com/office/officeart/2005/8/layout/orgChart1"/>
     <dgm:cxn modelId="{3A727497-A405-4EFD-BE54-F67605763F79}" srcId="{6A74A563-BA45-49AD-9BB9-407D7486370E}" destId="{615DA8CC-E3F2-4B38-8639-133BEA94731A}" srcOrd="1" destOrd="0" parTransId="{D40E78EA-EC45-424B-A9D8-A737DA1E485E}" sibTransId="{DACA93F7-0AF9-4938-AB19-2CDF682B49A9}"/>
+    <dgm:cxn modelId="{27DFACA9-E1C8-4DB3-802B-8ACEAFBA3C7F}" type="presOf" srcId="{C9D760A4-5FE7-4C3D-863F-AB057E218401}" destId="{4BD53DA3-C735-4B6A-B693-38819A5463C4}" srcOrd="0" destOrd="0" presId="urn:microsoft.com/office/officeart/2005/8/layout/orgChart1"/>
     <dgm:cxn modelId="{A05E43AD-9D38-44A8-9F17-93D8289FAB98}" type="presOf" srcId="{0F3F8333-32C1-4083-97B5-089972BBECF9}" destId="{CCA81168-0189-41BA-A46C-64692F98151F}" srcOrd="0" destOrd="0" presId="urn:microsoft.com/office/officeart/2005/8/layout/orgChart1"/>
     <dgm:cxn modelId="{3FB3B6B4-F86E-4984-851C-D176A86325E8}" type="presOf" srcId="{615DA8CC-E3F2-4B38-8639-133BEA94731A}" destId="{368FC640-DFA7-41D1-820C-75541C4D4B90}" srcOrd="1" destOrd="0" presId="urn:microsoft.com/office/officeart/2005/8/layout/orgChart1"/>
     <dgm:cxn modelId="{267C6BB6-CCE6-4A5A-BF13-E152971E0D36}" type="presOf" srcId="{615DA8CC-E3F2-4B38-8639-133BEA94731A}" destId="{0E859B9F-7638-4867-A69B-A25086E02911}" srcOrd="0" destOrd="0" presId="urn:microsoft.com/office/officeart/2005/8/layout/orgChart1"/>
@@ -7879,6 +9436,7 @@
     <dgm:cxn modelId="{960943D7-3DD9-4D22-AEA6-184CBFDD9B8B}" type="presOf" srcId="{11FD73A5-F39D-4D3E-B56A-249FBABF43E0}" destId="{6F89B19B-3A40-4DEF-B950-9C9D8B3E13E0}" srcOrd="1" destOrd="0" presId="urn:microsoft.com/office/officeart/2005/8/layout/orgChart1"/>
     <dgm:cxn modelId="{7B1383D8-99BE-44B5-AC1B-0F7B9A7DCEDC}" type="presOf" srcId="{9D92917B-9139-4E73-BBFD-28587590EBD1}" destId="{409CFB27-97C8-4A61-BFA6-0C33E2A10C93}" srcOrd="0" destOrd="0" presId="urn:microsoft.com/office/officeart/2005/8/layout/orgChart1"/>
     <dgm:cxn modelId="{7A5E65DD-0F56-4207-9415-CEBAF73BD166}" srcId="{6A74A563-BA45-49AD-9BB9-407D7486370E}" destId="{2D5A7530-A04B-4AD8-B905-65B474FCBD0D}" srcOrd="2" destOrd="0" parTransId="{9D92917B-9139-4E73-BBFD-28587590EBD1}" sibTransId="{851677E6-1EB5-400F-8A5B-65F9B461BA1A}"/>
+    <dgm:cxn modelId="{2BC9E9E5-5C2B-4203-8F8F-44863218FB19}" type="presOf" srcId="{AA5B74FF-56D6-48F0-8C85-A7B37F700C66}" destId="{1E20BDB5-2D3F-4CA6-868B-8295F52808CE}" srcOrd="0" destOrd="0" presId="urn:microsoft.com/office/officeart/2005/8/layout/orgChart1"/>
     <dgm:cxn modelId="{C06F59F2-654D-485F-BF07-0207EA76B2F0}" type="presOf" srcId="{656E856C-81E5-43CE-B501-47EA07C99497}" destId="{465620B8-D923-47A6-AEA6-B888193B9C6C}" srcOrd="0" destOrd="0" presId="urn:microsoft.com/office/officeart/2005/8/layout/orgChart1"/>
     <dgm:cxn modelId="{3CC0A7FD-8305-40DA-9E2D-DBC8FD0A886E}" type="presOf" srcId="{1A9B7C97-70C2-47DD-980C-C5466AB90939}" destId="{2F8B7603-464C-4D89-8E80-582F0AB68DF7}" srcOrd="0" destOrd="0" presId="urn:microsoft.com/office/officeart/2005/8/layout/orgChart1"/>
     <dgm:cxn modelId="{0E2750D1-4B71-44E2-9301-DEE4CEDB698C}" type="presParOf" srcId="{92F78CD7-8E96-460D-A8B6-D214295679C1}" destId="{BE1C097E-777E-4CBD-82BE-86ACE0ED3424}" srcOrd="0" destOrd="0" presId="urn:microsoft.com/office/officeart/2005/8/layout/orgChart1"/>
@@ -7913,6 +9471,13 @@
     <dgm:cxn modelId="{C12DC0AC-587E-4A36-B898-562F6018CCEA}" type="presParOf" srcId="{54156C73-A898-4570-B44F-77C3DBD243CC}" destId="{72E11B87-5125-4E0C-B6F7-0359D28AF1F3}" srcOrd="1" destOrd="0" presId="urn:microsoft.com/office/officeart/2005/8/layout/orgChart1"/>
     <dgm:cxn modelId="{EBFF207D-55B6-4B6D-A638-1A21969ADF09}" type="presParOf" srcId="{3E573529-860D-45E2-9E6A-5968D04A542F}" destId="{77EE1D98-3820-4858-AFB9-AA1C5320906A}" srcOrd="1" destOrd="0" presId="urn:microsoft.com/office/officeart/2005/8/layout/orgChart1"/>
     <dgm:cxn modelId="{63A05238-3C7E-4289-B7AD-B7D00E816E03}" type="presParOf" srcId="{3E573529-860D-45E2-9E6A-5968D04A542F}" destId="{05A0A25E-F64B-4D88-B7E3-68E73B0B2AAE}" srcOrd="2" destOrd="0" presId="urn:microsoft.com/office/officeart/2005/8/layout/orgChart1"/>
+    <dgm:cxn modelId="{BDF08946-71C8-4639-A646-5E65DB484418}" type="presParOf" srcId="{509ED240-CF4B-45F3-BE8E-C9A35C11B251}" destId="{4BD53DA3-C735-4B6A-B693-38819A5463C4}" srcOrd="4" destOrd="0" presId="urn:microsoft.com/office/officeart/2005/8/layout/orgChart1"/>
+    <dgm:cxn modelId="{3B673301-9BB5-42A2-9647-DD87197E867D}" type="presParOf" srcId="{509ED240-CF4B-45F3-BE8E-C9A35C11B251}" destId="{E851D2A3-925B-4A24-85FC-2546854DC79A}" srcOrd="5" destOrd="0" presId="urn:microsoft.com/office/officeart/2005/8/layout/orgChart1"/>
+    <dgm:cxn modelId="{7E404288-D5A0-4436-BE1A-D33D92BFA1AC}" type="presParOf" srcId="{E851D2A3-925B-4A24-85FC-2546854DC79A}" destId="{4D945E0A-E66D-46AE-A910-1F46D7447466}" srcOrd="0" destOrd="0" presId="urn:microsoft.com/office/officeart/2005/8/layout/orgChart1"/>
+    <dgm:cxn modelId="{F676D6B7-E07A-48B1-9079-8D1D43C22B28}" type="presParOf" srcId="{4D945E0A-E66D-46AE-A910-1F46D7447466}" destId="{1E20BDB5-2D3F-4CA6-868B-8295F52808CE}" srcOrd="0" destOrd="0" presId="urn:microsoft.com/office/officeart/2005/8/layout/orgChart1"/>
+    <dgm:cxn modelId="{BF060E5D-ACE6-4EF9-BF51-771694FB38A9}" type="presParOf" srcId="{4D945E0A-E66D-46AE-A910-1F46D7447466}" destId="{043E20EC-C195-4393-A06A-16A01E757E3F}" srcOrd="1" destOrd="0" presId="urn:microsoft.com/office/officeart/2005/8/layout/orgChart1"/>
+    <dgm:cxn modelId="{B6428E10-C45D-438B-BAFC-C084D2E32568}" type="presParOf" srcId="{E851D2A3-925B-4A24-85FC-2546854DC79A}" destId="{6D9772D0-A6CD-4162-BD8A-CD291D32808A}" srcOrd="1" destOrd="0" presId="urn:microsoft.com/office/officeart/2005/8/layout/orgChart1"/>
+    <dgm:cxn modelId="{C09C1CCA-0118-4C32-8BA4-31DE91F79092}" type="presParOf" srcId="{E851D2A3-925B-4A24-85FC-2546854DC79A}" destId="{63A93404-7D07-45C5-B270-A426974B607E}" srcOrd="2" destOrd="0" presId="urn:microsoft.com/office/officeart/2005/8/layout/orgChart1"/>
     <dgm:cxn modelId="{1D366717-2A0E-4141-8801-60FD0468C3AB}" type="presParOf" srcId="{BF0B272B-36C1-409E-8E53-94977FBD3081}" destId="{17938E14-FE37-4BEB-A42D-07EFBE64E6C3}" srcOrd="2" destOrd="0" presId="urn:microsoft.com/office/officeart/2005/8/layout/orgChart1"/>
     <dgm:cxn modelId="{AF6A21BC-3C1A-4DF1-8876-078E92DA8C5D}" type="presParOf" srcId="{F1ACF1AE-2A05-4F4F-952C-FF88A92BAF21}" destId="{27895697-2032-4A1C-B16E-AA01602D2D37}" srcOrd="4" destOrd="0" presId="urn:microsoft.com/office/officeart/2005/8/layout/orgChart1"/>
     <dgm:cxn modelId="{4D0EDA06-E6FB-4FB0-BCAC-787E7BC486D5}" type="presParOf" srcId="{F1ACF1AE-2A05-4F4F-952C-FF88A92BAF21}" destId="{CB69DCF2-AF48-4123-B880-3664B1715F13}" srcOrd="5" destOrd="0" presId="urn:microsoft.com/office/officeart/2005/8/layout/orgChart1"/>
@@ -7969,8 +9534,8 @@
       </dsp:nvSpPr>
       <dsp:spPr>
         <a:xfrm>
-          <a:off x="1864769" y="753852"/>
-          <a:ext cx="91440" cy="1071873"/>
+          <a:off x="1859570" y="747561"/>
+          <a:ext cx="91440" cy="1061550"/>
         </a:xfrm>
         <a:custGeom>
           <a:avLst/>
@@ -7984,10 +9549,10 @@
                 <a:pt x="45720" y="0"/>
               </a:moveTo>
               <a:lnTo>
-                <a:pt x="45720" y="1071873"/>
+                <a:pt x="45720" y="1061550"/>
               </a:lnTo>
               <a:lnTo>
-                <a:pt x="125955" y="1071873"/>
+                <a:pt x="125183" y="1061550"/>
               </a:lnTo>
             </a:path>
           </a:pathLst>
@@ -8028,8 +9593,8 @@
       </dsp:nvSpPr>
       <dsp:spPr>
         <a:xfrm>
-          <a:off x="1864769" y="753852"/>
-          <a:ext cx="91440" cy="686904"/>
+          <a:off x="1859570" y="747561"/>
+          <a:ext cx="91440" cy="680288"/>
         </a:xfrm>
         <a:custGeom>
           <a:avLst/>
@@ -8043,10 +9608,10 @@
                 <a:pt x="45720" y="0"/>
               </a:moveTo>
               <a:lnTo>
-                <a:pt x="45720" y="686904"/>
+                <a:pt x="45720" y="680288"/>
               </a:lnTo>
               <a:lnTo>
-                <a:pt x="125955" y="686904"/>
+                <a:pt x="125183" y="680288"/>
               </a:lnTo>
             </a:path>
           </a:pathLst>
@@ -8087,8 +9652,8 @@
       </dsp:nvSpPr>
       <dsp:spPr>
         <a:xfrm>
-          <a:off x="1864769" y="753852"/>
-          <a:ext cx="91440" cy="301934"/>
+          <a:off x="1859570" y="747561"/>
+          <a:ext cx="91440" cy="299026"/>
         </a:xfrm>
         <a:custGeom>
           <a:avLst/>
@@ -8102,10 +9667,10 @@
                 <a:pt x="45720" y="0"/>
               </a:moveTo>
               <a:lnTo>
-                <a:pt x="45720" y="301934"/>
+                <a:pt x="45720" y="299026"/>
               </a:lnTo>
               <a:lnTo>
-                <a:pt x="125955" y="301934"/>
+                <a:pt x="125183" y="299026"/>
               </a:lnTo>
             </a:path>
           </a:pathLst>
@@ -8146,8 +9711,8 @@
       </dsp:nvSpPr>
       <dsp:spPr>
         <a:xfrm>
-          <a:off x="1370647" y="267500"/>
-          <a:ext cx="753803" cy="218898"/>
+          <a:off x="1370647" y="265893"/>
+          <a:ext cx="746543" cy="216790"/>
         </a:xfrm>
         <a:custGeom>
           <a:avLst/>
@@ -8161,13 +9726,13 @@
                 <a:pt x="0" y="0"/>
               </a:moveTo>
               <a:lnTo>
-                <a:pt x="0" y="109449"/>
+                <a:pt x="0" y="108395"/>
               </a:lnTo>
               <a:lnTo>
-                <a:pt x="753803" y="109449"/>
+                <a:pt x="746543" y="108395"/>
               </a:lnTo>
               <a:lnTo>
-                <a:pt x="753803" y="218898"/>
+                <a:pt x="746543" y="216790"/>
               </a:lnTo>
             </a:path>
           </a:pathLst>
@@ -8195,15 +9760,15 @@
         <a:fontRef idx="minor"/>
       </dsp:style>
     </dsp:sp>
-    <dsp:sp modelId="{2F8B7603-464C-4D89-8E80-582F0AB68DF7}">
+    <dsp:sp modelId="{4BD53DA3-C735-4B6A-B693-38819A5463C4}">
       <dsp:nvSpPr>
         <dsp:cNvPr id="0" name=""/>
         <dsp:cNvSpPr/>
       </dsp:nvSpPr>
       <dsp:spPr>
         <a:xfrm>
-          <a:off x="1110965" y="753852"/>
-          <a:ext cx="91440" cy="686904"/>
+          <a:off x="1113026" y="747561"/>
+          <a:ext cx="91440" cy="1069773"/>
         </a:xfrm>
         <a:custGeom>
           <a:avLst/>
@@ -8217,10 +9782,69 @@
                 <a:pt x="45720" y="0"/>
               </a:moveTo>
               <a:lnTo>
-                <a:pt x="45720" y="686904"/>
+                <a:pt x="45720" y="1069773"/>
               </a:lnTo>
               <a:lnTo>
-                <a:pt x="125955" y="686904"/>
+                <a:pt x="125183" y="1069773"/>
+              </a:lnTo>
+            </a:path>
+          </a:pathLst>
+        </a:custGeom>
+        <a:noFill/>
+        <a:ln w="19050" cap="flat" cmpd="sng" algn="ctr">
+          <a:solidFill>
+            <a:schemeClr val="dk1">
+              <a:shade val="80000"/>
+              <a:hueOff val="0"/>
+              <a:satOff val="0"/>
+              <a:lumOff val="0"/>
+              <a:alphaOff val="0"/>
+            </a:schemeClr>
+          </a:solidFill>
+          <a:prstDash val="solid"/>
+          <a:miter lim="800000"/>
+        </a:ln>
+        <a:effectLst/>
+      </dsp:spPr>
+      <dsp:style>
+        <a:lnRef idx="2">
+          <a:scrgbClr r="0" g="0" b="0"/>
+        </a:lnRef>
+        <a:fillRef idx="0">
+          <a:scrgbClr r="0" g="0" b="0"/>
+        </a:fillRef>
+        <a:effectRef idx="0">
+          <a:scrgbClr r="0" g="0" b="0"/>
+        </a:effectRef>
+        <a:fontRef idx="minor"/>
+      </dsp:style>
+    </dsp:sp>
+    <dsp:sp modelId="{2F8B7603-464C-4D89-8E80-582F0AB68DF7}">
+      <dsp:nvSpPr>
+        <dsp:cNvPr id="0" name=""/>
+        <dsp:cNvSpPr/>
+      </dsp:nvSpPr>
+      <dsp:spPr>
+        <a:xfrm>
+          <a:off x="1113026" y="747561"/>
+          <a:ext cx="91440" cy="680288"/>
+        </a:xfrm>
+        <a:custGeom>
+          <a:avLst/>
+          <a:gdLst/>
+          <a:ahLst/>
+          <a:cxnLst/>
+          <a:rect l="0" t="0" r="0" b="0"/>
+          <a:pathLst>
+            <a:path>
+              <a:moveTo>
+                <a:pt x="45720" y="0"/>
+              </a:moveTo>
+              <a:lnTo>
+                <a:pt x="45720" y="680288"/>
+              </a:lnTo>
+              <a:lnTo>
+                <a:pt x="125183" y="680288"/>
               </a:lnTo>
             </a:path>
           </a:pathLst>
@@ -8261,8 +9885,8 @@
       </dsp:nvSpPr>
       <dsp:spPr>
         <a:xfrm>
-          <a:off x="1110965" y="753852"/>
-          <a:ext cx="91440" cy="301934"/>
+          <a:off x="1113026" y="747561"/>
+          <a:ext cx="91440" cy="299026"/>
         </a:xfrm>
         <a:custGeom>
           <a:avLst/>
@@ -8276,10 +9900,10 @@
                 <a:pt x="45720" y="0"/>
               </a:moveTo>
               <a:lnTo>
-                <a:pt x="45720" y="301934"/>
+                <a:pt x="45720" y="299026"/>
               </a:lnTo>
               <a:lnTo>
-                <a:pt x="125955" y="301934"/>
+                <a:pt x="125183" y="299026"/>
               </a:lnTo>
             </a:path>
           </a:pathLst>
@@ -8320,8 +9944,8 @@
       </dsp:nvSpPr>
       <dsp:spPr>
         <a:xfrm>
-          <a:off x="1324927" y="267500"/>
-          <a:ext cx="91440" cy="218898"/>
+          <a:off x="1324927" y="265893"/>
+          <a:ext cx="91440" cy="216790"/>
         </a:xfrm>
         <a:custGeom>
           <a:avLst/>
@@ -8335,7 +9959,7 @@
                 <a:pt x="45720" y="0"/>
               </a:moveTo>
               <a:lnTo>
-                <a:pt x="45720" y="218898"/>
+                <a:pt x="45720" y="216790"/>
               </a:lnTo>
             </a:path>
           </a:pathLst>
@@ -8370,8 +9994,8 @@
       </dsp:nvSpPr>
       <dsp:spPr>
         <a:xfrm>
-          <a:off x="616843" y="267500"/>
-          <a:ext cx="753803" cy="218898"/>
+          <a:off x="624103" y="265893"/>
+          <a:ext cx="746543" cy="216790"/>
         </a:xfrm>
         <a:custGeom>
           <a:avLst/>
@@ -8382,16 +10006,16 @@
           <a:pathLst>
             <a:path>
               <a:moveTo>
-                <a:pt x="753803" y="0"/>
+                <a:pt x="746543" y="0"/>
               </a:moveTo>
               <a:lnTo>
-                <a:pt x="753803" y="109449"/>
+                <a:pt x="746543" y="108395"/>
               </a:lnTo>
               <a:lnTo>
-                <a:pt x="0" y="109449"/>
+                <a:pt x="0" y="108395"/>
               </a:lnTo>
               <a:lnTo>
-                <a:pt x="0" y="218898"/>
+                <a:pt x="0" y="216790"/>
               </a:lnTo>
             </a:path>
           </a:pathLst>
@@ -8426,8 +10050,8 @@
       </dsp:nvSpPr>
       <dsp:spPr>
         <a:xfrm>
-          <a:off x="1103194" y="48"/>
-          <a:ext cx="534905" cy="267452"/>
+          <a:off x="1105770" y="1017"/>
+          <a:ext cx="529753" cy="264876"/>
         </a:xfrm>
         <a:prstGeom prst="roundRect">
           <a:avLst/>
@@ -8495,8 +10119,8 @@
         </a:p>
       </dsp:txBody>
       <dsp:txXfrm>
-        <a:off x="1116250" y="13104"/>
-        <a:ext cx="508793" cy="241340"/>
+        <a:off x="1118700" y="13947"/>
+        <a:ext cx="503893" cy="239016"/>
       </dsp:txXfrm>
     </dsp:sp>
     <dsp:sp modelId="{89BBA44B-1310-4D84-A377-3AD5AE8081AB}">
@@ -8506,8 +10130,8 @@
       </dsp:nvSpPr>
       <dsp:spPr>
         <a:xfrm>
-          <a:off x="349391" y="486399"/>
-          <a:ext cx="534905" cy="267452"/>
+          <a:off x="359226" y="482684"/>
+          <a:ext cx="529753" cy="264876"/>
         </a:xfrm>
         <a:prstGeom prst="roundRect">
           <a:avLst/>
@@ -8573,8 +10197,8 @@
         </a:p>
       </dsp:txBody>
       <dsp:txXfrm>
-        <a:off x="362447" y="499455"/>
-        <a:ext cx="508793" cy="241340"/>
+        <a:off x="372156" y="495614"/>
+        <a:ext cx="503893" cy="239016"/>
       </dsp:txXfrm>
     </dsp:sp>
     <dsp:sp modelId="{4EE9F8D4-A294-4857-B08C-DD2980D3126D}">
@@ -8584,8 +10208,8 @@
       </dsp:nvSpPr>
       <dsp:spPr>
         <a:xfrm>
-          <a:off x="1103194" y="486399"/>
-          <a:ext cx="534905" cy="267452"/>
+          <a:off x="1105770" y="482684"/>
+          <a:ext cx="529753" cy="264876"/>
         </a:xfrm>
         <a:prstGeom prst="roundRect">
           <a:avLst/>
@@ -8651,8 +10275,8 @@
         </a:p>
       </dsp:txBody>
       <dsp:txXfrm>
-        <a:off x="1116250" y="499455"/>
-        <a:ext cx="508793" cy="241340"/>
+        <a:off x="1118700" y="495614"/>
+        <a:ext cx="503893" cy="239016"/>
       </dsp:txXfrm>
     </dsp:sp>
     <dsp:sp modelId="{09EE6FDB-B20C-48EA-83D5-F9E144629EC7}">
@@ -8662,8 +10286,8 @@
       </dsp:nvSpPr>
       <dsp:spPr>
         <a:xfrm>
-          <a:off x="1236921" y="972750"/>
-          <a:ext cx="332142" cy="166071"/>
+          <a:off x="1238209" y="964351"/>
+          <a:ext cx="328943" cy="164471"/>
         </a:xfrm>
         <a:prstGeom prst="roundRect">
           <a:avLst/>
@@ -8731,8 +10355,8 @@
         </a:p>
       </dsp:txBody>
       <dsp:txXfrm>
-        <a:off x="1245028" y="980857"/>
-        <a:ext cx="315928" cy="149857"/>
+        <a:off x="1246238" y="972380"/>
+        <a:ext cx="312885" cy="148413"/>
       </dsp:txXfrm>
     </dsp:sp>
     <dsp:sp modelId="{FA8E117F-E0C5-437E-82C3-7C00811F661F}">
@@ -8742,8 +10366,8 @@
       </dsp:nvSpPr>
       <dsp:spPr>
         <a:xfrm>
-          <a:off x="1236921" y="1357720"/>
-          <a:ext cx="332142" cy="166071"/>
+          <a:off x="1238209" y="1345613"/>
+          <a:ext cx="328943" cy="164471"/>
         </a:xfrm>
         <a:prstGeom prst="roundRect">
           <a:avLst/>
@@ -8811,8 +10435,92 @@
         </a:p>
       </dsp:txBody>
       <dsp:txXfrm>
-        <a:off x="1245028" y="1365827"/>
-        <a:ext cx="315928" cy="149857"/>
+        <a:off x="1246238" y="1353642"/>
+        <a:ext cx="312885" cy="148413"/>
+      </dsp:txXfrm>
+    </dsp:sp>
+    <dsp:sp modelId="{1E20BDB5-2D3F-4CA6-868B-8295F52808CE}">
+      <dsp:nvSpPr>
+        <dsp:cNvPr id="0" name=""/>
+        <dsp:cNvSpPr/>
+      </dsp:nvSpPr>
+      <dsp:spPr>
+        <a:xfrm>
+          <a:off x="1238209" y="1726876"/>
+          <a:ext cx="361833" cy="180916"/>
+        </a:xfrm>
+        <a:prstGeom prst="roundRect">
+          <a:avLst/>
+        </a:prstGeom>
+        <a:solidFill>
+          <a:schemeClr val="lt1">
+            <a:hueOff val="0"/>
+            <a:satOff val="0"/>
+            <a:lumOff val="0"/>
+            <a:alphaOff val="0"/>
+          </a:schemeClr>
+        </a:solidFill>
+        <a:ln w="19050" cap="flat" cmpd="sng" algn="ctr">
+          <a:solidFill>
+            <a:schemeClr val="dk1">
+              <a:shade val="80000"/>
+              <a:hueOff val="0"/>
+              <a:satOff val="0"/>
+              <a:lumOff val="0"/>
+              <a:alphaOff val="0"/>
+            </a:schemeClr>
+          </a:solidFill>
+          <a:prstDash val="solid"/>
+          <a:miter lim="800000"/>
+        </a:ln>
+        <a:effectLst/>
+      </dsp:spPr>
+      <dsp:style>
+        <a:lnRef idx="2">
+          <a:scrgbClr r="0" g="0" b="0"/>
+        </a:lnRef>
+        <a:fillRef idx="1">
+          <a:scrgbClr r="0" g="0" b="0"/>
+        </a:fillRef>
+        <a:effectRef idx="0">
+          <a:scrgbClr r="0" g="0" b="0"/>
+        </a:effectRef>
+        <a:fontRef idx="minor">
+          <a:schemeClr val="lt1"/>
+        </a:fontRef>
+      </dsp:style>
+      <dsp:txBody>
+        <a:bodyPr spcFirstLastPara="0" vert="horz" wrap="square" lIns="3810" tIns="3810" rIns="3810" bIns="3810" numCol="1" spcCol="1270" anchor="ctr" anchorCtr="0">
+          <a:noAutofit/>
+        </a:bodyPr>
+        <a:lstStyle/>
+        <a:p>
+          <a:pPr marL="0" lvl="0" indent="0" algn="ctr" defTabSz="266700">
+            <a:lnSpc>
+              <a:spcPct val="90000"/>
+            </a:lnSpc>
+            <a:spcBef>
+              <a:spcPct val="0"/>
+            </a:spcBef>
+            <a:spcAft>
+              <a:spcPct val="35000"/>
+            </a:spcAft>
+            <a:buNone/>
+          </a:pPr>
+          <a:r>
+            <a:rPr lang="en-US" sz="600" kern="1200">
+              <a:latin typeface="Consolas" panose="020B0609020204030204" pitchFamily="49" charset="0"/>
+            </a:rPr>
+            <a:t>Config</a:t>
+          </a:r>
+          <a:endParaRPr lang="LID4096" sz="600" kern="1200">
+            <a:latin typeface="Consolas" panose="020B0609020204030204" pitchFamily="49" charset="0"/>
+          </a:endParaRPr>
+        </a:p>
+      </dsp:txBody>
+      <dsp:txXfrm>
+        <a:off x="1247041" y="1735708"/>
+        <a:ext cx="344169" cy="163252"/>
       </dsp:txXfrm>
     </dsp:sp>
     <dsp:sp modelId="{2EAC2E53-E73E-4D0F-B8E3-9E0284652602}">
@@ -8822,8 +10530,8 @@
       </dsp:nvSpPr>
       <dsp:spPr>
         <a:xfrm>
-          <a:off x="1856998" y="486399"/>
-          <a:ext cx="534905" cy="267452"/>
+          <a:off x="1852314" y="482684"/>
+          <a:ext cx="529753" cy="264876"/>
         </a:xfrm>
         <a:prstGeom prst="roundRect">
           <a:avLst/>
@@ -8889,8 +10597,8 @@
         </a:p>
       </dsp:txBody>
       <dsp:txXfrm>
-        <a:off x="1870054" y="499455"/>
-        <a:ext cx="508793" cy="241340"/>
+        <a:off x="1865244" y="495614"/>
+        <a:ext cx="503893" cy="239016"/>
       </dsp:txXfrm>
     </dsp:sp>
     <dsp:sp modelId="{BDAB8503-CA1A-4DA9-AC21-C237E7CBF35F}">
@@ -8900,8 +10608,8 @@
       </dsp:nvSpPr>
       <dsp:spPr>
         <a:xfrm>
-          <a:off x="1990724" y="972750"/>
-          <a:ext cx="332142" cy="166071"/>
+          <a:off x="1984753" y="964351"/>
+          <a:ext cx="328943" cy="164471"/>
         </a:xfrm>
         <a:prstGeom prst="roundRect">
           <a:avLst/>
@@ -8973,8 +10681,8 @@
         </a:p>
       </dsp:txBody>
       <dsp:txXfrm>
-        <a:off x="1998831" y="980857"/>
-        <a:ext cx="315928" cy="149857"/>
+        <a:off x="1992782" y="972380"/>
+        <a:ext cx="312885" cy="148413"/>
       </dsp:txXfrm>
     </dsp:sp>
     <dsp:sp modelId="{0E859B9F-7638-4867-A69B-A25086E02911}">
@@ -8984,8 +10692,8 @@
       </dsp:nvSpPr>
       <dsp:spPr>
         <a:xfrm>
-          <a:off x="1990724" y="1357720"/>
-          <a:ext cx="332142" cy="166071"/>
+          <a:off x="1984753" y="1345613"/>
+          <a:ext cx="328943" cy="164471"/>
         </a:xfrm>
         <a:prstGeom prst="roundRect">
           <a:avLst/>
@@ -9057,8 +10765,8 @@
         </a:p>
       </dsp:txBody>
       <dsp:txXfrm>
-        <a:off x="1998831" y="1365827"/>
-        <a:ext cx="315928" cy="149857"/>
+        <a:off x="1992782" y="1353642"/>
+        <a:ext cx="312885" cy="148413"/>
       </dsp:txXfrm>
     </dsp:sp>
     <dsp:sp modelId="{05DD8525-0C49-4CCF-A7F7-7D7C78B1D1A2}">
@@ -9068,8 +10776,8 @@
       </dsp:nvSpPr>
       <dsp:spPr>
         <a:xfrm>
-          <a:off x="1990724" y="1742690"/>
-          <a:ext cx="332142" cy="166071"/>
+          <a:off x="1984753" y="1726876"/>
+          <a:ext cx="328943" cy="164471"/>
         </a:xfrm>
         <a:prstGeom prst="roundRect">
           <a:avLst/>
@@ -9141,8 +10849,8 @@
         </a:p>
       </dsp:txBody>
       <dsp:txXfrm>
-        <a:off x="1998831" y="1750797"/>
-        <a:ext cx="315928" cy="149857"/>
+        <a:off x="1992782" y="1734905"/>
+        <a:ext cx="312885" cy="148413"/>
       </dsp:txXfrm>
     </dsp:sp>
   </dsp:spTree>

</xml_diff>

<commit_message>
Set up Map Rendering
</commit_message>
<xml_diff>
--- a/Doc.docx
+++ b/Doc.docx
@@ -4,10 +4,8 @@
   <w:body>
     <w:p>
       <w:pPr>
-        <w:rPr>
-          <w:rFonts w:cs="Times New Roman"/>
-          <w:sz w:val="40"/>
-          <w:szCs w:val="40"/>
+        <w:pStyle w:val="Heading1"/>
+        <w:rPr>
           <w:lang w:val="ro-RO"/>
         </w:rPr>
       </w:pPr>
@@ -1895,14 +1893,14 @@
             <v:path o:extrusionok="f" gradientshapeok="t" o:connecttype="rect"/>
             <o:lock v:ext="edit" aspectratio="t"/>
           </v:shapetype>
-          <v:shape id="_x0000_i1025" type="#_x0000_t75" style="width:404pt;height:163.65pt" o:ole="" o:bordertopcolor="this" o:borderleftcolor="this" o:borderbottomcolor="this" o:borderrightcolor="this">
+          <v:shape id="_x0000_i1025" type="#_x0000_t75" style="width:403.9pt;height:163.65pt" o:ole="" o:bordertopcolor="this" o:borderleftcolor="this" o:borderbottomcolor="this" o:borderrightcolor="this">
             <v:imagedata r:id="rId12" o:title=""/>
             <w10:bordertop type="single" width="4"/>
             <w10:borderleft type="single" width="4"/>
             <w10:borderbottom type="single" width="4"/>
             <w10:borderright type="single" width="4"/>
           </v:shape>
-          <o:OLEObject Type="Embed" ProgID="Word.OpenDocumentText.12" ShapeID="_x0000_i1025" DrawAspect="Content" ObjectID="_1837877689" r:id="rId13"/>
+          <o:OLEObject Type="Embed" ProgID="Word.OpenDocumentText.12" ShapeID="_x0000_i1025" DrawAspect="Content" ObjectID="_1837924769" r:id="rId13"/>
         </w:object>
       </w:r>
     </w:p>
@@ -1950,14 +1948,14 @@
           <w:lang w:val="en-US"/>
         </w:rPr>
         <w:object w:dxaOrig="9026" w:dyaOrig="806" w14:anchorId="099D0BF2">
-          <v:shape id="_x0000_i1026" type="#_x0000_t75" style="width:451.35pt;height:40.35pt" o:ole="" o:bordertopcolor="this" o:borderleftcolor="this" o:borderbottomcolor="this" o:borderrightcolor="this">
+          <v:shape id="_x0000_i1026" type="#_x0000_t75" style="width:451.3pt;height:40.3pt" o:ole="" o:bordertopcolor="this" o:borderleftcolor="this" o:borderbottomcolor="this" o:borderrightcolor="this">
             <v:imagedata r:id="rId14" o:title=""/>
             <w10:bordertop type="single" width="4"/>
             <w10:borderleft type="single" width="4"/>
             <w10:borderbottom type="single" width="4"/>
             <w10:borderright type="single" width="4"/>
           </v:shape>
-          <o:OLEObject Type="Embed" ProgID="Word.OpenDocumentText.12" ShapeID="_x0000_i1026" DrawAspect="Content" ObjectID="_1837877690" r:id="rId15"/>
+          <o:OLEObject Type="Embed" ProgID="Word.OpenDocumentText.12" ShapeID="_x0000_i1026" DrawAspect="Content" ObjectID="_1837924770" r:id="rId15"/>
         </w:object>
       </w:r>
     </w:p>
@@ -2154,14 +2152,14 @@
           <w:lang w:val="en-US"/>
         </w:rPr>
         <w:object w:dxaOrig="9026" w:dyaOrig="1129" w14:anchorId="3803F6A7">
-          <v:shape id="_x0000_i1027" type="#_x0000_t75" style="width:451.35pt;height:56.35pt" o:ole="" o:bordertopcolor="this" o:borderleftcolor="this" o:borderbottomcolor="this" o:borderrightcolor="this">
+          <v:shape id="_x0000_i1027" type="#_x0000_t75" style="width:451.3pt;height:56.45pt" o:ole="" o:bordertopcolor="this" o:borderleftcolor="this" o:borderbottomcolor="this" o:borderrightcolor="this">
             <v:imagedata r:id="rId16" o:title=""/>
             <w10:bordertop type="single" width="4"/>
             <w10:borderleft type="single" width="4"/>
             <w10:borderbottom type="single" width="4"/>
             <w10:borderright type="single" width="4"/>
           </v:shape>
-          <o:OLEObject Type="Embed" ProgID="Word.OpenDocumentText.12" ShapeID="_x0000_i1027" DrawAspect="Content" ObjectID="_1837877691" r:id="rId17"/>
+          <o:OLEObject Type="Embed" ProgID="Word.OpenDocumentText.12" ShapeID="_x0000_i1027" DrawAspect="Content" ObjectID="_1837924771" r:id="rId17"/>
         </w:object>
       </w:r>
     </w:p>
@@ -2233,14 +2231,14 @@
           <w:lang w:val="en-US"/>
         </w:rPr>
         <w:object w:dxaOrig="9026" w:dyaOrig="1129" w14:anchorId="3C311A47">
-          <v:shape id="_x0000_i1028" type="#_x0000_t75" style="width:451.35pt;height:56.35pt" o:ole="" o:bordertopcolor="this" o:borderleftcolor="this" o:borderbottomcolor="this" o:borderrightcolor="this">
+          <v:shape id="_x0000_i1028" type="#_x0000_t75" style="width:451.3pt;height:56.45pt" o:ole="" o:bordertopcolor="this" o:borderleftcolor="this" o:borderbottomcolor="this" o:borderrightcolor="this">
             <v:imagedata r:id="rId18" o:title=""/>
             <w10:bordertop type="single" width="4"/>
             <w10:borderleft type="single" width="4"/>
             <w10:borderbottom type="single" width="4"/>
             <w10:borderright type="single" width="4"/>
           </v:shape>
-          <o:OLEObject Type="Embed" ProgID="Word.OpenDocumentText.12" ShapeID="_x0000_i1028" DrawAspect="Content" ObjectID="_1837877692" r:id="rId19"/>
+          <o:OLEObject Type="Embed" ProgID="Word.OpenDocumentText.12" ShapeID="_x0000_i1028" DrawAspect="Content" ObjectID="_1837924772" r:id="rId19"/>
         </w:object>
       </w:r>
     </w:p>
@@ -2306,14 +2304,14 @@
           <w:lang w:val="en-US"/>
         </w:rPr>
         <w:object w:dxaOrig="9026" w:dyaOrig="1129" w14:anchorId="0DF40D06">
-          <v:shape id="_x0000_i1029" type="#_x0000_t75" style="width:451.35pt;height:56.35pt" o:ole="" o:bordertopcolor="this" o:borderleftcolor="this" o:borderbottomcolor="this" o:borderrightcolor="this">
+          <v:shape id="_x0000_i1029" type="#_x0000_t75" style="width:451.3pt;height:56.45pt" o:ole="" o:bordertopcolor="this" o:borderleftcolor="this" o:borderbottomcolor="this" o:borderrightcolor="this">
             <v:imagedata r:id="rId20" o:title=""/>
             <w10:bordertop type="single" width="4"/>
             <w10:borderleft type="single" width="4"/>
             <w10:borderbottom type="single" width="4"/>
             <w10:borderright type="single" width="4"/>
           </v:shape>
-          <o:OLEObject Type="Embed" ProgID="Word.OpenDocumentText.12" ShapeID="_x0000_i1029" DrawAspect="Content" ObjectID="_1837877693" r:id="rId21"/>
+          <o:OLEObject Type="Embed" ProgID="Word.OpenDocumentText.12" ShapeID="_x0000_i1029" DrawAspect="Content" ObjectID="_1837924773" r:id="rId21"/>
         </w:object>
       </w:r>
       <w:bookmarkStart w:id="10" w:name="_II._Structura"/>
@@ -2913,27 +2911,29 @@
           <w:lang w:val="en-US"/>
         </w:rPr>
       </w:pPr>
-      <w:r>
-        <w:rPr>
-          <w:lang w:val="en-US"/>
-        </w:rPr>
-        <w:tab/>
-      </w:r>
-      <w:bookmarkStart w:id="15" w:name="_MON_1837701118"/>
-      <w:bookmarkEnd w:id="15"/>
+    </w:p>
+    <w:bookmarkStart w:id="15" w:name="_MON_1837701118"/>
+    <w:bookmarkEnd w:id="15"/>
+    <w:p>
+      <w:pPr>
+        <w:pStyle w:val="NoSpacing"/>
+        <w:rPr>
+          <w:lang w:val="en-US"/>
+        </w:rPr>
+      </w:pPr>
       <w:r>
         <w:rPr>
           <w:lang w:val="en-US"/>
         </w:rPr>
         <w:object w:dxaOrig="9026" w:dyaOrig="2471" w14:anchorId="5AA9B6B3">
-          <v:shape id="_x0000_i1030" type="#_x0000_t75" style="width:451.35pt;height:123.65pt" o:ole="" o:bordertopcolor="this" o:borderleftcolor="this" o:borderbottomcolor="this" o:borderrightcolor="this">
+          <v:shape id="_x0000_i1030" type="#_x0000_t75" style="width:451.3pt;height:123.55pt" o:ole="" o:bordertopcolor="this" o:borderleftcolor="this" o:borderbottomcolor="this" o:borderrightcolor="this">
             <v:imagedata r:id="rId27" o:title=""/>
             <w10:bordertop type="single" width="4"/>
             <w10:borderleft type="single" width="4"/>
             <w10:borderbottom type="single" width="4"/>
             <w10:borderright type="single" width="4"/>
           </v:shape>
-          <o:OLEObject Type="Embed" ProgID="Word.OpenDocumentText.12" ShapeID="_x0000_i1030" DrawAspect="Content" ObjectID="_1837877694" r:id="rId28"/>
+          <o:OLEObject Type="Embed" ProgID="Word.OpenDocumentText.12" ShapeID="_x0000_i1030" DrawAspect="Content" ObjectID="_1837924774" r:id="rId28"/>
         </w:object>
       </w:r>
     </w:p>
@@ -2944,12 +2944,6 @@
           <w:lang w:val="ro-RO"/>
         </w:rPr>
       </w:pPr>
-      <w:r>
-        <w:rPr>
-          <w:lang w:val="en-US"/>
-        </w:rPr>
-        <w:tab/>
-      </w:r>
     </w:p>
     <w:p>
       <w:pPr>
@@ -3055,14 +3049,14 @@
           <w:lang w:val="en-US"/>
         </w:rPr>
         <w:object w:dxaOrig="9026" w:dyaOrig="806" w14:anchorId="2B6276FB">
-          <v:shape id="_x0000_i1031" type="#_x0000_t75" style="width:451.35pt;height:40.35pt" o:ole="" o:bordertopcolor="this" o:borderleftcolor="this" o:borderbottomcolor="this" o:borderrightcolor="this">
+          <v:shape id="_x0000_i1031" type="#_x0000_t75" style="width:451.3pt;height:40.3pt" o:ole="" o:bordertopcolor="this" o:borderleftcolor="this" o:borderbottomcolor="this" o:borderrightcolor="this">
             <v:imagedata r:id="rId29" o:title=""/>
             <w10:bordertop type="single" width="4"/>
             <w10:borderleft type="single" width="4"/>
             <w10:borderbottom type="single" width="4"/>
             <w10:borderright type="single" width="4"/>
           </v:shape>
-          <o:OLEObject Type="Embed" ProgID="Word.OpenDocumentText.12" ShapeID="_x0000_i1031" DrawAspect="Content" ObjectID="_1837877695" r:id="rId30"/>
+          <o:OLEObject Type="Embed" ProgID="Word.OpenDocumentText.12" ShapeID="_x0000_i1031" DrawAspect="Content" ObjectID="_1837924775" r:id="rId30"/>
         </w:object>
       </w:r>
     </w:p>
@@ -3141,14 +3135,14 @@
           <w:lang w:val="en-US"/>
         </w:rPr>
         <w:object w:dxaOrig="9026" w:dyaOrig="806" w14:anchorId="1DA88245">
-          <v:shape id="_x0000_i1032" type="#_x0000_t75" style="width:451.35pt;height:40.35pt" o:ole="" o:bordertopcolor="this" o:borderleftcolor="this" o:borderbottomcolor="this" o:borderrightcolor="this">
+          <v:shape id="_x0000_i1032" type="#_x0000_t75" style="width:451.3pt;height:40.3pt" o:ole="" o:bordertopcolor="this" o:borderleftcolor="this" o:borderbottomcolor="this" o:borderrightcolor="this">
             <v:imagedata r:id="rId31" o:title=""/>
             <w10:bordertop type="single" width="4"/>
             <w10:borderleft type="single" width="4"/>
             <w10:borderbottom type="single" width="4"/>
             <w10:borderright type="single" width="4"/>
           </v:shape>
-          <o:OLEObject Type="Embed" ProgID="Word.OpenDocumentText.12" ShapeID="_x0000_i1032" DrawAspect="Content" ObjectID="_1837877696" r:id="rId32"/>
+          <o:OLEObject Type="Embed" ProgID="Word.OpenDocumentText.12" ShapeID="_x0000_i1032" DrawAspect="Content" ObjectID="_1837924776" r:id="rId32"/>
         </w:object>
       </w:r>
     </w:p>
@@ -3245,14 +3239,14 @@
           <w:lang w:val="en-US"/>
         </w:rPr>
         <w:object w:dxaOrig="9026" w:dyaOrig="806" w14:anchorId="5FC8E17F">
-          <v:shape id="_x0000_i1033" type="#_x0000_t75" style="width:451.35pt;height:40.35pt" o:ole="" o:bordertopcolor="this" o:borderleftcolor="this" o:borderbottomcolor="this" o:borderrightcolor="this">
+          <v:shape id="_x0000_i1033" type="#_x0000_t75" style="width:451.3pt;height:40.3pt" o:ole="" o:bordertopcolor="this" o:borderleftcolor="this" o:borderbottomcolor="this" o:borderrightcolor="this">
             <v:imagedata r:id="rId33" o:title=""/>
             <w10:bordertop type="single" width="4"/>
             <w10:borderleft type="single" width="4"/>
             <w10:borderbottom type="single" width="4"/>
             <w10:borderright type="single" width="4"/>
           </v:shape>
-          <o:OLEObject Type="Embed" ProgID="Word.OpenDocumentText.12" ShapeID="_x0000_i1033" DrawAspect="Content" ObjectID="_1837877697" r:id="rId34"/>
+          <o:OLEObject Type="Embed" ProgID="Word.OpenDocumentText.12" ShapeID="_x0000_i1033" DrawAspect="Content" ObjectID="_1837924777" r:id="rId34"/>
         </w:object>
       </w:r>
     </w:p>
@@ -3404,14 +3398,14 @@
           <w:lang w:val="en-US"/>
         </w:rPr>
         <w:object w:dxaOrig="9026" w:dyaOrig="1686" w14:anchorId="51B97F7C">
-          <v:shape id="_x0000_i1034" type="#_x0000_t75" style="width:451.35pt;height:84.35pt" o:ole="" o:bordertopcolor="this" o:borderleftcolor="this" o:borderbottomcolor="this" o:borderrightcolor="this">
+          <v:shape id="_x0000_i1034" type="#_x0000_t75" style="width:451.3pt;height:84.3pt" o:ole="" o:bordertopcolor="this" o:borderleftcolor="this" o:borderbottomcolor="this" o:borderrightcolor="this">
             <v:imagedata r:id="rId35" o:title=""/>
             <w10:bordertop type="single" width="4"/>
             <w10:borderleft type="single" width="4"/>
             <w10:borderbottom type="single" width="4"/>
             <w10:borderright type="single" width="4"/>
           </v:shape>
-          <o:OLEObject Type="Embed" ProgID="Word.OpenDocumentText.12" ShapeID="_x0000_i1034" DrawAspect="Content" ObjectID="_1837877698" r:id="rId36"/>
+          <o:OLEObject Type="Embed" ProgID="Word.OpenDocumentText.12" ShapeID="_x0000_i1034" DrawAspect="Content" ObjectID="_1837924778" r:id="rId36"/>
         </w:object>
       </w:r>
     </w:p>
@@ -4273,14 +4267,14 @@
           <w:lang w:val="en-US"/>
         </w:rPr>
         <w:object w:dxaOrig="9026" w:dyaOrig="6838" w14:anchorId="6957392A">
-          <v:shape id="_x0000_i1035" type="#_x0000_t75" style="width:451.35pt;height:342pt" o:ole="" o:bordertopcolor="this" o:borderleftcolor="this" o:borderbottomcolor="this" o:borderrightcolor="this">
+          <v:shape id="_x0000_i1035" type="#_x0000_t75" style="width:451.3pt;height:341.9pt" o:ole="" o:bordertopcolor="this" o:borderleftcolor="this" o:borderbottomcolor="this" o:borderrightcolor="this">
             <v:imagedata r:id="rId37" o:title=""/>
             <w10:bordertop type="single" width="4"/>
             <w10:borderleft type="single" width="4"/>
             <w10:borderbottom type="single" width="4"/>
             <w10:borderright type="single" width="4"/>
           </v:shape>
-          <o:OLEObject Type="Embed" ProgID="Word.OpenDocumentText.12" ShapeID="_x0000_i1035" DrawAspect="Content" ObjectID="_1837877699" r:id="rId38"/>
+          <o:OLEObject Type="Embed" ProgID="Word.OpenDocumentText.12" ShapeID="_x0000_i1035" DrawAspect="Content" ObjectID="_1837924779" r:id="rId38"/>
         </w:object>
       </w:r>
     </w:p>
@@ -4324,14 +4318,14 @@
           <w:lang w:val="en-US"/>
         </w:rPr>
         <w:object w:dxaOrig="9026" w:dyaOrig="2529" w14:anchorId="4C5F2198">
-          <v:shape id="_x0000_i1036" type="#_x0000_t75" style="width:451.35pt;height:126.35pt" o:ole="" o:bordertopcolor="this" o:borderleftcolor="this" o:borderbottomcolor="this" o:borderrightcolor="this">
+          <v:shape id="_x0000_i1036" type="#_x0000_t75" style="width:451.3pt;height:126.45pt" o:ole="" o:bordertopcolor="this" o:borderleftcolor="this" o:borderbottomcolor="this" o:borderrightcolor="this">
             <v:imagedata r:id="rId39" o:title=""/>
             <w10:bordertop type="single" width="4"/>
             <w10:borderleft type="single" width="4"/>
             <w10:borderbottom type="single" width="4"/>
             <w10:borderright type="single" width="4"/>
           </v:shape>
-          <o:OLEObject Type="Embed" ProgID="Word.OpenDocumentText.12" ShapeID="_x0000_i1036" DrawAspect="Content" ObjectID="_1837877700" r:id="rId40"/>
+          <o:OLEObject Type="Embed" ProgID="Word.OpenDocumentText.12" ShapeID="_x0000_i1036" DrawAspect="Content" ObjectID="_1837924780" r:id="rId40"/>
         </w:object>
       </w:r>
     </w:p>
@@ -4375,14 +4369,14 @@
           <w:lang w:val="en-US"/>
         </w:rPr>
         <w:object w:dxaOrig="9026" w:dyaOrig="1686" w14:anchorId="7147624A">
-          <v:shape id="_x0000_i1037" type="#_x0000_t75" style="width:451.35pt;height:84.35pt" o:ole="" o:bordertopcolor="this" o:borderleftcolor="this" o:borderbottomcolor="this" o:borderrightcolor="this">
+          <v:shape id="_x0000_i1037" type="#_x0000_t75" style="width:451.3pt;height:84.3pt" o:ole="" o:bordertopcolor="this" o:borderleftcolor="this" o:borderbottomcolor="this" o:borderrightcolor="this">
             <v:imagedata r:id="rId41" o:title=""/>
             <w10:bordertop type="single" width="4"/>
             <w10:borderleft type="single" width="4"/>
             <w10:borderbottom type="single" width="4"/>
             <w10:borderright type="single" width="4"/>
           </v:shape>
-          <o:OLEObject Type="Embed" ProgID="Word.OpenDocumentText.12" ShapeID="_x0000_i1037" DrawAspect="Content" ObjectID="_1837877701" r:id="rId42"/>
+          <o:OLEObject Type="Embed" ProgID="Word.OpenDocumentText.12" ShapeID="_x0000_i1037" DrawAspect="Content" ObjectID="_1837924781" r:id="rId42"/>
         </w:object>
       </w:r>
     </w:p>
@@ -4568,14 +4562,14 @@
           <w:lang w:val="en-US"/>
         </w:rPr>
         <w:object w:dxaOrig="9026" w:dyaOrig="1405" w14:anchorId="2193020A">
-          <v:shape id="_x0000_i1038" type="#_x0000_t75" style="width:451.35pt;height:70.35pt" o:ole="" o:bordertopcolor="this" o:borderleftcolor="this" o:borderbottomcolor="this" o:borderrightcolor="this">
+          <v:shape id="_x0000_i1038" type="#_x0000_t75" style="width:451.3pt;height:70.25pt" o:ole="" o:bordertopcolor="this" o:borderleftcolor="this" o:borderbottomcolor="this" o:borderrightcolor="this">
             <v:imagedata r:id="rId43" o:title=""/>
             <w10:bordertop type="single" width="4"/>
             <w10:borderleft type="single" width="4"/>
             <w10:borderbottom type="single" width="4"/>
             <w10:borderright type="single" width="4"/>
           </v:shape>
-          <o:OLEObject Type="Embed" ProgID="Word.OpenDocumentText.12" ShapeID="_x0000_i1038" DrawAspect="Content" ObjectID="_1837877702" r:id="rId44"/>
+          <o:OLEObject Type="Embed" ProgID="Word.OpenDocumentText.12" ShapeID="_x0000_i1038" DrawAspect="Content" ObjectID="_1837924782" r:id="rId44"/>
         </w:object>
       </w:r>
     </w:p>
@@ -4653,14 +4647,14 @@
           <w:lang w:val="en-US"/>
         </w:rPr>
         <w:object w:dxaOrig="9026" w:dyaOrig="1967" w14:anchorId="50087815">
-          <v:shape id="_x0000_i1039" type="#_x0000_t75" style="width:451.35pt;height:98.35pt" o:ole="" o:bordertopcolor="this" o:borderleftcolor="this" o:borderbottomcolor="this" o:borderrightcolor="this">
+          <v:shape id="_x0000_i1039" type="#_x0000_t75" style="width:451.3pt;height:98.35pt" o:ole="" o:bordertopcolor="this" o:borderleftcolor="this" o:borderbottomcolor="this" o:borderrightcolor="this">
             <v:imagedata r:id="rId45" o:title=""/>
             <w10:bordertop type="single" width="4"/>
             <w10:borderleft type="single" width="4"/>
             <w10:borderbottom type="single" width="4"/>
             <w10:borderright type="single" width="4"/>
           </v:shape>
-          <o:OLEObject Type="Embed" ProgID="Word.OpenDocumentText.12" ShapeID="_x0000_i1039" DrawAspect="Content" ObjectID="_1837877703" r:id="rId46"/>
+          <o:OLEObject Type="Embed" ProgID="Word.OpenDocumentText.12" ShapeID="_x0000_i1039" DrawAspect="Content" ObjectID="_1837924783" r:id="rId46"/>
         </w:object>
       </w:r>
     </w:p>
@@ -4721,14 +4715,14 @@
           <w:lang w:val="en-US"/>
         </w:rPr>
         <w:object w:dxaOrig="9026" w:dyaOrig="3372" w14:anchorId="6502F521">
-          <v:shape id="_x0000_i1040" type="#_x0000_t75" style="width:451.35pt;height:168.65pt" o:ole="" o:bordertopcolor="this" o:borderleftcolor="this" o:borderbottomcolor="this" o:borderrightcolor="this">
+          <v:shape id="_x0000_i1040" type="#_x0000_t75" style="width:451.3pt;height:168.6pt" o:ole="" o:bordertopcolor="this" o:borderleftcolor="this" o:borderbottomcolor="this" o:borderrightcolor="this">
             <v:imagedata r:id="rId47" o:title=""/>
             <w10:bordertop type="single" width="4"/>
             <w10:borderleft type="single" width="4"/>
             <w10:borderbottom type="single" width="4"/>
             <w10:borderright type="single" width="4"/>
           </v:shape>
-          <o:OLEObject Type="Embed" ProgID="Word.OpenDocumentText.12" ShapeID="_x0000_i1040" DrawAspect="Content" ObjectID="_1837877704" r:id="rId48"/>
+          <o:OLEObject Type="Embed" ProgID="Word.OpenDocumentText.12" ShapeID="_x0000_i1040" DrawAspect="Content" ObjectID="_1837924784" r:id="rId48"/>
         </w:object>
       </w:r>
     </w:p>
@@ -4834,14 +4828,14 @@
           <w:lang w:val="en-US"/>
         </w:rPr>
         <w:object w:dxaOrig="9026" w:dyaOrig="1686" w14:anchorId="32856A70">
-          <v:shape id="_x0000_i1041" type="#_x0000_t75" style="width:451.35pt;height:84.35pt" o:ole="" o:bordertopcolor="this" o:borderleftcolor="this" o:borderbottomcolor="this" o:borderrightcolor="this">
+          <v:shape id="_x0000_i1041" type="#_x0000_t75" style="width:451.3pt;height:84.3pt" o:ole="" o:bordertopcolor="this" o:borderleftcolor="this" o:borderbottomcolor="this" o:borderrightcolor="this">
             <v:imagedata r:id="rId49" o:title=""/>
             <w10:bordertop type="single" width="4"/>
             <w10:borderleft type="single" width="4"/>
             <w10:borderbottom type="single" width="4"/>
             <w10:borderright type="single" width="4"/>
           </v:shape>
-          <o:OLEObject Type="Embed" ProgID="Word.OpenDocumentText.12" ShapeID="_x0000_i1041" DrawAspect="Content" ObjectID="_1837877705" r:id="rId50"/>
+          <o:OLEObject Type="Embed" ProgID="Word.OpenDocumentText.12" ShapeID="_x0000_i1041" DrawAspect="Content" ObjectID="_1837924785" r:id="rId50"/>
         </w:object>
       </w:r>
     </w:p>
@@ -4980,14 +4974,14 @@
           <w:lang w:val="en-US"/>
         </w:rPr>
         <w:object w:dxaOrig="9026" w:dyaOrig="3239" w14:anchorId="7C6C1D17">
-          <v:shape id="_x0000_i1042" type="#_x0000_t75" style="width:451.35pt;height:162pt" o:ole="" o:bordertopcolor="this" o:borderleftcolor="this" o:borderbottomcolor="this" o:borderrightcolor="this">
+          <v:shape id="_x0000_i1042" type="#_x0000_t75" style="width:451.3pt;height:161.95pt" o:ole="" o:bordertopcolor="this" o:borderleftcolor="this" o:borderbottomcolor="this" o:borderrightcolor="this">
             <v:imagedata r:id="rId51" o:title=""/>
             <w10:bordertop type="single" width="4"/>
             <w10:borderleft type="single" width="4"/>
             <w10:borderbottom type="single" width="4"/>
             <w10:borderright type="single" width="4"/>
           </v:shape>
-          <o:OLEObject Type="Embed" ProgID="Word.OpenDocumentText.12" ShapeID="_x0000_i1042" DrawAspect="Content" ObjectID="_1837877706" r:id="rId52"/>
+          <o:OLEObject Type="Embed" ProgID="Word.OpenDocumentText.12" ShapeID="_x0000_i1042" DrawAspect="Content" ObjectID="_1837924786" r:id="rId52"/>
         </w:object>
       </w:r>
     </w:p>
@@ -5047,12 +5041,6 @@
           <w:lang w:val="ro-RO"/>
         </w:rPr>
       </w:pPr>
-      <w:r>
-        <w:rPr>
-          <w:lang w:val="ro-RO"/>
-        </w:rPr>
-        <w:tab/>
-      </w:r>
     </w:p>
     <w:bookmarkStart w:id="28" w:name="_MON_1837863191"/>
     <w:bookmarkEnd w:id="28"/>
@@ -5068,14 +5056,14 @@
           <w:lang w:val="en-US"/>
         </w:rPr>
         <w:object w:dxaOrig="9026" w:dyaOrig="1031" w14:anchorId="3EB73B57">
-          <v:shape id="_x0000_i1043" type="#_x0000_t75" style="width:451.35pt;height:51.65pt" o:ole="" o:bordertopcolor="this" o:borderleftcolor="this" o:borderbottomcolor="this" o:borderrightcolor="this">
+          <v:shape id="_x0000_i1043" type="#_x0000_t75" style="width:451.3pt;height:51.55pt" o:ole="" o:bordertopcolor="this" o:borderleftcolor="this" o:borderbottomcolor="this" o:borderrightcolor="this">
             <v:imagedata r:id="rId53" o:title=""/>
             <w10:bordertop type="single" width="4"/>
             <w10:borderleft type="single" width="4"/>
             <w10:borderbottom type="single" width="4"/>
             <w10:borderright type="single" width="4"/>
           </v:shape>
-          <o:OLEObject Type="Embed" ProgID="Word.OpenDocumentText.12" ShapeID="_x0000_i1043" DrawAspect="Content" ObjectID="_1837877707" r:id="rId54"/>
+          <o:OLEObject Type="Embed" ProgID="Word.OpenDocumentText.12" ShapeID="_x0000_i1043" DrawAspect="Content" ObjectID="_1837924787" r:id="rId54"/>
         </w:object>
       </w:r>
     </w:p>
@@ -5181,14 +5169,14 @@
           <w:lang w:val="en-US"/>
         </w:rPr>
         <w:object w:dxaOrig="9026" w:dyaOrig="2543" w14:anchorId="52BBFB16">
-          <v:shape id="_x0000_i1044" type="#_x0000_t75" style="width:451.35pt;height:127pt" o:ole="" o:bordertopcolor="this" o:borderleftcolor="this" o:borderbottomcolor="this" o:borderrightcolor="this">
+          <v:shape id="_x0000_i1044" type="#_x0000_t75" style="width:451.3pt;height:127.15pt" o:ole="" o:bordertopcolor="this" o:borderleftcolor="this" o:borderbottomcolor="this" o:borderrightcolor="this">
             <v:imagedata r:id="rId55" o:title=""/>
             <w10:bordertop type="single" width="4"/>
             <w10:borderleft type="single" width="4"/>
             <w10:borderbottom type="single" width="4"/>
             <w10:borderright type="single" width="4"/>
           </v:shape>
-          <o:OLEObject Type="Embed" ProgID="Word.OpenDocumentText.12" ShapeID="_x0000_i1044" DrawAspect="Content" ObjectID="_1837877708" r:id="rId56"/>
+          <o:OLEObject Type="Embed" ProgID="Word.OpenDocumentText.12" ShapeID="_x0000_i1044" DrawAspect="Content" ObjectID="_1837924788" r:id="rId56"/>
         </w:object>
       </w:r>
     </w:p>
@@ -5328,14 +5316,14 @@
           <w:lang w:val="en-US"/>
         </w:rPr>
         <w:object w:dxaOrig="9026" w:dyaOrig="3091" w14:anchorId="678539CD">
-          <v:shape id="_x0000_i1045" type="#_x0000_t75" style="width:451.35pt;height:154.65pt" o:ole="" o:bordertopcolor="this" o:borderleftcolor="this" o:borderbottomcolor="this" o:borderrightcolor="this">
+          <v:shape id="_x0000_i1045" type="#_x0000_t75" style="width:451.3pt;height:154.55pt" o:ole="" o:bordertopcolor="this" o:borderleftcolor="this" o:borderbottomcolor="this" o:borderrightcolor="this">
             <v:imagedata r:id="rId57" o:title=""/>
             <w10:bordertop type="single" width="4"/>
             <w10:borderleft type="single" width="4"/>
             <w10:borderbottom type="single" width="4"/>
             <w10:borderright type="single" width="4"/>
           </v:shape>
-          <o:OLEObject Type="Embed" ProgID="Word.OpenDocumentText.12" ShapeID="_x0000_i1045" DrawAspect="Content" ObjectID="_1837877709" r:id="rId58"/>
+          <o:OLEObject Type="Embed" ProgID="Word.OpenDocumentText.12" ShapeID="_x0000_i1045" DrawAspect="Content" ObjectID="_1837924789" r:id="rId58"/>
         </w:object>
       </w:r>
     </w:p>
@@ -5439,14 +5427,14 @@
           <w:lang w:val="en-US"/>
         </w:rPr>
         <w:object w:dxaOrig="9026" w:dyaOrig="843" w14:anchorId="73E55CA8">
-          <v:shape id="_x0000_i1046" type="#_x0000_t75" style="width:451.35pt;height:42pt" o:ole="" o:bordertopcolor="this" o:borderleftcolor="this" o:borderbottomcolor="this" o:borderrightcolor="this">
+          <v:shape id="_x0000_i1046" type="#_x0000_t75" style="width:451.3pt;height:42.15pt" o:ole="" o:bordertopcolor="this" o:borderleftcolor="this" o:borderbottomcolor="this" o:borderrightcolor="this">
             <v:imagedata r:id="rId59" o:title=""/>
             <w10:bordertop type="single" width="4"/>
             <w10:borderleft type="single" width="4"/>
             <w10:borderbottom type="single" width="4"/>
             <w10:borderright type="single" width="4"/>
           </v:shape>
-          <o:OLEObject Type="Embed" ProgID="Word.OpenDocumentText.12" ShapeID="_x0000_i1046" DrawAspect="Content" ObjectID="_1837877710" r:id="rId60"/>
+          <o:OLEObject Type="Embed" ProgID="Word.OpenDocumentText.12" ShapeID="_x0000_i1046" DrawAspect="Content" ObjectID="_1837924790" r:id="rId60"/>
         </w:object>
       </w:r>
     </w:p>
@@ -5513,14 +5501,14 @@
           <w:lang w:val="en-US"/>
         </w:rPr>
         <w:object w:dxaOrig="9026" w:dyaOrig="2529" w14:anchorId="5A57E5A3">
-          <v:shape id="_x0000_i1047" type="#_x0000_t75" style="width:451.35pt;height:126.35pt" o:ole="" o:bordertopcolor="this" o:borderleftcolor="this" o:borderbottomcolor="this" o:borderrightcolor="this">
+          <v:shape id="_x0000_i1047" type="#_x0000_t75" style="width:451.3pt;height:126.45pt" o:ole="" o:bordertopcolor="this" o:borderleftcolor="this" o:borderbottomcolor="this" o:borderrightcolor="this">
             <v:imagedata r:id="rId61" o:title=""/>
             <w10:bordertop type="single" width="4"/>
             <w10:borderleft type="single" width="4"/>
             <w10:borderbottom type="single" width="4"/>
             <w10:borderright type="single" width="4"/>
           </v:shape>
-          <o:OLEObject Type="Embed" ProgID="Word.OpenDocumentText.12" ShapeID="_x0000_i1047" DrawAspect="Content" ObjectID="_1837877711" r:id="rId62"/>
+          <o:OLEObject Type="Embed" ProgID="Word.OpenDocumentText.12" ShapeID="_x0000_i1047" DrawAspect="Content" ObjectID="_1837924791" r:id="rId62"/>
         </w:object>
       </w:r>
     </w:p>
@@ -5601,14 +5589,14 @@
           <w:lang w:val="en-US"/>
         </w:rPr>
         <w:object w:dxaOrig="9026" w:dyaOrig="3349" w14:anchorId="2CF35EDE">
-          <v:shape id="_x0000_i1048" type="#_x0000_t75" style="width:451.35pt;height:167.35pt" o:ole="" o:bordertopcolor="this" o:borderleftcolor="this" o:borderbottomcolor="this" o:borderrightcolor="this">
+          <v:shape id="_x0000_i1048" type="#_x0000_t75" style="width:451.3pt;height:167.45pt" o:ole="" o:bordertopcolor="this" o:borderleftcolor="this" o:borderbottomcolor="this" o:borderrightcolor="this">
             <v:imagedata r:id="rId63" o:title=""/>
             <w10:bordertop type="single" width="4"/>
             <w10:borderleft type="single" width="4"/>
             <w10:borderbottom type="single" width="4"/>
             <w10:borderright type="single" width="4"/>
           </v:shape>
-          <o:OLEObject Type="Embed" ProgID="Word.OpenDocumentText.12" ShapeID="_x0000_i1048" DrawAspect="Content" ObjectID="_1837877712" r:id="rId64"/>
+          <o:OLEObject Type="Embed" ProgID="Word.OpenDocumentText.12" ShapeID="_x0000_i1048" DrawAspect="Content" ObjectID="_1837924792" r:id="rId64"/>
         </w:object>
       </w:r>
     </w:p>
@@ -7043,7 +7031,7 @@
     <w:link w:val="Heading1Char"/>
     <w:uiPriority w:val="9"/>
     <w:qFormat/>
-    <w:rsid w:val="00A3070D"/>
+    <w:rsid w:val="0036155B"/>
     <w:pPr>
       <w:keepNext/>
       <w:keepLines/>
@@ -7265,7 +7253,7 @@
     <w:basedOn w:val="DefaultParagraphFont"/>
     <w:link w:val="Heading1"/>
     <w:uiPriority w:val="9"/>
-    <w:rsid w:val="00A3070D"/>
+    <w:rsid w:val="0036155B"/>
     <w:rPr>
       <w:rFonts w:ascii="Times New Roman" w:eastAsiaTheme="majorEastAsia" w:hAnsi="Times New Roman" w:cstheme="majorBidi"/>
       <w:b/>

</xml_diff>